<commit_message>
A* and D*lite slides
Issue #33
</commit_message>
<xml_diff>
--- a/Thesis/GPitsos Thesis.docx
+++ b/Thesis/GPitsos Thesis.docx
@@ -9317,20 +9317,52 @@
     <w:p>
       <w:pPr>
         <w:jc w:val="left"/>
-        <w:rPr>
-          <w:lang w:val="en-US"/>
-        </w:rPr>
       </w:pPr>
       <w:r>
         <w:rPr>
           <w:highlight w:val="yellow"/>
-          <w:lang w:val="en-US"/>
         </w:rPr>
         <w:lastRenderedPageBreak/>
-        <w:t>A*</w:t>
+        <w:t xml:space="preserve">Ο αλγόριθμος </w:t>
+      </w:r>
+      <w:r>
+        <w:rPr>
+          <w:highlight w:val="yellow"/>
+          <w:lang w:val="en-US"/>
+        </w:rPr>
+        <w:t>A</w:t>
+      </w:r>
+      <w:r>
+        <w:rPr>
+          <w:highlight w:val="yellow"/>
+        </w:rPr>
+        <w:t>*</w:t>
       </w:r>
     </w:p>
     <w:p>
+      <w:pPr>
+        <w:rPr>
+          <w:lang w:val="en-US"/>
+        </w:rPr>
+      </w:pPr>
+      <w:r>
+        <w:t xml:space="preserve">Ο αλγόριθμος του </w:t>
+      </w:r>
+      <w:r>
+        <w:rPr>
+          <w:lang w:val="en-US"/>
+        </w:rPr>
+        <w:t>Dijkstra</w:t>
+      </w:r>
+      <w:r>
+        <w:t xml:space="preserve"> </w:t>
+      </w:r>
+      <w:r>
+        <w:t xml:space="preserve">ξεκινάει από τον κόμβο – πηγή (κόμβος εμπλεκομένου) και διασχίζει τους κόμβους του γράφου έτσι ώστε το συντομότερο μονοπάτι να ξεκινάει από την πηγή και να τερματίζει στον στόχο (προορισμό). </w:t>
+      </w:r>
+    </w:p>
+    <w:p/>
+    <w:p>
       <w:r>
         <w:t>Ο</w:t>
       </w:r>
@@ -9341,7 +9373,13 @@
         <w:t xml:space="preserve"> αποτελεί</w:t>
       </w:r>
       <w:r>
-        <w:t xml:space="preserve"> θεμελιώδη μέθοδο εύρεσης βέλτιστης διαδρομής σε </w:t>
+        <w:t xml:space="preserve"> θεμελιώδη μέθοδο εύρεσης </w:t>
+      </w:r>
+      <w:r>
+        <w:t xml:space="preserve">της </w:t>
+      </w:r>
+      <w:r>
+        <w:t xml:space="preserve">βέλτιστης διαδρομής σε </w:t>
       </w:r>
       <w:proofErr w:type="spellStart"/>
       <w:r>
@@ -12013,6 +12051,7 @@
   <w:style w:type="character" w:default="1" w:styleId="a0">
     <w:name w:val="Default Paragraph Font"/>
     <w:uiPriority w:val="1"/>
+    <w:semiHidden/>
     <w:unhideWhenUsed/>
   </w:style>
   <w:style w:type="table" w:default="1" w:styleId="a1">

</xml_diff>

<commit_message>
Safeguard BEFORE ISSUE #40
Saving the progress before the fundamental changes that will occur during the CM tweaking
</commit_message>
<xml_diff>
--- a/Thesis/GPitsos Thesis.docx
+++ b/Thesis/GPitsos Thesis.docx
@@ -2708,7 +2708,7 @@
         </w:rPr>
         <w:t>(</w:t>
       </w:r>
-      <w:hyperlink w:anchor="_ENREF_18" w:tooltip="Issa, 2024 #6" w:history="1">
+      <w:hyperlink w:anchor="_ENREF_20" w:tooltip="Issa, 2024 #6" w:history="1">
         <w:r>
           <w:rPr>
             <w:rStyle w:val="-"/>
@@ -2764,7 +2764,7 @@
         </w:rPr>
         <w:t>(</w:t>
       </w:r>
-      <w:hyperlink w:anchor="_ENREF_19" w:tooltip="Kay, 2023 #7" w:history="1">
+      <w:hyperlink w:anchor="_ENREF_21" w:tooltip="Kay, 2023 #7" w:history="1">
         <w:r>
           <w:rPr>
             <w:rStyle w:val="-"/>
@@ -3043,7 +3043,7 @@
         </w:rPr>
         <w:t>(</w:t>
       </w:r>
-      <w:hyperlink w:anchor="_ENREF_38" w:tooltip="Sun, 2025 #17" w:history="1">
+      <w:hyperlink w:anchor="_ENREF_40" w:tooltip="Sun, 2025 #17" w:history="1">
         <w:r>
           <w:rPr>
             <w:rStyle w:val="-"/>
@@ -3371,7 +3371,7 @@
         </w:rPr>
         <w:t xml:space="preserve">, </w:t>
       </w:r>
-      <w:hyperlink w:anchor="_ENREF_27" w:tooltip="Lovreglio, 2016 #22" w:history="1">
+      <w:hyperlink w:anchor="_ENREF_29" w:tooltip="Lovreglio, 2016 #22" w:history="1">
         <w:r>
           <w:rPr>
             <w:rStyle w:val="-"/>
@@ -3385,7 +3385,7 @@
         </w:rPr>
         <w:t xml:space="preserve">, </w:t>
       </w:r>
-      <w:hyperlink w:anchor="_ENREF_38" w:tooltip="Sun, 2025 #17" w:history="1">
+      <w:hyperlink w:anchor="_ENREF_40" w:tooltip="Sun, 2025 #17" w:history="1">
         <w:r>
           <w:rPr>
             <w:rStyle w:val="-"/>
@@ -3563,7 +3563,7 @@
         </w:rPr>
         <w:t>(</w:t>
       </w:r>
-      <w:hyperlink w:anchor="_ENREF_23" w:tooltip="Kuligowski, 2011 #9" w:history="1">
+      <w:hyperlink w:anchor="_ENREF_25" w:tooltip="Kuligowski, 2011 #9" w:history="1">
         <w:r>
           <w:rPr>
             <w:rStyle w:val="-"/>
@@ -3775,7 +3775,7 @@
         </w:rPr>
         <w:t>(</w:t>
       </w:r>
-      <w:hyperlink w:anchor="_ENREF_12" w:tooltip="Gwynne, 2016 #10" w:history="1">
+      <w:hyperlink w:anchor="_ENREF_14" w:tooltip="Gwynne, 2016 #10" w:history="1">
         <w:r>
           <w:rPr>
             <w:rStyle w:val="-"/>
@@ -3789,7 +3789,7 @@
         </w:rPr>
         <w:t xml:space="preserve">, </w:t>
       </w:r>
-      <w:hyperlink w:anchor="_ENREF_32" w:tooltip="Senanayake, 2024 #16" w:history="1">
+      <w:hyperlink w:anchor="_ENREF_34" w:tooltip="Senanayake, 2024 #16" w:history="1">
         <w:r>
           <w:rPr>
             <w:rStyle w:val="-"/>
@@ -3803,7 +3803,7 @@
         </w:rPr>
         <w:t xml:space="preserve">, </w:t>
       </w:r>
-      <w:hyperlink w:anchor="_ENREF_49" w:tooltip="Zheng, 2009 #23" w:history="1">
+      <w:hyperlink w:anchor="_ENREF_52" w:tooltip="Zheng, 2009 #23" w:history="1">
         <w:r>
           <w:rPr>
             <w:rStyle w:val="-"/>
@@ -4324,7 +4324,7 @@
         </w:rPr>
         <w:t xml:space="preserve">, </w:t>
       </w:r>
-      <w:hyperlink w:anchor="_ENREF_33" w:tooltip="Shaikh, 2020 #14" w:history="1">
+      <w:hyperlink w:anchor="_ENREF_35" w:tooltip="Shaikh, 2020 #14" w:history="1">
         <w:r>
           <w:rPr>
             <w:rStyle w:val="-"/>
@@ -6882,7 +6882,7 @@
         </w:rPr>
         <w:t>(</w:t>
       </w:r>
-      <w:hyperlink w:anchor="_ENREF_33" w:tooltip="Shaikh, 2020 #14" w:history="1">
+      <w:hyperlink w:anchor="_ENREF_35" w:tooltip="Shaikh, 2020 #14" w:history="1">
         <w:r>
           <w:rPr>
             <w:rStyle w:val="-"/>
@@ -7021,7 +7021,7 @@
         </w:rPr>
         <w:t>(</w:t>
       </w:r>
-      <w:hyperlink w:anchor="_ENREF_33" w:tooltip="Shaikh, 2020 #14" w:history="1">
+      <w:hyperlink w:anchor="_ENREF_35" w:tooltip="Shaikh, 2020 #14" w:history="1">
         <w:r>
           <w:rPr>
             <w:rStyle w:val="-"/>
@@ -7192,7 +7192,7 @@
         </w:rPr>
         <w:t>(</w:t>
       </w:r>
-      <w:hyperlink w:anchor="_ENREF_45" w:tooltip="Wan, 2014 #25" w:history="1">
+      <w:hyperlink w:anchor="_ENREF_48" w:tooltip="Wan, 2014 #25" w:history="1">
         <w:r>
           <w:rPr>
             <w:rStyle w:val="-"/>
@@ -7287,7 +7287,7 @@
         </w:rPr>
         <w:t>(</w:t>
       </w:r>
-      <w:hyperlink w:anchor="_ENREF_32" w:tooltip="Senanayake, 2024 #16" w:history="1">
+      <w:hyperlink w:anchor="_ENREF_34" w:tooltip="Senanayake, 2024 #16" w:history="1">
         <w:r>
           <w:rPr>
             <w:rStyle w:val="-"/>
@@ -7331,7 +7331,7 @@
         </w:rPr>
         <w:t>(</w:t>
       </w:r>
-      <w:hyperlink w:anchor="_ENREF_30" w:tooltip="Ronchi, 2021 #26" w:history="1">
+      <w:hyperlink w:anchor="_ENREF_32" w:tooltip="Ronchi, 2021 #26" w:history="1">
         <w:r>
           <w:rPr>
             <w:rStyle w:val="-"/>
@@ -7393,7 +7393,7 @@
         </w:rPr>
         <w:t>(</w:t>
       </w:r>
-      <w:hyperlink w:anchor="_ENREF_20" w:tooltip="Kim, 2026 #27" w:history="1">
+      <w:hyperlink w:anchor="_ENREF_22" w:tooltip="Kim, 2026 #27" w:history="1">
         <w:r>
           <w:rPr>
             <w:rStyle w:val="-"/>
@@ -7407,7 +7407,7 @@
         </w:rPr>
         <w:t xml:space="preserve">, </w:t>
       </w:r>
-      <w:hyperlink w:anchor="_ENREF_24" w:tooltip="Lawande, 2022 #24" w:history="1">
+      <w:hyperlink w:anchor="_ENREF_26" w:tooltip="Lawande, 2022 #24" w:history="1">
         <w:r>
           <w:rPr>
             <w:rStyle w:val="-"/>
@@ -7448,7 +7448,7 @@
         </w:rPr>
         <w:t>(</w:t>
       </w:r>
-      <w:hyperlink w:anchor="_ENREF_34" w:tooltip="Sharma, 2012 #44" w:history="1">
+      <w:hyperlink w:anchor="_ENREF_36" w:tooltip="Sharma, 2012 #44" w:history="1">
         <w:r>
           <w:rPr>
             <w:rStyle w:val="-"/>
@@ -7507,7 +7507,7 @@
         </w:rPr>
         <w:t>(</w:t>
       </w:r>
-      <w:hyperlink w:anchor="_ENREF_20" w:tooltip="Kim, 2026 #27" w:history="1">
+      <w:hyperlink w:anchor="_ENREF_22" w:tooltip="Kim, 2026 #27" w:history="1">
         <w:r>
           <w:rPr>
             <w:rStyle w:val="-"/>
@@ -7673,7 +7673,7 @@
         </w:rPr>
         <w:t>(</w:t>
       </w:r>
-      <w:hyperlink w:anchor="_ENREF_6" w:tooltip="Debebe Kebede, 2025 #30" w:history="1">
+      <w:hyperlink w:anchor="_ENREF_7" w:tooltip="Debebe Kebede, 2025 #30" w:history="1">
         <w:r>
           <w:rPr>
             <w:rStyle w:val="-"/>
@@ -7687,7 +7687,7 @@
         </w:rPr>
         <w:t xml:space="preserve">, </w:t>
       </w:r>
-      <w:hyperlink w:anchor="_ENREF_24" w:tooltip="Lawande, 2022 #24" w:history="1">
+      <w:hyperlink w:anchor="_ENREF_26" w:tooltip="Lawande, 2022 #24" w:history="1">
         <w:r>
           <w:rPr>
             <w:rStyle w:val="-"/>
@@ -7903,7 +7903,7 @@
         </w:rPr>
         <w:t xml:space="preserve">, </w:t>
       </w:r>
-      <w:hyperlink w:anchor="_ENREF_32" w:tooltip="Senanayake, 2024 #16" w:history="1">
+      <w:hyperlink w:anchor="_ENREF_34" w:tooltip="Senanayake, 2024 #16" w:history="1">
         <w:r>
           <w:rPr>
             <w:rStyle w:val="-"/>
@@ -7917,7 +7917,7 @@
         </w:rPr>
         <w:t xml:space="preserve">, </w:t>
       </w:r>
-      <w:hyperlink w:anchor="_ENREF_38" w:tooltip="Sun, 2025 #17" w:history="1">
+      <w:hyperlink w:anchor="_ENREF_40" w:tooltip="Sun, 2025 #17" w:history="1">
         <w:r>
           <w:rPr>
             <w:rStyle w:val="-"/>
@@ -7973,7 +7973,7 @@
         </w:rPr>
         <w:t>(</w:t>
       </w:r>
-      <w:hyperlink w:anchor="_ENREF_18" w:tooltip="Issa, 2024 #6" w:history="1">
+      <w:hyperlink w:anchor="_ENREF_20" w:tooltip="Issa, 2024 #6" w:history="1">
         <w:r>
           <w:rPr>
             <w:rStyle w:val="-"/>
@@ -8023,7 +8023,7 @@
         </w:rPr>
         <w:t>(</w:t>
       </w:r>
-      <w:hyperlink w:anchor="_ENREF_20" w:tooltip="Kim, 2026 #27" w:history="1">
+      <w:hyperlink w:anchor="_ENREF_22" w:tooltip="Kim, 2026 #27" w:history="1">
         <w:r>
           <w:rPr>
             <w:rStyle w:val="-"/>
@@ -8058,7 +8058,7 @@
         </w:rPr>
         <w:t>(</w:t>
       </w:r>
-      <w:hyperlink w:anchor="_ENREF_13" w:tooltip="He, 2024 #29" w:history="1">
+      <w:hyperlink w:anchor="_ENREF_15" w:tooltip="He, 2024 #29" w:history="1">
         <w:r>
           <w:rPr>
             <w:rStyle w:val="-"/>
@@ -8190,7 +8190,7 @@
         </w:rPr>
         <w:t>(</w:t>
       </w:r>
-      <w:hyperlink w:anchor="_ENREF_24" w:tooltip="Lawande, 2022 #24" w:history="1">
+      <w:hyperlink w:anchor="_ENREF_26" w:tooltip="Lawande, 2022 #24" w:history="1">
         <w:r>
           <w:rPr>
             <w:rStyle w:val="-"/>
@@ -8204,7 +8204,7 @@
         </w:rPr>
         <w:t xml:space="preserve">, </w:t>
       </w:r>
-      <w:hyperlink w:anchor="_ENREF_29" w:tooltip="Niu, 2021 #32" w:history="1">
+      <w:hyperlink w:anchor="_ENREF_31" w:tooltip="Niu, 2021 #32" w:history="1">
         <w:r>
           <w:rPr>
             <w:rStyle w:val="-"/>
@@ -8260,7 +8260,7 @@
         </w:rPr>
         <w:t>(</w:t>
       </w:r>
-      <w:hyperlink w:anchor="_ENREF_16" w:tooltip="Hu, 2018 #31" w:history="1">
+      <w:hyperlink w:anchor="_ENREF_18" w:tooltip="Hu, 2018 #31" w:history="1">
         <w:r>
           <w:rPr>
             <w:rStyle w:val="-"/>
@@ -8274,7 +8274,7 @@
         </w:rPr>
         <w:t xml:space="preserve">, </w:t>
       </w:r>
-      <w:hyperlink w:anchor="_ENREF_42" w:tooltip="Trevena, 2015 #36" w:history="1">
+      <w:hyperlink w:anchor="_ENREF_45" w:tooltip="Trevena, 2015 #36" w:history="1">
         <w:r>
           <w:rPr>
             <w:rStyle w:val="-"/>
@@ -8348,7 +8348,7 @@
         </w:rPr>
         <w:t>(</w:t>
       </w:r>
-      <w:hyperlink w:anchor="_ENREF_36" w:tooltip="Stentz, 1994 #35" w:history="1">
+      <w:hyperlink w:anchor="_ENREF_38" w:tooltip="Stentz, 1994 #35" w:history="1">
         <w:r>
           <w:rPr>
             <w:rStyle w:val="-"/>
@@ -8392,7 +8392,7 @@
         </w:rPr>
         <w:t>(</w:t>
       </w:r>
-      <w:hyperlink w:anchor="_ENREF_10" w:tooltip="Fitrianie, 2015 #37" w:history="1">
+      <w:hyperlink w:anchor="_ENREF_11" w:tooltip="Fitrianie, 2015 #37" w:history="1">
         <w:r>
           <w:rPr>
             <w:rStyle w:val="-"/>
@@ -8406,7 +8406,7 @@
         </w:rPr>
         <w:t xml:space="preserve">, </w:t>
       </w:r>
-      <w:hyperlink w:anchor="_ENREF_26" w:tooltip="Liu, 2023 #38" w:history="1">
+      <w:hyperlink w:anchor="_ENREF_28" w:tooltip="Liu, 2023 #38" w:history="1">
         <w:r>
           <w:rPr>
             <w:rStyle w:val="-"/>
@@ -8561,7 +8561,7 @@
         </w:rPr>
         <w:t>(</w:t>
       </w:r>
-      <w:hyperlink w:anchor="_ENREF_13" w:tooltip="He, 2024 #29" w:history="1">
+      <w:hyperlink w:anchor="_ENREF_15" w:tooltip="He, 2024 #29" w:history="1">
         <w:r>
           <w:rPr>
             <w:rStyle w:val="-"/>
@@ -8575,7 +8575,7 @@
         </w:rPr>
         <w:t xml:space="preserve">, </w:t>
       </w:r>
-      <w:hyperlink w:anchor="_ENREF_25" w:tooltip="Lee, 2023 #41" w:history="1">
+      <w:hyperlink w:anchor="_ENREF_27" w:tooltip="Lee, 2023 #41" w:history="1">
         <w:r>
           <w:rPr>
             <w:rStyle w:val="-"/>
@@ -8640,7 +8640,7 @@
       <w:r>
         <w:t xml:space="preserve"> </w:t>
       </w:r>
-      <w:hyperlink w:anchor="_ENREF_22" w:tooltip="Koenig, 2002 #42" w:history="1">
+      <w:hyperlink w:anchor="_ENREF_24" w:tooltip="Koenig, 2002 #42" w:history="1">
         <w:r>
           <w:rPr>
             <w:rStyle w:val="-"/>
@@ -8812,7 +8812,7 @@
         </w:rPr>
         <w:t>(</w:t>
       </w:r>
-      <w:hyperlink w:anchor="_ENREF_39" w:tooltip="Talbi, 2009 #40" w:history="1">
+      <w:hyperlink w:anchor="_ENREF_41" w:tooltip="Talbi, 2009 #40" w:history="1">
         <w:r>
           <w:rPr>
             <w:rStyle w:val="-"/>
@@ -8973,7 +8973,7 @@
         </w:rPr>
         <w:t>(</w:t>
       </w:r>
-      <w:hyperlink w:anchor="_ENREF_18" w:tooltip="Issa, 2024 #6" w:history="1">
+      <w:hyperlink w:anchor="_ENREF_20" w:tooltip="Issa, 2024 #6" w:history="1">
         <w:r>
           <w:rPr>
             <w:rStyle w:val="-"/>
@@ -10858,7 +10858,7 @@
         </w:rPr>
         <w:t>(</w:t>
       </w:r>
-      <w:hyperlink w:anchor="_ENREF_33" w:tooltip="Shaikh, 2020 #14" w:history="1">
+      <w:hyperlink w:anchor="_ENREF_35" w:tooltip="Shaikh, 2020 #14" w:history="1">
         <w:r>
           <w:rPr>
             <w:rStyle w:val="-"/>
@@ -11202,7 +11202,7 @@
         </w:rPr>
         <w:t>(</w:t>
       </w:r>
-      <w:hyperlink w:anchor="_ENREF_22" w:tooltip="Koenig, 2002 #42" w:history="1">
+      <w:hyperlink w:anchor="_ENREF_24" w:tooltip="Koenig, 2002 #42" w:history="1">
         <w:r>
           <w:rPr>
             <w:rStyle w:val="-"/>
@@ -15531,7 +15531,7 @@
         </w:rPr>
         <w:t>(</w:t>
       </w:r>
-      <w:hyperlink w:anchor="_ENREF_13" w:tooltip="He, 2024 #29" w:history="1">
+      <w:hyperlink w:anchor="_ENREF_15" w:tooltip="He, 2024 #29" w:history="1">
         <w:r>
           <w:rPr>
             <w:rStyle w:val="-"/>
@@ -15619,7 +15619,7 @@
         </w:rPr>
         <w:t>(</w:t>
       </w:r>
-      <w:hyperlink w:anchor="_ENREF_3" w:tooltip="Barański, 2021 #50" w:history="1">
+      <w:hyperlink w:anchor="_ENREF_4" w:tooltip="Barański, 2021 #50" w:history="1">
         <w:r>
           <w:rPr>
             <w:rStyle w:val="-"/>
@@ -15794,7 +15794,7 @@
         </w:rPr>
         <w:t>(</w:t>
       </w:r>
-      <w:hyperlink w:anchor="_ENREF_41" w:tooltip="Tin, 2023 #60" w:history="1">
+      <w:hyperlink w:anchor="_ENREF_44" w:tooltip="Tin, 2023 #60" w:history="1">
         <w:r>
           <w:rPr>
             <w:rStyle w:val="-"/>
@@ -15814,7 +15814,7 @@
       <w:r>
         <w:t xml:space="preserve">. Ωστόσο, η διαρροή χημικών είναι η πιο κοινή μορφή αστοχίας του εξοπλισμού σε μονάδες παραγωγής χημικών. Εξαιτίας της μεγάλης ποικιλίας και φύσεως των επικίνδυνων χημικών, δεν είναι εύκολο τα υπάρχοντα προληπτικά μέτρα να εξαλείψουν πλήρως την πιθανότητα των ατυχημάτων διαρροής. Από την έρευνα που διεξήγαγαν οι </w:t>
       </w:r>
-      <w:hyperlink w:anchor="_ENREF_48" w:tooltip="Yang, 2022 #61" w:history="1">
+      <w:hyperlink w:anchor="_ENREF_51" w:tooltip="Yang, 2022 #61" w:history="1">
         <w:r>
           <w:rPr>
             <w:rStyle w:val="-"/>
@@ -15936,7 +15936,7 @@
         </w:rPr>
         <w:t>(</w:t>
       </w:r>
-      <w:hyperlink w:anchor="_ENREF_46" w:tooltip="Wijnands, 2025 #59" w:history="1">
+      <w:hyperlink w:anchor="_ENREF_49" w:tooltip="Wijnands, 2025 #59" w:history="1">
         <w:r>
           <w:rPr>
             <w:rStyle w:val="-"/>
@@ -15980,7 +15980,7 @@
         </w:rPr>
         <w:t>(</w:t>
       </w:r>
-      <w:hyperlink w:anchor="_ENREF_33" w:tooltip="Shaikh, 2020 #14" w:history="1">
+      <w:hyperlink w:anchor="_ENREF_35" w:tooltip="Shaikh, 2020 #14" w:history="1">
         <w:r>
           <w:rPr>
             <w:rStyle w:val="-"/>
@@ -16000,7 +16000,7 @@
       <w:r>
         <w:t xml:space="preserve">. Καθώς οι </w:t>
       </w:r>
-      <w:hyperlink w:anchor="_ENREF_33" w:tooltip="Shaikh, 2020 #14" w:history="1">
+      <w:hyperlink w:anchor="_ENREF_35" w:tooltip="Shaikh, 2020 #14" w:history="1">
         <w:r>
           <w:rPr>
             <w:rStyle w:val="-"/>
@@ -16102,7 +16102,7 @@
       <w:r>
         <w:t xml:space="preserve">Σύμφωνα με τους </w:t>
       </w:r>
-      <w:hyperlink w:anchor="_ENREF_33" w:tooltip="Shaikh, 2020 #14" w:history="1">
+      <w:hyperlink w:anchor="_ENREF_35" w:tooltip="Shaikh, 2020 #14" w:history="1">
         <w:r>
           <w:rPr>
             <w:rStyle w:val="-"/>
@@ -16137,7 +16137,7 @@
       <w:r>
         <w:t xml:space="preserve"> και τους </w:t>
       </w:r>
-      <w:hyperlink w:anchor="_ENREF_43" w:tooltip="Ventura Spagnolo, 2019 #63" w:history="1">
+      <w:hyperlink w:anchor="_ENREF_46" w:tooltip="Ventura Spagnolo, 2019 #63" w:history="1">
         <w:r>
           <w:rPr>
             <w:rStyle w:val="-"/>
@@ -16334,7 +16334,7 @@
         </w:rPr>
         <w:t>(</w:t>
       </w:r>
-      <w:hyperlink w:anchor="_ENREF_47" w:tooltip="Xu, 2014 #62" w:history="1">
+      <w:hyperlink w:anchor="_ENREF_50" w:tooltip="Xu, 2014 #62" w:history="1">
         <w:r>
           <w:rPr>
             <w:rStyle w:val="-"/>
@@ -16377,7 +16377,7 @@
       <w:r>
         <w:t xml:space="preserve">Για την προσομοίωση των επιπτώσεων στην ανθρώπινη φυσιολογία χρησιμοποιήθηκε ως βάση το μοντέλο των </w:t>
       </w:r>
-      <w:hyperlink w:anchor="_ENREF_5" w:tooltip="Boris, 2014 #5" w:history="1">
+      <w:hyperlink w:anchor="_ENREF_6" w:tooltip="Boris, 2014 #5" w:history="1">
         <w:r>
           <w:rPr>
             <w:rStyle w:val="-"/>
@@ -16418,7 +16418,7 @@
       <w:r>
         <w:t xml:space="preserve">των </w:t>
       </w:r>
-      <w:hyperlink w:anchor="_ENREF_33" w:tooltip="Shaikh, 2020 #14" w:history="1">
+      <w:hyperlink w:anchor="_ENREF_35" w:tooltip="Shaikh, 2020 #14" w:history="1">
         <w:r>
           <w:rPr>
             <w:rStyle w:val="-"/>
@@ -16582,7 +16582,7 @@
         </w:rPr>
         <w:t>(</w:t>
       </w:r>
-      <w:hyperlink w:anchor="_ENREF_5" w:tooltip="Boris, 2014 #5" w:history="1">
+      <w:hyperlink w:anchor="_ENREF_6" w:tooltip="Boris, 2014 #5" w:history="1">
         <w:r>
           <w:rPr>
             <w:rStyle w:val="-"/>
@@ -16770,7 +16770,10 @@
       <w:r>
         <w:t xml:space="preserve"> (Πηγή:</w:t>
       </w:r>
-      <w:hyperlink w:anchor="_ENREF_8" w:tooltip="EPA, 2025 #64" w:history="1">
+      <w:r>
+        <w:t xml:space="preserve"> </w:t>
+      </w:r>
+      <w:hyperlink w:anchor="_ENREF_9" w:tooltip="EPA, 2025 #64" w:history="1">
         <w:r>
           <w:rPr>
             <w:rStyle w:val="-"/>
@@ -16842,9 +16845,11 @@
         <w:tc>
           <w:tcPr>
             <w:tcW w:w="1657" w:type="dxa"/>
+            <w:vAlign w:val="center"/>
           </w:tcPr>
           <w:p>
             <w:pPr>
+              <w:jc w:val="center"/>
               <w:rPr>
                 <w:lang w:val="en-US"/>
               </w:rPr>
@@ -16860,9 +16865,11 @@
         <w:tc>
           <w:tcPr>
             <w:tcW w:w="1657" w:type="dxa"/>
+            <w:vAlign w:val="center"/>
           </w:tcPr>
           <w:p>
             <w:pPr>
+              <w:jc w:val="center"/>
               <w:rPr>
                 <w:lang w:val="en-US"/>
               </w:rPr>
@@ -16878,9 +16885,11 @@
         <w:tc>
           <w:tcPr>
             <w:tcW w:w="1657" w:type="dxa"/>
+            <w:vAlign w:val="center"/>
           </w:tcPr>
           <w:p>
             <w:pPr>
+              <w:jc w:val="center"/>
               <w:rPr>
                 <w:lang w:val="en-US"/>
               </w:rPr>
@@ -16896,9 +16905,11 @@
         <w:tc>
           <w:tcPr>
             <w:tcW w:w="1685" w:type="dxa"/>
+            <w:vAlign w:val="center"/>
           </w:tcPr>
           <w:p>
             <w:pPr>
+              <w:jc w:val="center"/>
               <w:rPr>
                 <w:lang w:val="en-US"/>
               </w:rPr>
@@ -16914,9 +16925,11 @@
         <w:tc>
           <w:tcPr>
             <w:tcW w:w="1604" w:type="dxa"/>
+            <w:vAlign w:val="center"/>
           </w:tcPr>
           <w:p>
             <w:pPr>
+              <w:jc w:val="center"/>
               <w:rPr>
                 <w:lang w:val="en-US"/>
               </w:rPr>
@@ -16935,9 +16948,11 @@
           <w:tcPr>
             <w:tcW w:w="10070" w:type="dxa"/>
             <w:gridSpan w:val="6"/>
+            <w:vAlign w:val="center"/>
           </w:tcPr>
           <w:p>
             <w:pPr>
+              <w:jc w:val="left"/>
               <w:rPr>
                 <w:lang w:val="en-US"/>
               </w:rPr>
@@ -16973,9 +16988,11 @@
         <w:tc>
           <w:tcPr>
             <w:tcW w:w="1657" w:type="dxa"/>
+            <w:vAlign w:val="center"/>
           </w:tcPr>
           <w:p>
             <w:pPr>
+              <w:jc w:val="center"/>
               <w:rPr>
                 <w:lang w:val="en-US"/>
               </w:rPr>
@@ -16991,9 +17008,11 @@
         <w:tc>
           <w:tcPr>
             <w:tcW w:w="1657" w:type="dxa"/>
+            <w:vAlign w:val="center"/>
           </w:tcPr>
           <w:p>
             <w:pPr>
+              <w:jc w:val="center"/>
               <w:rPr>
                 <w:lang w:val="en-US"/>
               </w:rPr>
@@ -17009,9 +17028,11 @@
         <w:tc>
           <w:tcPr>
             <w:tcW w:w="1657" w:type="dxa"/>
+            <w:vAlign w:val="center"/>
           </w:tcPr>
           <w:p>
             <w:pPr>
+              <w:jc w:val="center"/>
               <w:rPr>
                 <w:lang w:val="en-US"/>
               </w:rPr>
@@ -17027,9 +17048,11 @@
         <w:tc>
           <w:tcPr>
             <w:tcW w:w="1685" w:type="dxa"/>
+            <w:vAlign w:val="center"/>
           </w:tcPr>
           <w:p>
             <w:pPr>
+              <w:jc w:val="center"/>
               <w:rPr>
                 <w:lang w:val="en-US"/>
               </w:rPr>
@@ -17045,9 +17068,11 @@
         <w:tc>
           <w:tcPr>
             <w:tcW w:w="1604" w:type="dxa"/>
+            <w:vAlign w:val="center"/>
           </w:tcPr>
           <w:p>
             <w:pPr>
+              <w:jc w:val="center"/>
               <w:rPr>
                 <w:lang w:val="en-US"/>
               </w:rPr>
@@ -17083,9 +17108,11 @@
         <w:tc>
           <w:tcPr>
             <w:tcW w:w="1657" w:type="dxa"/>
+            <w:vAlign w:val="center"/>
           </w:tcPr>
           <w:p>
             <w:pPr>
+              <w:jc w:val="center"/>
               <w:rPr>
                 <w:lang w:val="en-US"/>
               </w:rPr>
@@ -17101,9 +17128,11 @@
         <w:tc>
           <w:tcPr>
             <w:tcW w:w="1657" w:type="dxa"/>
+            <w:vAlign w:val="center"/>
           </w:tcPr>
           <w:p>
             <w:pPr>
+              <w:jc w:val="center"/>
               <w:rPr>
                 <w:lang w:val="en-US"/>
               </w:rPr>
@@ -17119,9 +17148,11 @@
         <w:tc>
           <w:tcPr>
             <w:tcW w:w="1657" w:type="dxa"/>
+            <w:vAlign w:val="center"/>
           </w:tcPr>
           <w:p>
             <w:pPr>
+              <w:jc w:val="center"/>
               <w:rPr>
                 <w:lang w:val="en-US"/>
               </w:rPr>
@@ -17137,9 +17168,11 @@
         <w:tc>
           <w:tcPr>
             <w:tcW w:w="1685" w:type="dxa"/>
+            <w:vAlign w:val="center"/>
           </w:tcPr>
           <w:p>
             <w:pPr>
+              <w:jc w:val="center"/>
               <w:rPr>
                 <w:lang w:val="en-US"/>
               </w:rPr>
@@ -17155,9 +17188,11 @@
         <w:tc>
           <w:tcPr>
             <w:tcW w:w="1604" w:type="dxa"/>
+            <w:vAlign w:val="center"/>
           </w:tcPr>
           <w:p>
             <w:pPr>
+              <w:jc w:val="center"/>
               <w:rPr>
                 <w:lang w:val="en-US"/>
               </w:rPr>
@@ -17193,9 +17228,11 @@
         <w:tc>
           <w:tcPr>
             <w:tcW w:w="1657" w:type="dxa"/>
+            <w:vAlign w:val="center"/>
           </w:tcPr>
           <w:p>
             <w:pPr>
+              <w:jc w:val="center"/>
               <w:rPr>
                 <w:lang w:val="en-US"/>
               </w:rPr>
@@ -17211,9 +17248,11 @@
         <w:tc>
           <w:tcPr>
             <w:tcW w:w="1657" w:type="dxa"/>
+            <w:vAlign w:val="center"/>
           </w:tcPr>
           <w:p>
             <w:pPr>
+              <w:jc w:val="center"/>
               <w:rPr>
                 <w:lang w:val="en-US"/>
               </w:rPr>
@@ -17229,9 +17268,11 @@
         <w:tc>
           <w:tcPr>
             <w:tcW w:w="1657" w:type="dxa"/>
+            <w:vAlign w:val="center"/>
           </w:tcPr>
           <w:p>
             <w:pPr>
+              <w:jc w:val="center"/>
               <w:rPr>
                 <w:lang w:val="en-US"/>
               </w:rPr>
@@ -17247,9 +17288,11 @@
         <w:tc>
           <w:tcPr>
             <w:tcW w:w="1685" w:type="dxa"/>
+            <w:vAlign w:val="center"/>
           </w:tcPr>
           <w:p>
             <w:pPr>
+              <w:jc w:val="center"/>
               <w:rPr>
                 <w:lang w:val="en-US"/>
               </w:rPr>
@@ -17265,9 +17308,11 @@
         <w:tc>
           <w:tcPr>
             <w:tcW w:w="1604" w:type="dxa"/>
+            <w:vAlign w:val="center"/>
           </w:tcPr>
           <w:p>
             <w:pPr>
+              <w:jc w:val="center"/>
               <w:rPr>
                 <w:lang w:val="en-US"/>
               </w:rPr>
@@ -17287,7 +17332,7 @@
       <w:r>
         <w:t xml:space="preserve">Οι </w:t>
       </w:r>
-      <w:hyperlink w:anchor="_ENREF_33" w:tooltip="Shaikh, 2020 #14" w:history="1">
+      <w:hyperlink w:anchor="_ENREF_35" w:tooltip="Shaikh, 2020 #14" w:history="1">
         <w:r>
           <w:rPr>
             <w:rStyle w:val="-"/>
@@ -17521,7 +17566,7 @@
       <w:r>
         <w:t xml:space="preserve">. Οι </w:t>
       </w:r>
-      <w:hyperlink w:anchor="_ENREF_37" w:tooltip="Stevens, 1999 #65" w:history="1">
+      <w:hyperlink w:anchor="_ENREF_39" w:tooltip="Stevens, 1999 #65" w:history="1">
         <w:r>
           <w:rPr>
             <w:rStyle w:val="-"/>
@@ -17678,7 +17723,7 @@
         </w:rPr>
         <w:t>(</w:t>
       </w:r>
-      <w:hyperlink w:anchor="_ENREF_33" w:tooltip="Shaikh, 2020 #14" w:history="1">
+      <w:hyperlink w:anchor="_ENREF_35" w:tooltip="Shaikh, 2020 #14" w:history="1">
         <w:r>
           <w:rPr>
             <w:rStyle w:val="-"/>
@@ -17725,7 +17770,7 @@
       <w:r>
         <w:t xml:space="preserve">Οι </w:t>
       </w:r>
-      <w:hyperlink w:anchor="_ENREF_5" w:tooltip="Boris, 2014 #5" w:history="1">
+      <w:hyperlink w:anchor="_ENREF_6" w:tooltip="Boris, 2014 #5" w:history="1">
         <w:r>
           <w:rPr>
             <w:rStyle w:val="-"/>
@@ -18515,7 +18560,7 @@
       <w:r>
         <w:t xml:space="preserve">= εκθέτης για την προς εξέταση ουσία, όπως προκύπτει από τους </w:t>
       </w:r>
-      <w:hyperlink w:anchor="_ENREF_40" w:tooltip="ten Berge, 1986 #66" w:history="1">
+      <w:hyperlink w:anchor="_ENREF_43" w:tooltip="ten Berge, 1986 #66" w:history="1">
         <w:r>
           <w:rPr>
             <w:rStyle w:val="-"/>
@@ -19029,7 +19074,7 @@
         </w:rPr>
         <w:t>(</w:t>
       </w:r>
-      <w:hyperlink w:anchor="_ENREF_40" w:tooltip="ten Berge, 1986 #66" w:history="1">
+      <w:hyperlink w:anchor="_ENREF_43" w:tooltip="ten Berge, 1986 #66" w:history="1">
         <w:r>
           <w:rPr>
             <w:rStyle w:val="-"/>
@@ -19096,7 +19141,7 @@
       <w:r>
         <w:t xml:space="preserve">Οι </w:t>
       </w:r>
-      <w:hyperlink w:anchor="_ENREF_5" w:tooltip="Boris, 2014 #5" w:history="1">
+      <w:hyperlink w:anchor="_ENREF_6" w:tooltip="Boris, 2014 #5" w:history="1">
         <w:r>
           <w:rPr>
             <w:rStyle w:val="-"/>
@@ -19440,7 +19485,7 @@
         </w:rPr>
         <w:t xml:space="preserve">, </w:t>
       </w:r>
-      <w:hyperlink w:anchor="_ENREF_33" w:tooltip="Shaikh, 2020 #14" w:history="1">
+      <w:hyperlink w:anchor="_ENREF_35" w:tooltip="Shaikh, 2020 #14" w:history="1">
         <w:r>
           <w:rPr>
             <w:rStyle w:val="-"/>
@@ -19595,7 +19640,7 @@
         </w:rPr>
         <w:t>(</w:t>
       </w:r>
-      <w:hyperlink w:anchor="_ENREF_44" w:tooltip="Vermuyten, 2016 #51" w:history="1">
+      <w:hyperlink w:anchor="_ENREF_47" w:tooltip="Vermuyten, 2016 #51" w:history="1">
         <w:r>
           <w:rPr>
             <w:rStyle w:val="-"/>
@@ -19926,7 +19971,7 @@
         </w:rPr>
         <w:t>(</w:t>
       </w:r>
-      <w:hyperlink w:anchor="_ENREF_32" w:tooltip="Senanayake, 2024 #16" w:history="1">
+      <w:hyperlink w:anchor="_ENREF_34" w:tooltip="Senanayake, 2024 #16" w:history="1">
         <w:r>
           <w:rPr>
             <w:rStyle w:val="-"/>
@@ -19976,7 +20021,7 @@
         </w:rPr>
         <w:t>(</w:t>
       </w:r>
-      <w:hyperlink w:anchor="_ENREF_28" w:tooltip="Macal, 2018 #52" w:history="1">
+      <w:hyperlink w:anchor="_ENREF_30" w:tooltip="Macal, 2018 #52" w:history="1">
         <w:r>
           <w:rPr>
             <w:rStyle w:val="-"/>
@@ -20081,7 +20126,7 @@
         </w:rPr>
         <w:t>(</w:t>
       </w:r>
-      <w:hyperlink w:anchor="_ENREF_9" w:tooltip="Epstein, 1996 #56" w:history="1">
+      <w:hyperlink w:anchor="_ENREF_10" w:tooltip="Epstein, 1996 #56" w:history="1">
         <w:r>
           <w:rPr>
             <w:rStyle w:val="-"/>
@@ -20143,7 +20188,7 @@
         </w:rPr>
         <w:t>(</w:t>
       </w:r>
-      <w:hyperlink w:anchor="_ENREF_21" w:tooltip="Klügl, 2012 #57" w:history="1">
+      <w:hyperlink w:anchor="_ENREF_23" w:tooltip="Klügl, 2012 #57" w:history="1">
         <w:r>
           <w:rPr>
             <w:rStyle w:val="-"/>
@@ -20205,7 +20250,7 @@
         </w:rPr>
         <w:t>(</w:t>
       </w:r>
-      <w:hyperlink w:anchor="_ENREF_17" w:tooltip="Ibrahim, 2023 #55" w:history="1">
+      <w:hyperlink w:anchor="_ENREF_19" w:tooltip="Ibrahim, 2023 #55" w:history="1">
         <w:r>
           <w:rPr>
             <w:rStyle w:val="-"/>
@@ -20252,7 +20297,7 @@
         </w:rPr>
         <w:t>(</w:t>
       </w:r>
-      <w:hyperlink w:anchor="_ENREF_7" w:tooltip="DuBois, 2022 #53" w:history="1">
+      <w:hyperlink w:anchor="_ENREF_8" w:tooltip="DuBois, 2022 #53" w:history="1">
         <w:r>
           <w:rPr>
             <w:rStyle w:val="-"/>
@@ -20362,7 +20407,7 @@
         </w:rPr>
         <w:t>(</w:t>
       </w:r>
-      <w:hyperlink w:anchor="_ENREF_24" w:tooltip="Lawande, 2022 #24" w:history="1">
+      <w:hyperlink w:anchor="_ENREF_26" w:tooltip="Lawande, 2022 #24" w:history="1">
         <w:r>
           <w:rPr>
             <w:rStyle w:val="-"/>
@@ -20592,7 +20637,7 @@
         </w:rPr>
         <w:t>(</w:t>
       </w:r>
-      <w:hyperlink w:anchor="_ENREF_24" w:tooltip="Lawande, 2022 #24" w:history="1">
+      <w:hyperlink w:anchor="_ENREF_26" w:tooltip="Lawande, 2022 #24" w:history="1">
         <w:r>
           <w:rPr>
             <w:rStyle w:val="-"/>
@@ -20779,7 +20824,7 @@
         </w:rPr>
         <w:t>(</w:t>
       </w:r>
-      <w:hyperlink w:anchor="_ENREF_20" w:tooltip="Kim, 2026 #27" w:history="1">
+      <w:hyperlink w:anchor="_ENREF_22" w:tooltip="Kim, 2026 #27" w:history="1">
         <w:r>
           <w:rPr>
             <w:rStyle w:val="-"/>
@@ -20793,7 +20838,7 @@
         </w:rPr>
         <w:t xml:space="preserve">, </w:t>
       </w:r>
-      <w:hyperlink w:anchor="_ENREF_24" w:tooltip="Lawande, 2022 #24" w:history="1">
+      <w:hyperlink w:anchor="_ENREF_26" w:tooltip="Lawande, 2022 #24" w:history="1">
         <w:r>
           <w:rPr>
             <w:rStyle w:val="-"/>
@@ -20903,7 +20948,7 @@
         </w:rPr>
         <w:t>(</w:t>
       </w:r>
-      <w:hyperlink w:anchor="_ENREF_24" w:tooltip="Lawande, 2022 #24" w:history="1">
+      <w:hyperlink w:anchor="_ENREF_26" w:tooltip="Lawande, 2022 #24" w:history="1">
         <w:r>
           <w:rPr>
             <w:rStyle w:val="-"/>
@@ -21016,7 +21061,7 @@
         </w:rPr>
         <w:t>(</w:t>
       </w:r>
-      <w:hyperlink w:anchor="_ENREF_34" w:tooltip="Sharma, 2012 #44" w:history="1">
+      <w:hyperlink w:anchor="_ENREF_36" w:tooltip="Sharma, 2012 #44" w:history="1">
         <w:r>
           <w:rPr>
             <w:rStyle w:val="-"/>
@@ -21079,7 +21124,7 @@
         </w:rPr>
         <w:t>(</w:t>
       </w:r>
-      <w:hyperlink w:anchor="_ENREF_20" w:tooltip="Kim, 2026 #27" w:history="1">
+      <w:hyperlink w:anchor="_ENREF_22" w:tooltip="Kim, 2026 #27" w:history="1">
         <w:r>
           <w:rPr>
             <w:rStyle w:val="-"/>
@@ -21093,7 +21138,7 @@
         </w:rPr>
         <w:t xml:space="preserve">, </w:t>
       </w:r>
-      <w:hyperlink w:anchor="_ENREF_35" w:tooltip="Sipayung, 2023 #43" w:history="1">
+      <w:hyperlink w:anchor="_ENREF_37" w:tooltip="Sipayung, 2023 #43" w:history="1">
         <w:r>
           <w:rPr>
             <w:rStyle w:val="-"/>
@@ -21229,7 +21274,7 @@
         </w:rPr>
         <w:t>(</w:t>
       </w:r>
-      <w:hyperlink w:anchor="_ENREF_34" w:tooltip="Sharma, 2012 #44" w:history="1">
+      <w:hyperlink w:anchor="_ENREF_36" w:tooltip="Sharma, 2012 #44" w:history="1">
         <w:r>
           <w:rPr>
             <w:rStyle w:val="-"/>
@@ -21243,7 +21288,7 @@
         </w:rPr>
         <w:t xml:space="preserve">, </w:t>
       </w:r>
-      <w:hyperlink w:anchor="_ENREF_35" w:tooltip="Sipayung, 2023 #43" w:history="1">
+      <w:hyperlink w:anchor="_ENREF_37" w:tooltip="Sipayung, 2023 #43" w:history="1">
         <w:r>
           <w:rPr>
             <w:rStyle w:val="-"/>
@@ -21291,7 +21336,7 @@
         </w:rPr>
         <w:t>(</w:t>
       </w:r>
-      <w:hyperlink w:anchor="_ENREF_34" w:tooltip="Sharma, 2012 #44" w:history="1">
+      <w:hyperlink w:anchor="_ENREF_36" w:tooltip="Sharma, 2012 #44" w:history="1">
         <w:r>
           <w:rPr>
             <w:rStyle w:val="-"/>
@@ -21338,7 +21383,7 @@
         </w:rPr>
         <w:t>(</w:t>
       </w:r>
-      <w:hyperlink w:anchor="_ENREF_15" w:tooltip="Heusner, 2021 #46" w:history="1">
+      <w:hyperlink w:anchor="_ENREF_17" w:tooltip="Heusner, 2021 #46" w:history="1">
         <w:r>
           <w:rPr>
             <w:rStyle w:val="-"/>
@@ -22115,7 +22160,7 @@
         </w:rPr>
         <w:t>(</w:t>
       </w:r>
-      <w:hyperlink w:anchor="_ENREF_34" w:tooltip="Sharma, 2012 #44" w:history="1">
+      <w:hyperlink w:anchor="_ENREF_36" w:tooltip="Sharma, 2012 #44" w:history="1">
         <w:r>
           <w:rPr>
             <w:rStyle w:val="-"/>
@@ -22524,7 +22569,7 @@
         </w:rPr>
         <w:t>(</w:t>
       </w:r>
-      <w:hyperlink w:anchor="_ENREF_31" w:tooltip="Russell, 2020 #45" w:history="1">
+      <w:hyperlink w:anchor="_ENREF_33" w:tooltip="Russell, 2020 #45" w:history="1">
         <w:r>
           <w:rPr>
             <w:rStyle w:val="-"/>
@@ -23417,7 +23462,7 @@
         </w:rPr>
         <w:t>(</w:t>
       </w:r>
-      <w:hyperlink w:anchor="_ENREF_34" w:tooltip="Sharma, 2012 #44" w:history="1">
+      <w:hyperlink w:anchor="_ENREF_36" w:tooltip="Sharma, 2012 #44" w:history="1">
         <w:r>
           <w:rPr>
             <w:rStyle w:val="-"/>
@@ -23900,7 +23945,7 @@
         </w:rPr>
         <w:t>(</w:t>
       </w:r>
-      <w:hyperlink w:anchor="_ENREF_34" w:tooltip="Sharma, 2012 #44" w:history="1">
+      <w:hyperlink w:anchor="_ENREF_36" w:tooltip="Sharma, 2012 #44" w:history="1">
         <w:r>
           <w:rPr>
             <w:rStyle w:val="-"/>
@@ -23951,7 +23996,7 @@
       <w:r>
         <w:t xml:space="preserve">. Η </w:t>
       </w:r>
-      <w:hyperlink w:anchor="_ENREF_18" w:tooltip="Issa, 2024 #6" w:history="1">
+      <w:hyperlink w:anchor="_ENREF_20" w:tooltip="Issa, 2024 #6" w:history="1">
         <w:r>
           <w:rPr>
             <w:rStyle w:val="-"/>
@@ -24236,7 +24281,7 @@
         </w:rPr>
         <w:t>(</w:t>
       </w:r>
-      <w:hyperlink w:anchor="_ENREF_6" w:tooltip="Debebe Kebede, 2025 #30" w:history="1">
+      <w:hyperlink w:anchor="_ENREF_7" w:tooltip="Debebe Kebede, 2025 #30" w:history="1">
         <w:r>
           <w:rPr>
             <w:rStyle w:val="-"/>
@@ -24250,7 +24295,7 @@
         </w:rPr>
         <w:t xml:space="preserve">, </w:t>
       </w:r>
-      <w:hyperlink w:anchor="_ENREF_11" w:tooltip="Foead, 2021 #48" w:history="1">
+      <w:hyperlink w:anchor="_ENREF_12" w:tooltip="Foead, 2021 #48" w:history="1">
         <w:r>
           <w:rPr>
             <w:rStyle w:val="-"/>
@@ -24264,7 +24309,7 @@
         </w:rPr>
         <w:t xml:space="preserve">, </w:t>
       </w:r>
-      <w:hyperlink w:anchor="_ENREF_20" w:tooltip="Kim, 2026 #27" w:history="1">
+      <w:hyperlink w:anchor="_ENREF_22" w:tooltip="Kim, 2026 #27" w:history="1">
         <w:r>
           <w:rPr>
             <w:rStyle w:val="-"/>
@@ -24278,7 +24323,7 @@
         </w:rPr>
         <w:t xml:space="preserve">, </w:t>
       </w:r>
-      <w:hyperlink w:anchor="_ENREF_24" w:tooltip="Lawande, 2022 #24" w:history="1">
+      <w:hyperlink w:anchor="_ENREF_26" w:tooltip="Lawande, 2022 #24" w:history="1">
         <w:r>
           <w:rPr>
             <w:rStyle w:val="-"/>
@@ -24415,7 +24460,7 @@
         </w:rPr>
         <w:t>(</w:t>
       </w:r>
-      <w:hyperlink w:anchor="_ENREF_6" w:tooltip="Debebe Kebede, 2025 #30" w:history="1">
+      <w:hyperlink w:anchor="_ENREF_7" w:tooltip="Debebe Kebede, 2025 #30" w:history="1">
         <w:r>
           <w:rPr>
             <w:rStyle w:val="-"/>
@@ -24705,7 +24750,7 @@
       <w:r>
         <w:t xml:space="preserve">μία αρχική μελέτη στην επίδραση του υδρόθειου στην ανθρώπινη φυσιολογία, και πώς αυτό επηρεάζει την διαδικασία της εκκένωσης, από την </w:t>
       </w:r>
-      <w:hyperlink w:anchor="_ENREF_18" w:tooltip="Issa, 2024 #6" w:history="1">
+      <w:hyperlink w:anchor="_ENREF_20" w:tooltip="Issa, 2024 #6" w:history="1">
         <w:r>
           <w:rPr>
             <w:rStyle w:val="-"/>
@@ -24741,7 +24786,60 @@
         <w:t>.</w:t>
       </w:r>
       <w:r>
-        <w:t xml:space="preserve"> Πρόκειται για έναν κατά βάση υπαίθριο χώρο με σχετικά απλές γεωμετρίες για τις κτιριακές εγκαταστάσεις. Στην Εικόνα </w:t>
+        <w:t xml:space="preserve"> Πρόκειται για έναν κατά βάση υπαίθριο χώρο με σχετικά απλές γεωμετρίες για τις κτιριακές εγκαταστάσεις. </w:t>
+      </w:r>
+      <w:r>
+        <w:t xml:space="preserve">Χρησιμοποιώντας </w:t>
+      </w:r>
+      <w:r>
+        <w:t xml:space="preserve">το </w:t>
+      </w:r>
+      <w:r>
+        <w:rPr>
+          <w:highlight w:val="yellow"/>
+        </w:rPr>
+        <w:t>(</w:t>
+      </w:r>
+      <w:r>
+        <w:rPr>
+          <w:highlight w:val="yellow"/>
+          <w:lang w:val="en-US"/>
+        </w:rPr>
+        <w:t>Google</w:t>
+      </w:r>
+      <w:r>
+        <w:rPr>
+          <w:highlight w:val="yellow"/>
+        </w:rPr>
+        <w:t xml:space="preserve"> </w:t>
+      </w:r>
+      <w:r>
+        <w:rPr>
+          <w:highlight w:val="yellow"/>
+          <w:lang w:val="en-US"/>
+        </w:rPr>
+        <w:t>Maps</w:t>
+      </w:r>
+      <w:r>
+        <w:rPr>
+          <w:highlight w:val="yellow"/>
+        </w:rPr>
+        <w:t>)</w:t>
+      </w:r>
+      <w:r>
+        <w:t xml:space="preserve"> υπολογίστηκε ότι ο δρόμος από την βορειοδυτική γωνία μέχρι την νοτιοδυτική γωνία έχει μήκος ~2,500 μέτρα</w:t>
+      </w:r>
+      <w:r>
+        <w:t xml:space="preserve">. </w:t>
+      </w:r>
+      <w:r>
+        <w:t>Για την απλούστευση των υπολογισμών, θεωρήθηκε πως οι εγκαταστάσεις έχουν σχήμα τετραγώνου, με την κάθε πλευρά να έχει μήκος 2,500 μέτρα.</w:t>
+      </w:r>
+      <w:r>
+        <w:t xml:space="preserve"> </w:t>
+      </w:r>
+      <w:r>
+        <w:t xml:space="preserve">Στην Εικόνα </w:t>
       </w:r>
       <w:r>
         <w:rPr>
@@ -25100,7 +25198,7 @@
         </w:rPr>
         <w:t>(</w:t>
       </w:r>
-      <w:hyperlink w:anchor="_ENREF_14" w:tooltip="Hernández-Ibáñez, 2021 #47" w:history="1">
+      <w:hyperlink w:anchor="_ENREF_16" w:tooltip="Hernández-Ibáñez, 2021 #47" w:history="1">
         <w:r>
           <w:rPr>
             <w:rStyle w:val="-"/>
@@ -25174,26 +25272,1872 @@
     </w:p>
     <w:p/>
     <w:p>
-      <w:pPr>
+      <w:r>
+        <w:t xml:space="preserve">Οι διαστάσεις σε </w:t>
+      </w:r>
+      <w:r>
+        <w:rPr>
+          <w:lang w:val="en-US"/>
+        </w:rPr>
+        <w:t>pixels</w:t>
+      </w:r>
+      <w:r>
+        <w:t xml:space="preserve"> του </w:t>
+      </w:r>
+      <w:r>
+        <w:rPr>
+          <w:lang w:val="en-US"/>
+        </w:rPr>
+        <w:t>heightmap</w:t>
+      </w:r>
+      <w:r>
+        <w:t xml:space="preserve"> είναι 983</w:t>
+      </w:r>
+      <w:r>
+        <w:rPr>
+          <w:lang w:val="en-US"/>
+        </w:rPr>
+        <w:t>x</w:t>
+      </w:r>
+      <w:r>
+        <w:t xml:space="preserve">915, ενώ </w:t>
+      </w:r>
+      <w:r>
+        <w:t xml:space="preserve">η βορειοδυτική γωνία απέχει από την νοτιοδυτική </w:t>
+      </w:r>
+      <w:r>
+        <w:t>723.37</w:t>
+      </w:r>
+      <w:r>
+        <w:t xml:space="preserve"> </w:t>
+      </w:r>
+      <w:r>
+        <w:rPr>
+          <w:lang w:val="en-US"/>
+        </w:rPr>
+        <w:t>pixels</w:t>
+      </w:r>
+      <w:r>
+        <w:t xml:space="preserve">, όπως υπολογίστηκε </w:t>
+      </w:r>
+      <w:r>
+        <w:t xml:space="preserve">από τα εργαλεία </w:t>
+      </w:r>
+      <w:r>
+        <w:rPr>
+          <w:lang w:val="en-US"/>
+        </w:rPr>
+        <w:t>Cursor</w:t>
+      </w:r>
+      <w:r>
+        <w:t xml:space="preserve"> </w:t>
+      </w:r>
+      <w:r>
+        <w:fldChar w:fldCharType="begin"/>
+      </w:r>
+      <w:r>
+        <w:instrText xml:space="preserve"> ADDIN EN.CITE &lt;EndNote&gt;&lt;Cite&gt;&lt;Author&gt;Anysphere&lt;/Author&gt;&lt;Year&gt;2026&lt;/Year&gt;&lt;RecNum&gt;70&lt;/RecNum&gt;&lt;DisplayText&gt;(Anysphere, 2026)&lt;/DisplayText&gt;&lt;record&gt;&lt;rec-number&gt;70&lt;/rec-number&gt;&lt;foreign-keys&gt;&lt;key app="EN" db-id="dxs5p5de0w55t0erd255s0tbrzsd22z0ts0d" timestamp="1774873525"&gt;70&lt;/key&gt;&lt;/foreign-keys&gt;&lt;ref-type name="Computer Program"&gt;9&lt;/ref-type&gt;&lt;contributors&gt;&lt;authors&gt;&lt;author&gt;Anysphere, Inc&lt;/author&gt;&lt;/authors&gt;&lt;/contributors&gt;&lt;titles&gt;&lt;title&gt;Cursor AI Code Editor&lt;/title&gt;&lt;/titles&gt;&lt;dates&gt;&lt;year&gt;2026&lt;/year&gt;&lt;/dates&gt;&lt;urls&gt;&lt;related-urls&gt;&lt;url&gt;https://cursor.sh/&lt;/url&gt;&lt;/related-urls&gt;&lt;/urls&gt;&lt;/record&gt;&lt;/Cite&gt;&lt;/EndNote&gt;</w:instrText>
+      </w:r>
+      <w:r>
+        <w:fldChar w:fldCharType="separate"/>
+      </w:r>
+      <w:r>
+        <w:rPr>
+          <w:noProof/>
+        </w:rPr>
+        <w:t>(</w:t>
+      </w:r>
+      <w:hyperlink w:anchor="_ENREF_3" w:tooltip="Anysphere, 2026 #70" w:history="1">
+        <w:r>
+          <w:rPr>
+            <w:rStyle w:val="-"/>
+          </w:rPr>
+          <w:t>Anysphere, 2026</w:t>
+        </w:r>
+      </w:hyperlink>
+      <w:r>
+        <w:rPr>
+          <w:noProof/>
+        </w:rPr>
+        <w:t>)</w:t>
+      </w:r>
+      <w:r>
+        <w:fldChar w:fldCharType="end"/>
+      </w:r>
+      <w:r>
+        <w:t xml:space="preserve"> και </w:t>
+      </w:r>
+      <w:r>
+        <w:rPr>
+          <w:lang w:val="en-US"/>
+        </w:rPr>
+        <w:t>GIMP</w:t>
+      </w:r>
+      <w:r>
+        <w:t xml:space="preserve"> </w:t>
+      </w:r>
+      <w:r>
+        <w:fldChar w:fldCharType="begin"/>
+      </w:r>
+      <w:r>
+        <w:instrText xml:space="preserve"> ADDIN EN.CITE &lt;EndNote&gt;&lt;Cite&gt;&lt;Author&gt;The&lt;/Author&gt;&lt;Year&gt;2026&lt;/Year&gt;&lt;RecNum&gt;69&lt;/RecNum&gt;&lt;Prefix&gt;The Gimp Development &lt;/Prefix&gt;&lt;DisplayText&gt;(The Gimp Development Team, 2026)&lt;/DisplayText&gt;&lt;record&gt;&lt;rec-number&gt;69&lt;/rec-number&gt;&lt;foreign-keys&gt;&lt;key app="EN" db-id="dxs5p5de0w55t0erd255s0tbrzsd22z0ts0d" timestamp="1774873393"&gt;69&lt;/key&gt;&lt;/foreign-keys&gt;&lt;ref-type name="Computer Program"&gt;9&lt;/ref-type&gt;&lt;contributors&gt;&lt;authors&gt;&lt;author&gt;The Gimp Development Team&lt;/author&gt;&lt;/authors&gt;&lt;/contributors&gt;&lt;titles&gt;&lt;title&gt;GNU Image Manipulation Program (GIMP), Version 3.2.2. Community, Free Software (license GPLv3)&lt;/title&gt;&lt;/titles&gt;&lt;dates&gt;&lt;year&gt;2026&lt;/year&gt;&lt;/dates&gt;&lt;urls&gt;&lt;related-urls&gt;&lt;url&gt;https://gimp.org/&lt;/url&gt;&lt;/related-urls&gt;&lt;/urls&gt;&lt;/record&gt;&lt;/Cite&gt;&lt;/EndNote&gt;</w:instrText>
+      </w:r>
+      <w:r>
+        <w:fldChar w:fldCharType="separate"/>
+      </w:r>
+      <w:r>
+        <w:rPr>
+          <w:noProof/>
+        </w:rPr>
+        <w:t>(</w:t>
+      </w:r>
+      <w:hyperlink w:anchor="_ENREF_42" w:tooltip="Team, 2026 #69" w:history="1">
+        <w:r>
+          <w:rPr>
+            <w:rStyle w:val="-"/>
+          </w:rPr>
+          <w:t>The Gimp Development Team, 2026</w:t>
+        </w:r>
+      </w:hyperlink>
+      <w:r>
+        <w:rPr>
+          <w:noProof/>
+        </w:rPr>
+        <w:t>)</w:t>
+      </w:r>
+      <w:r>
+        <w:fldChar w:fldCharType="end"/>
+      </w:r>
+      <w:r>
+        <w:t xml:space="preserve">. </w:t>
+      </w:r>
+      <w:r>
+        <w:t>Όπως έχει ήδη αναφερθεί, το μήκος σε πραγματικά μέτρα αυτής της απόστασης είναι ~2,500 μέτρα, δ</w:t>
+      </w:r>
+      <w:r>
+        <w:t xml:space="preserve">ηλαδή υπάρχει η αναλογία </w:t>
+      </w:r>
+      <m:oMath>
+        <m:r>
+          <m:rPr>
+            <m:sty m:val="p"/>
+          </m:rPr>
+          <w:rPr>
+            <w:rFonts w:ascii="Cambria Math" w:hAnsi="Cambria Math"/>
+          </w:rPr>
+          <m:t>0.289348:1</m:t>
+        </m:r>
+      </m:oMath>
+      <w:r>
+        <w:t xml:space="preserve"> </w:t>
+      </w:r>
+      <w:r>
+        <w:rPr>
+          <w:lang w:val="en-US"/>
+        </w:rPr>
+        <w:t>pixel</w:t>
+      </w:r>
+      <w:r>
+        <w:t xml:space="preserve"> προς μέτρο.</w:t>
+      </w:r>
+      <w:r>
+        <w:t xml:space="preserve"> Λαμβάνοντας υπόψιν την μέση ταχύτητα κίνησης του ατόμου </w:t>
+      </w:r>
+      <m:oMath>
+        <m:r>
+          <m:rPr>
+            <m:sty m:val="p"/>
+          </m:rPr>
+          <w:rPr>
+            <w:rFonts w:ascii="Cambria Math" w:hAnsi="Cambria Math"/>
+          </w:rPr>
+          <m:t>~1.35</m:t>
+        </m:r>
+        <m:f>
+          <m:fPr>
+            <m:type m:val="lin"/>
+            <m:ctrlPr>
+              <w:rPr>
+                <w:rFonts w:ascii="Cambria Math" w:hAnsi="Cambria Math"/>
+                <w:lang w:val="en-US"/>
+              </w:rPr>
+            </m:ctrlPr>
+          </m:fPr>
+          <m:num>
+            <m:r>
+              <m:rPr>
+                <m:sty m:val="p"/>
+              </m:rPr>
+              <w:rPr>
+                <w:rFonts w:ascii="Cambria Math" w:hAnsi="Cambria Math"/>
+                <w:lang w:val="en-US"/>
+              </w:rPr>
+              <m:t>m</m:t>
+            </m:r>
+          </m:num>
+          <m:den>
+            <m:r>
+              <m:rPr>
+                <m:sty m:val="p"/>
+              </m:rPr>
+              <w:rPr>
+                <w:rFonts w:ascii="Cambria Math" w:hAnsi="Cambria Math"/>
+                <w:lang w:val="en-US"/>
+              </w:rPr>
+              <m:t>s</m:t>
+            </m:r>
+          </m:den>
+        </m:f>
+      </m:oMath>
+      <w:r>
+        <w:t>, όπως έχει αναφερθεί στ</w:t>
+      </w:r>
+      <w:r>
+        <w:t>ην ενότητα</w:t>
+      </w:r>
+      <w:r>
+        <w:t xml:space="preserve"> </w:t>
+      </w:r>
+      <w:r>
         <w:rPr>
           <w:highlight w:val="yellow"/>
         </w:rPr>
-      </w:pPr>
+        <w:t>(</w:t>
+      </w:r>
       <w:r>
         <w:rPr>
           <w:highlight w:val="yellow"/>
-        </w:rPr>
-        <w:t>Πώς θα το κάνω;</w:t>
+          <w:lang w:val="en-US"/>
+        </w:rPr>
+        <w:t>subheading</w:t>
       </w:r>
       <w:r>
         <w:rPr>
           <w:highlight w:val="yellow"/>
         </w:rPr>
-        <w:t xml:space="preserve"> Προσομοίωση ανθρώπινης φυσιολογίας και συμπεριφοράς μέσω υπολογιστικών μοντέλων και αλγορίθμων εύρεσης βέλτιστης διαδρομής.</w:t>
-      </w:r>
+        <w:t>)</w:t>
+      </w:r>
+      <w:r>
+        <w:t xml:space="preserve">, ένας </w:t>
+      </w:r>
+      <w:r>
+        <w:t>άνθρωπος θα χρειάζεται ~1,852 δευτερόλεπτα</w:t>
+      </w:r>
+      <w:r>
+        <w:t xml:space="preserve"> (~31 λεπτά)</w:t>
+      </w:r>
+      <w:r>
+        <w:t xml:space="preserve"> για να διασχίσει αυτή την απόσταση.</w:t>
+      </w:r>
+      <w:r>
+        <w:t xml:space="preserve"> Το</w:t>
+      </w:r>
+      <w:r>
+        <w:t xml:space="preserve"> </w:t>
+      </w:r>
+      <w:r>
+        <w:t>διακριτό χρονικό βήμα (</w:t>
+      </w:r>
+      <w:r>
+        <w:rPr>
+          <w:lang w:val="en-US"/>
+        </w:rPr>
+        <w:t>discrete</w:t>
+      </w:r>
+      <w:r>
+        <w:t xml:space="preserve"> </w:t>
+      </w:r>
+      <w:r>
+        <w:rPr>
+          <w:lang w:val="en-US"/>
+        </w:rPr>
+        <w:t>time</w:t>
+      </w:r>
+      <w:r>
+        <w:t xml:space="preserve"> </w:t>
+      </w:r>
+      <w:r>
+        <w:rPr>
+          <w:lang w:val="en-US"/>
+        </w:rPr>
+        <w:t>step</w:t>
+      </w:r>
+      <w:r>
+        <w:t>)</w:t>
+      </w:r>
+      <w:r>
+        <w:t xml:space="preserve">, </w:t>
+      </w:r>
+      <w:r>
+        <w:t>δηλαδή ο χρόνος ανά τον οποίο τρέχουν εκ νέου οι υπολογισμοί της προσομοίωσης</w:t>
+      </w:r>
+      <w:r>
+        <w:t xml:space="preserve"> </w:t>
+      </w:r>
+      <w:r>
+        <w:fldChar w:fldCharType="begin"/>
+      </w:r>
+      <w:r>
+        <w:instrText xml:space="preserve"> ADDIN EN.CITE &lt;EndNote&gt;&lt;Cite&gt;&lt;Author&gt;GoldSim Technology&lt;/Author&gt;&lt;Year&gt;2026&lt;/Year&gt;&lt;RecNum&gt;71&lt;/RecNum&gt;&lt;DisplayText&gt;(GoldSim Technology, 2026)&lt;/DisplayText&gt;&lt;record&gt;&lt;rec-number&gt;71&lt;/rec-number&gt;&lt;foreign-keys&gt;&lt;key app="EN" db-id="dxs5p5de0w55t0erd255s0tbrzsd22z0ts0d" timestamp="1774878616"&gt;71&lt;/key&gt;&lt;/foreign-keys&gt;&lt;ref-type name="Online Multimedia"&gt;48&lt;/ref-type&gt;&lt;contributors&gt;&lt;authors&gt;&lt;author&gt;GoldSim Technology, Group&lt;/author&gt;&lt;/authors&gt;&lt;/contributors&gt;&lt;titles&gt;&lt;title&gt;Lesson 3 - Representing Time in a Dynamic Simulation&lt;/title&gt;&lt;secondary-title&gt;Introduction to GoldSim, Unit 6 - Carrying Out a Dynamic Simulation&lt;/secondary-title&gt;&lt;/titles&gt;&lt;periodical&gt;&lt;full-title&gt;Introduction to GoldSim, Unit 6 - Carrying Out a Dynamic Simulation&lt;/full-title&gt;&lt;/periodical&gt;&lt;dates&gt;&lt;year&gt;2026&lt;/year&gt;&lt;pub-dates&gt;&lt;date&gt;30/03/2026&lt;/date&gt;&lt;/pub-dates&gt;&lt;/dates&gt;&lt;pub-location&gt;Issaquah, WA&lt;/pub-location&gt;&lt;publisher&gt;GoldSim Technology Group&lt;/publisher&gt;&lt;urls&gt;&lt;related-urls&gt;&lt;url&gt;https://www.goldsim.com/Courses/BasicGoldSim/Unit6/Lesson3/&lt;/url&gt;&lt;/related-urls&gt;&lt;/urls&gt;&lt;/record&gt;&lt;/Cite&gt;&lt;/EndNote&gt;</w:instrText>
+      </w:r>
+      <w:r>
+        <w:fldChar w:fldCharType="separate"/>
+      </w:r>
+      <w:r>
+        <w:rPr>
+          <w:noProof/>
+        </w:rPr>
+        <w:t>(</w:t>
+      </w:r>
+      <w:hyperlink w:anchor="_ENREF_13" w:tooltip="GoldSim Technology, 2026 #71" w:history="1">
+        <w:r>
+          <w:rPr>
+            <w:rStyle w:val="-"/>
+          </w:rPr>
+          <w:t>GoldSim Technology, 2026</w:t>
+        </w:r>
+      </w:hyperlink>
+      <w:r>
+        <w:rPr>
+          <w:noProof/>
+        </w:rPr>
+        <w:t>)</w:t>
+      </w:r>
+      <w:r>
+        <w:fldChar w:fldCharType="end"/>
+      </w:r>
+      <w:r>
+        <w:t xml:space="preserve">, </w:t>
+      </w:r>
+      <w:r>
+        <w:t>τίθεται ίσο με τη μονάδα, δηλαδή για κάθε ένα καρέ της προσομοίωσης, περνάει ένα δευτερόλεπτο</w:t>
+      </w:r>
+      <w:r>
+        <w:t xml:space="preserve"> κίνησης των εμπλεκομένων</w:t>
+      </w:r>
+      <w:r>
+        <w:t xml:space="preserve">. </w:t>
+      </w:r>
+      <w:r>
+        <w:t>Αυθαίρετα λαμβάνεται η τιμή 2,500 ως ο συνολικός χρόνος της προσομοίωσης</w:t>
+      </w:r>
+      <w:r>
+        <w:t xml:space="preserve"> (σε δευτερόλεπτα, ~42 λεπτά)</w:t>
+      </w:r>
+      <w:r>
+        <w:t>, προκειμένου να προλάβουν κι</w:t>
+      </w:r>
+      <w:r>
+        <w:t xml:space="preserve"> </w:t>
+      </w:r>
+      <w:r>
+        <w:t>οι</w:t>
+      </w:r>
+      <w:r>
+        <w:t xml:space="preserve"> εκτεθειμένοι «πράκτορες» οι οποίοι θα κινούνται ενδεχομένως με χαμηλότερη ταχύτητα, να φτάσουν ή πλησιάσουν στο σημείο συγκέντρωσής τους.</w:t>
+      </w:r>
+    </w:p>
+    <w:p/>
+    <w:p>
+      <w:r>
+        <w:t xml:space="preserve">Καθώς αυτός ο χρόνος δεν αρκεί για την πλήρη αξιοποίηση των στοιχείων του Πίνακα </w:t>
+      </w:r>
+      <w:r>
+        <w:rPr>
+          <w:highlight w:val="yellow"/>
+        </w:rPr>
+        <w:t>(</w:t>
+      </w:r>
+      <w:r>
+        <w:rPr>
+          <w:highlight w:val="yellow"/>
+          <w:lang w:val="en-US"/>
+        </w:rPr>
+        <w:t>H</w:t>
+      </w:r>
+      <w:r>
+        <w:rPr>
+          <w:highlight w:val="yellow"/>
+        </w:rPr>
+        <w:t>2</w:t>
+      </w:r>
+      <w:r>
+        <w:rPr>
+          <w:highlight w:val="yellow"/>
+          <w:lang w:val="en-US"/>
+        </w:rPr>
+        <w:t>S</w:t>
+      </w:r>
+      <w:r>
+        <w:rPr>
+          <w:highlight w:val="yellow"/>
+        </w:rPr>
+        <w:t xml:space="preserve"> </w:t>
+      </w:r>
+      <w:r>
+        <w:rPr>
+          <w:highlight w:val="yellow"/>
+          <w:lang w:val="en-US"/>
+        </w:rPr>
+        <w:t>AEGL</w:t>
+      </w:r>
+      <w:r>
+        <w:rPr>
+          <w:highlight w:val="yellow"/>
+        </w:rPr>
+        <w:t>)</w:t>
+      </w:r>
+      <w:r>
+        <w:t xml:space="preserve">, </w:t>
+      </w:r>
+      <w:r>
+        <w:t xml:space="preserve">από το </w:t>
+      </w:r>
+      <w:r>
+        <w:rPr>
+          <w:lang w:val="en-US"/>
+        </w:rPr>
+        <w:t>Figure</w:t>
+      </w:r>
+      <w:r>
+        <w:t xml:space="preserve"> 2 </w:t>
+      </w:r>
+      <w:r>
+        <w:t xml:space="preserve">του </w:t>
+      </w:r>
+      <w:hyperlink w:anchor="_ENREF_35" w:tooltip="Shaikh, 2020 #14" w:history="1">
+        <w:r>
+          <w:rPr>
+            <w:rStyle w:val="-"/>
+          </w:rPr>
+          <w:fldChar w:fldCharType="begin"/>
+        </w:r>
+        <w:r>
+          <w:rPr>
+            <w:rStyle w:val="-"/>
+          </w:rPr>
+          <w:instrText xml:space="preserve"> ADDIN EN.CITE &lt;EndNote&gt;&lt;Cite AuthorYear="1"&gt;&lt;Author&gt;Shaikh&lt;/Author&gt;&lt;Year&gt;2020&lt;/Year&gt;&lt;RecNum&gt;14&lt;/RecNum&gt;&lt;DisplayText&gt;Shaikh et al. (2020)&lt;/DisplayText&gt;&lt;record&gt;&lt;rec-number&gt;14&lt;/rec-number&gt;&lt;foreign-keys&gt;&lt;key app="EN" db-id="dxs5p5de0w55t0erd255s0tbrzsd22z0ts0d" timestamp="1766921470"&gt;14&lt;/key&gt;&lt;/foreign-keys&gt;&lt;ref-type name="Journal Article"&gt;17&lt;/ref-type&gt;&lt;contributors&gt;&lt;authors&gt;&lt;author&gt;Shaikh, N.&lt;/author&gt;&lt;author&gt;Kakosimos, K. E.&lt;/author&gt;&lt;author&gt;Adia, N.&lt;/author&gt;&lt;author&gt;Vechot, L.&lt;/author&gt;&lt;/authors&gt;&lt;/contributors&gt;&lt;auth-address&gt;Department of Chemical Engineering and Mary Kay O&amp;apos;Connor Process Safety Center Qatar, Texas A&amp;amp;M University at Qatar, Qatar. Electronic address: nawaydshaikh@tamu.edu.&amp;#xD;Department of Chemical Engineering and Mary Kay O&amp;apos;Connor Process Safety Center Qatar, Texas A&amp;amp;M University at Qatar, Qatar. Electronic address: k.kakosimos@qatar.tamu.edu.&amp;#xD;Department of Chemical Engineering and Mary Kay O&amp;apos;Connor Process Safety Center Qatar, Texas A&amp;amp;M University at Qatar, Qatar.&lt;/auth-address&gt;&lt;titles&gt;&lt;title&gt;Concept and demonstration of a fully coupled and dynamic exposure-response methodology for crowd evacuation numerical modelling in airborne-toxic environments&lt;/title&gt;&lt;secondary-title&gt;J Hazard Mater&lt;/secondary-title&gt;&lt;/titles&gt;&lt;periodical&gt;&lt;full-title&gt;Journal of Hazardous Materials&lt;/full-title&gt;&lt;abbr-1&gt;J Hazard Mater&lt;/abbr-1&gt;&lt;/periodical&gt;&lt;pages&gt;123093&lt;/pages&gt;&lt;volume&gt;399&lt;/volume&gt;&lt;edition&gt;2020/06/13&lt;/edition&gt;&lt;keywords&gt;&lt;keyword&gt;Emergency response&lt;/keyword&gt;&lt;keyword&gt;Evacuation modelling&lt;/keyword&gt;&lt;keyword&gt;Hydrogen sulphide&lt;/keyword&gt;&lt;keyword&gt;Risk&lt;/keyword&gt;&lt;keyword&gt;Social-force&lt;/keyword&gt;&lt;/keywords&gt;&lt;dates&gt;&lt;year&gt;2020&lt;/year&gt;&lt;pub-dates&gt;&lt;date&gt;Nov 15&lt;/date&gt;&lt;/pub-dates&gt;&lt;/dates&gt;&lt;isbn&gt;1873-3336 (Electronic)&amp;#xD;0304-3894 (Linking)&lt;/isbn&gt;&lt;accession-num&gt;32531670&lt;/accession-num&gt;&lt;urls&gt;&lt;related-urls&gt;&lt;url&gt;https://www.ncbi.nlm.nih.gov/pubmed/32531670&lt;/url&gt;&lt;/related-urls&gt;&lt;/urls&gt;&lt;electronic-resource-num&gt;10.1016/j.jhazmat.2020.123093&lt;/electronic-resource-num&gt;&lt;/record&gt;&lt;/Cite&gt;&lt;/EndNote&gt;</w:instrText>
+        </w:r>
+        <w:r>
+          <w:rPr>
+            <w:rStyle w:val="-"/>
+          </w:rPr>
+          <w:fldChar w:fldCharType="separate"/>
+        </w:r>
+        <w:r>
+          <w:rPr>
+            <w:rStyle w:val="-"/>
+          </w:rPr>
+          <w:t>Shaikh et al. (2020)</w:t>
+        </w:r>
+        <w:r>
+          <w:rPr>
+            <w:rStyle w:val="-"/>
+          </w:rPr>
+          <w:fldChar w:fldCharType="end"/>
+        </w:r>
+      </w:hyperlink>
+      <w:r>
+        <w:t xml:space="preserve"> </w:t>
+      </w:r>
+      <w:r>
+        <w:t>χρησιμοποι</w:t>
+      </w:r>
+      <w:r>
+        <w:t>ούνται οι</w:t>
+      </w:r>
+      <w:r>
+        <w:t xml:space="preserve"> Εξ</w:t>
+      </w:r>
+      <w:r>
+        <w:t>ι</w:t>
+      </w:r>
+      <w:r>
+        <w:t>σ</w:t>
+      </w:r>
+      <w:r>
+        <w:t>ώ</w:t>
+      </w:r>
+      <w:r>
+        <w:t>σ</w:t>
+      </w:r>
+      <w:r>
+        <w:t xml:space="preserve">εις </w:t>
+      </w:r>
+      <w:r>
+        <w:t xml:space="preserve"> </w:t>
+      </w:r>
+      <w:r>
+        <w:rPr>
+          <w:highlight w:val="yellow"/>
+        </w:rPr>
+        <w:t>()</w:t>
+      </w:r>
+      <w:r>
+        <w:t xml:space="preserve"> για την δημιουργία του Πίνακα </w:t>
+      </w:r>
+      <w:r>
+        <w:rPr>
+          <w:highlight w:val="yellow"/>
+        </w:rPr>
+        <w:t>()</w:t>
+      </w:r>
+      <w:r>
+        <w:t>:</w:t>
+      </w:r>
+    </w:p>
+    <w:p/>
+    <w:p>
+      <w:pPr>
+        <w:keepNext/>
+      </w:pPr>
+      <m:oMathPara>
+        <m:oMath>
+          <m:eqArr>
+            <m:eqArrPr>
+              <m:maxDist m:val="1"/>
+              <m:ctrlPr>
+                <w:rPr>
+                  <w:rFonts w:ascii="Cambria Math" w:hAnsi="Cambria Math"/>
+                  <w:i/>
+                  <w:lang w:val="en-US"/>
+                </w:rPr>
+              </m:ctrlPr>
+            </m:eqArrPr>
+            <m:e>
+              <m:r>
+                <w:rPr>
+                  <w:rFonts w:ascii="Cambria Math" w:hAnsi="Cambria Math"/>
+                </w:rPr>
+                <m:t>c</m:t>
+              </m:r>
+              <m:r>
+                <w:rPr>
+                  <w:rFonts w:ascii="Cambria Math" w:hAnsi="Cambria Math"/>
+                  <w:lang w:val="en-US"/>
+                </w:rPr>
+                <m:t>(t)</m:t>
+              </m:r>
+              <m:r>
+                <w:rPr>
+                  <w:rFonts w:ascii="Cambria Math" w:hAnsi="Cambria Math"/>
+                </w:rPr>
+                <m:t>=</m:t>
+              </m:r>
+              <m:r>
+                <w:rPr>
+                  <w:rFonts w:ascii="Cambria Math" w:hAnsi="Cambria Math"/>
+                  <w:lang w:val="en-US"/>
+                </w:rPr>
+                <m:t>8</m:t>
+              </m:r>
+              <m:r>
+                <w:rPr>
+                  <w:rFonts w:ascii="Cambria Math" w:hAnsi="Cambria Math"/>
+                </w:rPr>
+                <m:t>.5</m:t>
+              </m:r>
+              <m:r>
+                <w:rPr>
+                  <w:rFonts w:ascii="Cambria Math" w:hAnsi="Cambria Math"/>
+                </w:rPr>
+                <m:t>*</m:t>
+              </m:r>
+              <m:sSup>
+                <m:sSupPr>
+                  <m:ctrlPr>
+                    <w:rPr>
+                      <w:rFonts w:ascii="Cambria Math" w:hAnsi="Cambria Math"/>
+                      <w:i/>
+                      <w:lang w:val="en-US"/>
+                    </w:rPr>
+                  </m:ctrlPr>
+                </m:sSupPr>
+                <m:e>
+                  <m:r>
+                    <w:rPr>
+                      <w:rFonts w:ascii="Cambria Math" w:hAnsi="Cambria Math"/>
+                      <w:lang w:val="en-US"/>
+                    </w:rPr>
+                    <m:t>t</m:t>
+                  </m:r>
+                  <m:ctrlPr>
+                    <w:rPr>
+                      <w:rFonts w:ascii="Cambria Math" w:hAnsi="Cambria Math"/>
+                      <w:i/>
+                    </w:rPr>
+                  </m:ctrlPr>
+                </m:e>
+                <m:sup>
+                  <m:r>
+                    <w:rPr>
+                      <w:rFonts w:ascii="Cambria Math" w:hAnsi="Cambria Math"/>
+                    </w:rPr>
+                    <m:t>-</m:t>
+                  </m:r>
+                  <m:r>
+                    <w:rPr>
+                      <w:rFonts w:ascii="Cambria Math" w:hAnsi="Cambria Math"/>
+                      <w:lang w:val="en-US"/>
+                    </w:rPr>
+                    <m:t>0.227</m:t>
+                  </m:r>
+                </m:sup>
+              </m:sSup>
+              <m:r>
+                <w:rPr>
+                  <w:rFonts w:ascii="Cambria Math" w:hAnsi="Cambria Math"/>
+                </w:rPr>
+                <m:t>#</m:t>
+              </m:r>
+              <m:d>
+                <m:dPr>
+                  <m:ctrlPr>
+                    <w:rPr>
+                      <w:rFonts w:ascii="Cambria Math" w:hAnsi="Cambria Math"/>
+                      <w:i/>
+                      <w:lang w:val="en-US"/>
+                    </w:rPr>
+                  </m:ctrlPr>
+                </m:dPr>
+                <m:e>
+                  <m:r>
+                    <w:rPr>
+                      <w:rFonts w:ascii="Cambria Math" w:hAnsi="Cambria Math"/>
+                      <w:lang w:val="en-US"/>
+                    </w:rPr>
+                    <m:t>4</m:t>
+                  </m:r>
+                </m:e>
+              </m:d>
+              <m:ctrlPr>
+                <w:rPr>
+                  <w:rFonts w:ascii="Cambria Math" w:hAnsi="Cambria Math"/>
+                  <w:i/>
+                </w:rPr>
+              </m:ctrlPr>
+            </m:e>
+          </m:eqArr>
+        </m:oMath>
+      </m:oMathPara>
     </w:p>
     <w:p>
       <w:pPr>
+        <w:keepNext/>
+      </w:pPr>
+      <m:oMathPara>
+        <m:oMath>
+          <m:eqArr>
+            <m:eqArrPr>
+              <m:maxDist m:val="1"/>
+              <m:ctrlPr>
+                <w:rPr>
+                  <w:rFonts w:ascii="Cambria Math" w:hAnsi="Cambria Math"/>
+                  <w:i/>
+                  <w:lang w:val="en-US"/>
+                </w:rPr>
+              </m:ctrlPr>
+            </m:eqArrPr>
+            <m:e>
+              <m:r>
+                <w:rPr>
+                  <w:rFonts w:ascii="Cambria Math" w:hAnsi="Cambria Math"/>
+                </w:rPr>
+                <m:t>c</m:t>
+              </m:r>
+              <m:r>
+                <w:rPr>
+                  <w:rFonts w:ascii="Cambria Math" w:hAnsi="Cambria Math"/>
+                  <w:lang w:val="en-US"/>
+                </w:rPr>
+                <m:t>(t)</m:t>
+              </m:r>
+              <m:r>
+                <w:rPr>
+                  <w:rFonts w:ascii="Cambria Math" w:hAnsi="Cambria Math"/>
+                </w:rPr>
+                <m:t>=</m:t>
+              </m:r>
+              <m:r>
+                <w:rPr>
+                  <w:rFonts w:ascii="Cambria Math" w:hAnsi="Cambria Math"/>
+                  <w:lang w:val="en-US"/>
+                </w:rPr>
+                <m:t>6</m:t>
+              </m:r>
+              <m:r>
+                <w:rPr>
+                  <w:rFonts w:ascii="Cambria Math" w:hAnsi="Cambria Math"/>
+                </w:rPr>
+                <m:t>00</m:t>
+              </m:r>
+              <m:r>
+                <w:rPr>
+                  <w:rFonts w:ascii="Cambria Math" w:hAnsi="Cambria Math"/>
+                </w:rPr>
+                <m:t>*</m:t>
+              </m:r>
+              <m:sSup>
+                <m:sSupPr>
+                  <m:ctrlPr>
+                    <w:rPr>
+                      <w:rFonts w:ascii="Cambria Math" w:hAnsi="Cambria Math"/>
+                      <w:i/>
+                      <w:lang w:val="en-US"/>
+                    </w:rPr>
+                  </m:ctrlPr>
+                </m:sSupPr>
+                <m:e>
+                  <m:r>
+                    <w:rPr>
+                      <w:rFonts w:ascii="Cambria Math" w:hAnsi="Cambria Math"/>
+                      <w:lang w:val="en-US"/>
+                    </w:rPr>
+                    <m:t>t</m:t>
+                  </m:r>
+                  <m:ctrlPr>
+                    <w:rPr>
+                      <w:rFonts w:ascii="Cambria Math" w:hAnsi="Cambria Math"/>
+                      <w:i/>
+                    </w:rPr>
+                  </m:ctrlPr>
+                </m:e>
+                <m:sup>
+                  <m:r>
+                    <w:rPr>
+                      <w:rFonts w:ascii="Cambria Math" w:hAnsi="Cambria Math"/>
+                    </w:rPr>
+                    <m:t>-</m:t>
+                  </m:r>
+                  <m:r>
+                    <w:rPr>
+                      <w:rFonts w:ascii="Cambria Math" w:hAnsi="Cambria Math"/>
+                      <w:lang w:val="en-US"/>
+                    </w:rPr>
+                    <m:t>0.227</m:t>
+                  </m:r>
+                </m:sup>
+              </m:sSup>
+              <m:r>
+                <w:rPr>
+                  <w:rFonts w:ascii="Cambria Math" w:hAnsi="Cambria Math"/>
+                </w:rPr>
+                <m:t>#</m:t>
+              </m:r>
+              <m:d>
+                <m:dPr>
+                  <m:ctrlPr>
+                    <w:rPr>
+                      <w:rFonts w:ascii="Cambria Math" w:hAnsi="Cambria Math"/>
+                      <w:i/>
+                      <w:lang w:val="en-US"/>
+                    </w:rPr>
+                  </m:ctrlPr>
+                </m:dPr>
+                <m:e>
+                  <m:r>
+                    <w:rPr>
+                      <w:rFonts w:ascii="Cambria Math" w:hAnsi="Cambria Math"/>
+                      <w:lang w:val="en-US"/>
+                    </w:rPr>
+                    <m:t>5</m:t>
+                  </m:r>
+                </m:e>
+              </m:d>
+              <m:ctrlPr>
+                <w:rPr>
+                  <w:rFonts w:ascii="Cambria Math" w:hAnsi="Cambria Math"/>
+                  <w:i/>
+                </w:rPr>
+              </m:ctrlPr>
+            </m:e>
+          </m:eqArr>
+        </m:oMath>
+      </m:oMathPara>
+    </w:p>
+    <w:p>
+      <w:pPr>
+        <w:keepNext/>
+      </w:pPr>
+      <m:oMathPara>
+        <m:oMath>
+          <m:eqArr>
+            <m:eqArrPr>
+              <m:maxDist m:val="1"/>
+              <m:ctrlPr>
+                <w:rPr>
+                  <w:rFonts w:ascii="Cambria Math" w:hAnsi="Cambria Math"/>
+                  <w:i/>
+                  <w:lang w:val="en-US"/>
+                </w:rPr>
+              </m:ctrlPr>
+            </m:eqArrPr>
+            <m:e>
+              <m:r>
+                <w:rPr>
+                  <w:rFonts w:ascii="Cambria Math" w:hAnsi="Cambria Math"/>
+                </w:rPr>
+                <m:t>c</m:t>
+              </m:r>
+              <m:r>
+                <w:rPr>
+                  <w:rFonts w:ascii="Cambria Math" w:hAnsi="Cambria Math"/>
+                  <w:lang w:val="en-US"/>
+                </w:rPr>
+                <m:t>(t)</m:t>
+              </m:r>
+              <m:r>
+                <w:rPr>
+                  <w:rFonts w:ascii="Cambria Math" w:hAnsi="Cambria Math"/>
+                </w:rPr>
+                <m:t>=</m:t>
+              </m:r>
+              <m:r>
+                <w:rPr>
+                  <w:rFonts w:ascii="Cambria Math" w:hAnsi="Cambria Math"/>
+                  <w:lang w:val="en-US"/>
+                </w:rPr>
+                <m:t>8</m:t>
+              </m:r>
+              <m:r>
+                <w:rPr>
+                  <w:rFonts w:ascii="Cambria Math" w:hAnsi="Cambria Math"/>
+                </w:rPr>
+                <m:t>50</m:t>
+              </m:r>
+              <m:r>
+                <w:rPr>
+                  <w:rFonts w:ascii="Cambria Math" w:hAnsi="Cambria Math"/>
+                </w:rPr>
+                <m:t>*</m:t>
+              </m:r>
+              <m:sSup>
+                <m:sSupPr>
+                  <m:ctrlPr>
+                    <w:rPr>
+                      <w:rFonts w:ascii="Cambria Math" w:hAnsi="Cambria Math"/>
+                      <w:i/>
+                      <w:lang w:val="en-US"/>
+                    </w:rPr>
+                  </m:ctrlPr>
+                </m:sSupPr>
+                <m:e>
+                  <m:r>
+                    <w:rPr>
+                      <w:rFonts w:ascii="Cambria Math" w:hAnsi="Cambria Math"/>
+                      <w:lang w:val="en-US"/>
+                    </w:rPr>
+                    <m:t>t</m:t>
+                  </m:r>
+                  <m:ctrlPr>
+                    <w:rPr>
+                      <w:rFonts w:ascii="Cambria Math" w:hAnsi="Cambria Math"/>
+                      <w:i/>
+                    </w:rPr>
+                  </m:ctrlPr>
+                </m:e>
+                <m:sup>
+                  <m:r>
+                    <w:rPr>
+                      <w:rFonts w:ascii="Cambria Math" w:hAnsi="Cambria Math"/>
+                    </w:rPr>
+                    <m:t>-</m:t>
+                  </m:r>
+                  <m:r>
+                    <w:rPr>
+                      <w:rFonts w:ascii="Cambria Math" w:hAnsi="Cambria Math"/>
+                      <w:lang w:val="en-US"/>
+                    </w:rPr>
+                    <m:t>0.227</m:t>
+                  </m:r>
+                </m:sup>
+              </m:sSup>
+              <m:r>
+                <w:rPr>
+                  <w:rFonts w:ascii="Cambria Math" w:hAnsi="Cambria Math"/>
+                </w:rPr>
+                <m:t>#</m:t>
+              </m:r>
+              <m:d>
+                <m:dPr>
+                  <m:ctrlPr>
+                    <w:rPr>
+                      <w:rFonts w:ascii="Cambria Math" w:hAnsi="Cambria Math"/>
+                      <w:i/>
+                      <w:lang w:val="en-US"/>
+                    </w:rPr>
+                  </m:ctrlPr>
+                </m:dPr>
+                <m:e>
+                  <m:r>
+                    <w:rPr>
+                      <w:rFonts w:ascii="Cambria Math" w:hAnsi="Cambria Math"/>
+                      <w:lang w:val="en-US"/>
+                    </w:rPr>
+                    <m:t>6</m:t>
+                  </m:r>
+                </m:e>
+              </m:d>
+              <m:ctrlPr>
+                <w:rPr>
+                  <w:rFonts w:ascii="Cambria Math" w:hAnsi="Cambria Math"/>
+                  <w:i/>
+                </w:rPr>
+              </m:ctrlPr>
+            </m:e>
+          </m:eqArr>
+        </m:oMath>
+      </m:oMathPara>
+    </w:p>
+    <w:p>
+      <w:pPr>
+        <w:keepNext/>
+      </w:pPr>
+      <m:oMathPara>
+        <m:oMath>
+          <m:eqArr>
+            <m:eqArrPr>
+              <m:maxDist m:val="1"/>
+              <m:ctrlPr>
+                <w:rPr>
+                  <w:rFonts w:ascii="Cambria Math" w:hAnsi="Cambria Math"/>
+                  <w:i/>
+                  <w:lang w:val="en-US"/>
+                </w:rPr>
+              </m:ctrlPr>
+            </m:eqArrPr>
+            <m:e>
+              <m:r>
+                <w:rPr>
+                  <w:rFonts w:ascii="Cambria Math" w:hAnsi="Cambria Math"/>
+                </w:rPr>
+                <m:t>c</m:t>
+              </m:r>
+              <m:r>
+                <w:rPr>
+                  <w:rFonts w:ascii="Cambria Math" w:hAnsi="Cambria Math"/>
+                  <w:lang w:val="en-US"/>
+                </w:rPr>
+                <m:t>(t)</m:t>
+              </m:r>
+              <m:r>
+                <w:rPr>
+                  <w:rFonts w:ascii="Cambria Math" w:hAnsi="Cambria Math"/>
+                </w:rPr>
+                <m:t>=</m:t>
+              </m:r>
+              <m:r>
+                <w:rPr>
+                  <w:rFonts w:ascii="Cambria Math" w:hAnsi="Cambria Math"/>
+                  <w:lang w:val="en-US"/>
+                </w:rPr>
+                <m:t>1</m:t>
+              </m:r>
+              <m:r>
+                <w:rPr>
+                  <w:rFonts w:ascii="Cambria Math" w:hAnsi="Cambria Math"/>
+                </w:rPr>
+                <m:t>800*</m:t>
+              </m:r>
+              <m:sSup>
+                <m:sSupPr>
+                  <m:ctrlPr>
+                    <w:rPr>
+                      <w:rFonts w:ascii="Cambria Math" w:hAnsi="Cambria Math"/>
+                      <w:i/>
+                      <w:lang w:val="en-US"/>
+                    </w:rPr>
+                  </m:ctrlPr>
+                </m:sSupPr>
+                <m:e>
+                  <m:r>
+                    <w:rPr>
+                      <w:rFonts w:ascii="Cambria Math" w:hAnsi="Cambria Math"/>
+                      <w:lang w:val="en-US"/>
+                    </w:rPr>
+                    <m:t>t</m:t>
+                  </m:r>
+                  <m:ctrlPr>
+                    <w:rPr>
+                      <w:rFonts w:ascii="Cambria Math" w:hAnsi="Cambria Math"/>
+                      <w:i/>
+                    </w:rPr>
+                  </m:ctrlPr>
+                </m:e>
+                <m:sup>
+                  <m:r>
+                    <w:rPr>
+                      <w:rFonts w:ascii="Cambria Math" w:hAnsi="Cambria Math"/>
+                    </w:rPr>
+                    <m:t>-</m:t>
+                  </m:r>
+                  <m:r>
+                    <w:rPr>
+                      <w:rFonts w:ascii="Cambria Math" w:hAnsi="Cambria Math"/>
+                      <w:lang w:val="en-US"/>
+                    </w:rPr>
+                    <m:t>0.227</m:t>
+                  </m:r>
+                </m:sup>
+              </m:sSup>
+              <m:r>
+                <w:rPr>
+                  <w:rFonts w:ascii="Cambria Math" w:hAnsi="Cambria Math"/>
+                </w:rPr>
+                <m:t>#</m:t>
+              </m:r>
+              <m:d>
+                <m:dPr>
+                  <m:ctrlPr>
+                    <w:rPr>
+                      <w:rFonts w:ascii="Cambria Math" w:hAnsi="Cambria Math"/>
+                      <w:i/>
+                      <w:lang w:val="en-US"/>
+                    </w:rPr>
+                  </m:ctrlPr>
+                </m:dPr>
+                <m:e>
+                  <m:r>
+                    <w:rPr>
+                      <w:rFonts w:ascii="Cambria Math" w:hAnsi="Cambria Math"/>
+                      <w:lang w:val="en-US"/>
+                    </w:rPr>
+                    <m:t>7</m:t>
+                  </m:r>
+                </m:e>
+              </m:d>
+              <m:ctrlPr>
+                <w:rPr>
+                  <w:rFonts w:ascii="Cambria Math" w:hAnsi="Cambria Math"/>
+                  <w:i/>
+                </w:rPr>
+              </m:ctrlPr>
+            </m:e>
+          </m:eqArr>
+        </m:oMath>
+      </m:oMathPara>
+    </w:p>
+    <w:p/>
+    <w:p/>
+    <w:tbl>
+      <w:tblPr>
+        <w:tblStyle w:val="a8"/>
+        <w:tblW w:w="0" w:type="auto"/>
+        <w:tblLook w:val="04A0" w:firstRow="1" w:lastRow="0" w:firstColumn="1" w:lastColumn="0" w:noHBand="0" w:noVBand="1"/>
+      </w:tblPr>
+      <w:tblGrid>
+        <w:gridCol w:w="1810"/>
+        <w:gridCol w:w="1657"/>
+        <w:gridCol w:w="1657"/>
+        <w:gridCol w:w="1657"/>
+        <w:gridCol w:w="1685"/>
+        <w:gridCol w:w="1604"/>
+      </w:tblGrid>
+      <w:tr>
+        <w:tc>
+          <w:tcPr>
+            <w:tcW w:w="1810" w:type="dxa"/>
+          </w:tcPr>
+          <w:p>
+            <w:pPr>
+              <w:rPr>
+                <w:lang w:val="en-US"/>
+              </w:rPr>
+            </w:pPr>
+            <w:r>
+              <w:rPr>
+                <w:lang w:val="en-US"/>
+              </w:rPr>
+              <w:t xml:space="preserve">Exposure time </w:t>
+            </w:r>
+          </w:p>
+        </w:tc>
+        <w:tc>
+          <w:tcPr>
+            <w:tcW w:w="1657" w:type="dxa"/>
+            <w:vAlign w:val="center"/>
+          </w:tcPr>
+          <w:p>
+            <w:pPr>
+              <w:jc w:val="center"/>
+              <w:rPr>
+                <w:lang w:val="en-US"/>
+              </w:rPr>
+            </w:pPr>
+            <w:r>
+              <w:t>5</w:t>
+            </w:r>
+            <w:r>
+              <w:rPr>
+                <w:lang w:val="en-US"/>
+              </w:rPr>
+              <w:t xml:space="preserve"> mins</w:t>
+            </w:r>
+          </w:p>
+        </w:tc>
+        <w:tc>
+          <w:tcPr>
+            <w:tcW w:w="1657" w:type="dxa"/>
+            <w:vAlign w:val="center"/>
+          </w:tcPr>
+          <w:p>
+            <w:pPr>
+              <w:jc w:val="center"/>
+              <w:rPr>
+                <w:lang w:val="en-US"/>
+              </w:rPr>
+            </w:pPr>
+            <w:r>
+              <w:t>8.33</w:t>
+            </w:r>
+            <w:r>
+              <w:rPr>
+                <w:lang w:val="en-US"/>
+              </w:rPr>
+              <w:t xml:space="preserve"> mins</w:t>
+            </w:r>
+          </w:p>
+        </w:tc>
+        <w:tc>
+          <w:tcPr>
+            <w:tcW w:w="1657" w:type="dxa"/>
+            <w:vAlign w:val="center"/>
+          </w:tcPr>
+          <w:p>
+            <w:pPr>
+              <w:jc w:val="center"/>
+              <w:rPr>
+                <w:lang w:val="en-US"/>
+              </w:rPr>
+            </w:pPr>
+            <w:r>
+              <w:t xml:space="preserve">16.67 </w:t>
+            </w:r>
+            <w:r>
+              <w:rPr>
+                <w:lang w:val="en-US"/>
+              </w:rPr>
+              <w:t>mins</w:t>
+            </w:r>
+          </w:p>
+        </w:tc>
+        <w:tc>
+          <w:tcPr>
+            <w:tcW w:w="1685" w:type="dxa"/>
+            <w:vAlign w:val="center"/>
+          </w:tcPr>
+          <w:p>
+            <w:pPr>
+              <w:jc w:val="center"/>
+              <w:rPr>
+                <w:lang w:val="en-US"/>
+              </w:rPr>
+            </w:pPr>
+            <w:r>
+              <w:rPr>
+                <w:lang w:val="en-US"/>
+              </w:rPr>
+              <w:t>25 mins</w:t>
+            </w:r>
+          </w:p>
+        </w:tc>
+        <w:tc>
+          <w:tcPr>
+            <w:tcW w:w="1604" w:type="dxa"/>
+            <w:vAlign w:val="center"/>
+          </w:tcPr>
+          <w:p>
+            <w:pPr>
+              <w:jc w:val="center"/>
+              <w:rPr>
+                <w:lang w:val="en-US"/>
+              </w:rPr>
+            </w:pPr>
+            <w:r>
+              <w:rPr>
+                <w:lang w:val="en-US"/>
+              </w:rPr>
+              <w:t>50 mins</w:t>
+            </w:r>
+          </w:p>
+        </w:tc>
+      </w:tr>
+      <w:tr>
+        <w:tc>
+          <w:tcPr>
+            <w:tcW w:w="10070" w:type="dxa"/>
+            <w:gridSpan w:val="6"/>
+            <w:vAlign w:val="center"/>
+          </w:tcPr>
+          <w:p>
+            <w:pPr>
+              <w:jc w:val="left"/>
+              <w:rPr>
+                <w:lang w:val="en-US"/>
+              </w:rPr>
+            </w:pPr>
+            <w:r>
+              <w:rPr>
+                <w:lang w:val="en-US"/>
+              </w:rPr>
+              <w:t>ppm</w:t>
+            </w:r>
+          </w:p>
+        </w:tc>
+      </w:tr>
+      <w:tr>
+        <w:tc>
+          <w:tcPr>
+            <w:tcW w:w="1810" w:type="dxa"/>
+          </w:tcPr>
+          <w:p>
+            <w:pPr>
+              <w:rPr>
+                <w:lang w:val="en-US"/>
+              </w:rPr>
+            </w:pPr>
+            <w:r>
+              <w:rPr>
+                <w:lang w:val="en-US"/>
+              </w:rPr>
+              <w:t>AEGL 1</w:t>
+            </w:r>
+          </w:p>
+        </w:tc>
+        <w:tc>
+          <w:tcPr>
+            <w:tcW w:w="1657" w:type="dxa"/>
+            <w:vAlign w:val="center"/>
+          </w:tcPr>
+          <w:p>
+            <w:pPr>
+              <w:jc w:val="center"/>
+              <w:rPr>
+                <w:rFonts w:cs="Times New Roman"/>
+                <w:szCs w:val="24"/>
+                <w:lang w:val="en-US"/>
+              </w:rPr>
+            </w:pPr>
+            <w:r>
+              <w:rPr>
+                <w:rFonts w:cs="Times New Roman"/>
+                <w:color w:val="000000"/>
+              </w:rPr>
+              <w:t>2</w:t>
+            </w:r>
+            <w:r>
+              <w:rPr>
+                <w:rFonts w:cs="Times New Roman"/>
+                <w:color w:val="000000"/>
+              </w:rPr>
+              <w:t>.</w:t>
+            </w:r>
+            <w:r>
+              <w:rPr>
+                <w:rFonts w:cs="Times New Roman"/>
+                <w:color w:val="000000"/>
+              </w:rPr>
+              <w:t>33</w:t>
+            </w:r>
+          </w:p>
+        </w:tc>
+        <w:tc>
+          <w:tcPr>
+            <w:tcW w:w="1657" w:type="dxa"/>
+            <w:vAlign w:val="center"/>
+          </w:tcPr>
+          <w:p>
+            <w:pPr>
+              <w:jc w:val="center"/>
+              <w:rPr>
+                <w:rFonts w:cs="Times New Roman"/>
+                <w:szCs w:val="24"/>
+                <w:lang w:val="en-US"/>
+              </w:rPr>
+            </w:pPr>
+            <w:r>
+              <w:rPr>
+                <w:rFonts w:cs="Times New Roman"/>
+                <w:color w:val="000000"/>
+              </w:rPr>
+              <w:t>2</w:t>
+            </w:r>
+            <w:r>
+              <w:rPr>
+                <w:rFonts w:cs="Times New Roman"/>
+                <w:color w:val="000000"/>
+              </w:rPr>
+              <w:t>.</w:t>
+            </w:r>
+            <w:r>
+              <w:rPr>
+                <w:rFonts w:cs="Times New Roman"/>
+                <w:color w:val="000000"/>
+              </w:rPr>
+              <w:t>07</w:t>
+            </w:r>
+          </w:p>
+        </w:tc>
+        <w:tc>
+          <w:tcPr>
+            <w:tcW w:w="1657" w:type="dxa"/>
+            <w:vAlign w:val="center"/>
+          </w:tcPr>
+          <w:p>
+            <w:pPr>
+              <w:jc w:val="center"/>
+              <w:rPr>
+                <w:rFonts w:cs="Times New Roman"/>
+                <w:szCs w:val="24"/>
+                <w:lang w:val="en-US"/>
+              </w:rPr>
+            </w:pPr>
+            <w:r>
+              <w:rPr>
+                <w:rFonts w:cs="Times New Roman"/>
+                <w:color w:val="000000"/>
+              </w:rPr>
+              <w:t>1</w:t>
+            </w:r>
+            <w:r>
+              <w:rPr>
+                <w:rFonts w:cs="Times New Roman"/>
+                <w:color w:val="000000"/>
+              </w:rPr>
+              <w:t>.</w:t>
+            </w:r>
+            <w:r>
+              <w:rPr>
+                <w:rFonts w:cs="Times New Roman"/>
+                <w:color w:val="000000"/>
+              </w:rPr>
+              <w:t>77</w:t>
+            </w:r>
+          </w:p>
+        </w:tc>
+        <w:tc>
+          <w:tcPr>
+            <w:tcW w:w="1685" w:type="dxa"/>
+            <w:vAlign w:val="center"/>
+          </w:tcPr>
+          <w:p>
+            <w:pPr>
+              <w:jc w:val="center"/>
+              <w:rPr>
+                <w:rFonts w:cs="Times New Roman"/>
+                <w:szCs w:val="24"/>
+                <w:lang w:val="en-US"/>
+              </w:rPr>
+            </w:pPr>
+            <w:r>
+              <w:rPr>
+                <w:rFonts w:cs="Times New Roman"/>
+                <w:color w:val="000000"/>
+              </w:rPr>
+              <w:t>1</w:t>
+            </w:r>
+            <w:r>
+              <w:rPr>
+                <w:rFonts w:cs="Times New Roman"/>
+                <w:color w:val="000000"/>
+              </w:rPr>
+              <w:t>.</w:t>
+            </w:r>
+            <w:r>
+              <w:rPr>
+                <w:rFonts w:cs="Times New Roman"/>
+                <w:color w:val="000000"/>
+              </w:rPr>
+              <w:t>62</w:t>
+            </w:r>
+          </w:p>
+        </w:tc>
+        <w:tc>
+          <w:tcPr>
+            <w:tcW w:w="1604" w:type="dxa"/>
+            <w:vAlign w:val="center"/>
+          </w:tcPr>
+          <w:p>
+            <w:pPr>
+              <w:jc w:val="center"/>
+              <w:rPr>
+                <w:rFonts w:cs="Times New Roman"/>
+                <w:szCs w:val="24"/>
+                <w:lang w:val="en-US"/>
+              </w:rPr>
+            </w:pPr>
+            <w:r>
+              <w:rPr>
+                <w:rFonts w:cs="Times New Roman"/>
+                <w:color w:val="000000"/>
+              </w:rPr>
+              <w:t>1</w:t>
+            </w:r>
+            <w:r>
+              <w:rPr>
+                <w:rFonts w:cs="Times New Roman"/>
+                <w:color w:val="000000"/>
+              </w:rPr>
+              <w:t>.</w:t>
+            </w:r>
+            <w:r>
+              <w:rPr>
+                <w:rFonts w:cs="Times New Roman"/>
+                <w:color w:val="000000"/>
+              </w:rPr>
+              <w:t>38</w:t>
+            </w:r>
+          </w:p>
+        </w:tc>
+      </w:tr>
+      <w:tr>
+        <w:tc>
+          <w:tcPr>
+            <w:tcW w:w="1810" w:type="dxa"/>
+          </w:tcPr>
+          <w:p>
+            <w:pPr>
+              <w:rPr>
+                <w:lang w:val="en-US"/>
+              </w:rPr>
+            </w:pPr>
+            <w:r>
+              <w:rPr>
+                <w:lang w:val="en-US"/>
+              </w:rPr>
+              <w:t>AEGL 2</w:t>
+            </w:r>
+          </w:p>
+        </w:tc>
+        <w:tc>
+          <w:tcPr>
+            <w:tcW w:w="1657" w:type="dxa"/>
+            <w:vAlign w:val="center"/>
+          </w:tcPr>
+          <w:p>
+            <w:pPr>
+              <w:jc w:val="center"/>
+              <w:rPr>
+                <w:rFonts w:cs="Times New Roman"/>
+                <w:szCs w:val="24"/>
+                <w:lang w:val="en-US"/>
+              </w:rPr>
+            </w:pPr>
+            <w:r>
+              <w:rPr>
+                <w:rFonts w:cs="Times New Roman"/>
+                <w:color w:val="000000"/>
+              </w:rPr>
+              <w:t>164</w:t>
+            </w:r>
+            <w:r>
+              <w:rPr>
+                <w:rFonts w:cs="Times New Roman"/>
+                <w:color w:val="000000"/>
+              </w:rPr>
+              <w:t>.</w:t>
+            </w:r>
+            <w:r>
+              <w:rPr>
+                <w:rFonts w:cs="Times New Roman"/>
+                <w:color w:val="000000"/>
+              </w:rPr>
+              <w:t>38</w:t>
+            </w:r>
+          </w:p>
+        </w:tc>
+        <w:tc>
+          <w:tcPr>
+            <w:tcW w:w="1657" w:type="dxa"/>
+            <w:vAlign w:val="center"/>
+          </w:tcPr>
+          <w:p>
+            <w:pPr>
+              <w:jc w:val="center"/>
+              <w:rPr>
+                <w:rFonts w:cs="Times New Roman"/>
+                <w:szCs w:val="24"/>
+                <w:lang w:val="en-US"/>
+              </w:rPr>
+            </w:pPr>
+            <w:r>
+              <w:rPr>
+                <w:rFonts w:cs="Times New Roman"/>
+                <w:color w:val="000000"/>
+              </w:rPr>
+              <w:t>146</w:t>
+            </w:r>
+            <w:r>
+              <w:rPr>
+                <w:rFonts w:cs="Times New Roman"/>
+                <w:color w:val="000000"/>
+              </w:rPr>
+              <w:t>.</w:t>
+            </w:r>
+            <w:r>
+              <w:rPr>
+                <w:rFonts w:cs="Times New Roman"/>
+                <w:color w:val="000000"/>
+              </w:rPr>
+              <w:t>38</w:t>
+            </w:r>
+          </w:p>
+        </w:tc>
+        <w:tc>
+          <w:tcPr>
+            <w:tcW w:w="1657" w:type="dxa"/>
+            <w:vAlign w:val="center"/>
+          </w:tcPr>
+          <w:p>
+            <w:pPr>
+              <w:jc w:val="center"/>
+              <w:rPr>
+                <w:rFonts w:cs="Times New Roman"/>
+                <w:szCs w:val="24"/>
+                <w:lang w:val="en-US"/>
+              </w:rPr>
+            </w:pPr>
+            <w:r>
+              <w:rPr>
+                <w:rFonts w:cs="Times New Roman"/>
+                <w:color w:val="000000"/>
+              </w:rPr>
+              <w:t>125</w:t>
+            </w:r>
+            <w:r>
+              <w:rPr>
+                <w:rFonts w:cs="Times New Roman"/>
+                <w:color w:val="000000"/>
+              </w:rPr>
+              <w:t>.</w:t>
+            </w:r>
+            <w:r>
+              <w:rPr>
+                <w:rFonts w:cs="Times New Roman"/>
+                <w:color w:val="000000"/>
+              </w:rPr>
+              <w:t>07</w:t>
+            </w:r>
+          </w:p>
+        </w:tc>
+        <w:tc>
+          <w:tcPr>
+            <w:tcW w:w="1685" w:type="dxa"/>
+            <w:vAlign w:val="center"/>
+          </w:tcPr>
+          <w:p>
+            <w:pPr>
+              <w:jc w:val="center"/>
+              <w:rPr>
+                <w:rFonts w:cs="Times New Roman"/>
+                <w:szCs w:val="24"/>
+                <w:lang w:val="en-US"/>
+              </w:rPr>
+            </w:pPr>
+            <w:r>
+              <w:rPr>
+                <w:rFonts w:cs="Times New Roman"/>
+                <w:color w:val="000000"/>
+              </w:rPr>
+              <w:t>114</w:t>
+            </w:r>
+            <w:r>
+              <w:rPr>
+                <w:rFonts w:cs="Times New Roman"/>
+                <w:color w:val="000000"/>
+              </w:rPr>
+              <w:t>.</w:t>
+            </w:r>
+            <w:r>
+              <w:rPr>
+                <w:rFonts w:cs="Times New Roman"/>
+                <w:color w:val="000000"/>
+              </w:rPr>
+              <w:t>07</w:t>
+            </w:r>
+          </w:p>
+        </w:tc>
+        <w:tc>
+          <w:tcPr>
+            <w:tcW w:w="1604" w:type="dxa"/>
+            <w:vAlign w:val="center"/>
+          </w:tcPr>
+          <w:p>
+            <w:pPr>
+              <w:jc w:val="center"/>
+              <w:rPr>
+                <w:rFonts w:cs="Times New Roman"/>
+                <w:szCs w:val="24"/>
+                <w:lang w:val="en-US"/>
+              </w:rPr>
+            </w:pPr>
+            <w:r>
+              <w:rPr>
+                <w:rFonts w:cs="Times New Roman"/>
+                <w:color w:val="000000"/>
+              </w:rPr>
+              <w:t>97</w:t>
+            </w:r>
+            <w:r>
+              <w:rPr>
+                <w:rFonts w:cs="Times New Roman"/>
+                <w:color w:val="000000"/>
+              </w:rPr>
+              <w:t>.</w:t>
+            </w:r>
+            <w:r>
+              <w:rPr>
+                <w:rFonts w:cs="Times New Roman"/>
+                <w:color w:val="000000"/>
+              </w:rPr>
+              <w:t>46</w:t>
+            </w:r>
+          </w:p>
+        </w:tc>
+      </w:tr>
+      <w:tr>
+        <w:tc>
+          <w:tcPr>
+            <w:tcW w:w="1810" w:type="dxa"/>
+          </w:tcPr>
+          <w:p>
+            <w:pPr>
+              <w:rPr>
+                <w:lang w:val="en-US"/>
+              </w:rPr>
+            </w:pPr>
+            <w:r>
+              <w:rPr>
+                <w:lang w:val="en-US"/>
+              </w:rPr>
+              <w:t>AEGL 3</w:t>
+            </w:r>
+          </w:p>
+        </w:tc>
+        <w:tc>
+          <w:tcPr>
+            <w:tcW w:w="1657" w:type="dxa"/>
+            <w:vAlign w:val="center"/>
+          </w:tcPr>
+          <w:p>
+            <w:pPr>
+              <w:jc w:val="center"/>
+              <w:rPr>
+                <w:rFonts w:cs="Times New Roman"/>
+                <w:szCs w:val="24"/>
+                <w:lang w:val="en-US"/>
+              </w:rPr>
+            </w:pPr>
+            <w:r>
+              <w:rPr>
+                <w:rFonts w:cs="Times New Roman"/>
+                <w:color w:val="000000"/>
+              </w:rPr>
+              <w:t>232</w:t>
+            </w:r>
+            <w:r>
+              <w:rPr>
+                <w:rFonts w:cs="Times New Roman"/>
+                <w:color w:val="000000"/>
+              </w:rPr>
+              <w:t>.</w:t>
+            </w:r>
+            <w:r>
+              <w:rPr>
+                <w:rFonts w:cs="Times New Roman"/>
+                <w:color w:val="000000"/>
+              </w:rPr>
+              <w:t>87</w:t>
+            </w:r>
+          </w:p>
+        </w:tc>
+        <w:tc>
+          <w:tcPr>
+            <w:tcW w:w="1657" w:type="dxa"/>
+            <w:vAlign w:val="center"/>
+          </w:tcPr>
+          <w:p>
+            <w:pPr>
+              <w:jc w:val="center"/>
+              <w:rPr>
+                <w:rFonts w:cs="Times New Roman"/>
+                <w:szCs w:val="24"/>
+                <w:lang w:val="en-US"/>
+              </w:rPr>
+            </w:pPr>
+            <w:r>
+              <w:rPr>
+                <w:rFonts w:cs="Times New Roman"/>
+                <w:color w:val="000000"/>
+              </w:rPr>
+              <w:t>207</w:t>
+            </w:r>
+            <w:r>
+              <w:rPr>
+                <w:rFonts w:cs="Times New Roman"/>
+                <w:color w:val="000000"/>
+              </w:rPr>
+              <w:t>.</w:t>
+            </w:r>
+            <w:r>
+              <w:rPr>
+                <w:rFonts w:cs="Times New Roman"/>
+                <w:color w:val="000000"/>
+              </w:rPr>
+              <w:t>37</w:t>
+            </w:r>
+          </w:p>
+        </w:tc>
+        <w:tc>
+          <w:tcPr>
+            <w:tcW w:w="1657" w:type="dxa"/>
+            <w:vAlign w:val="center"/>
+          </w:tcPr>
+          <w:p>
+            <w:pPr>
+              <w:jc w:val="center"/>
+              <w:rPr>
+                <w:rFonts w:cs="Times New Roman"/>
+                <w:szCs w:val="24"/>
+                <w:lang w:val="en-US"/>
+              </w:rPr>
+            </w:pPr>
+            <w:r>
+              <w:rPr>
+                <w:rFonts w:cs="Times New Roman"/>
+                <w:color w:val="000000"/>
+              </w:rPr>
+              <w:t>177</w:t>
+            </w:r>
+            <w:r>
+              <w:rPr>
+                <w:rFonts w:cs="Times New Roman"/>
+                <w:color w:val="000000"/>
+              </w:rPr>
+              <w:t>.</w:t>
+            </w:r>
+            <w:r>
+              <w:rPr>
+                <w:rFonts w:cs="Times New Roman"/>
+                <w:color w:val="000000"/>
+              </w:rPr>
+              <w:t>18</w:t>
+            </w:r>
+          </w:p>
+        </w:tc>
+        <w:tc>
+          <w:tcPr>
+            <w:tcW w:w="1685" w:type="dxa"/>
+            <w:vAlign w:val="center"/>
+          </w:tcPr>
+          <w:p>
+            <w:pPr>
+              <w:jc w:val="center"/>
+              <w:rPr>
+                <w:rFonts w:cs="Times New Roman"/>
+                <w:szCs w:val="24"/>
+                <w:lang w:val="en-US"/>
+              </w:rPr>
+            </w:pPr>
+            <w:r>
+              <w:rPr>
+                <w:rFonts w:cs="Times New Roman"/>
+                <w:color w:val="000000"/>
+              </w:rPr>
+              <w:t>161</w:t>
+            </w:r>
+            <w:r>
+              <w:rPr>
+                <w:rFonts w:cs="Times New Roman"/>
+                <w:color w:val="000000"/>
+              </w:rPr>
+              <w:t>.</w:t>
+            </w:r>
+            <w:r>
+              <w:rPr>
+                <w:rFonts w:cs="Times New Roman"/>
+                <w:color w:val="000000"/>
+              </w:rPr>
+              <w:t>60</w:t>
+            </w:r>
+          </w:p>
+        </w:tc>
+        <w:tc>
+          <w:tcPr>
+            <w:tcW w:w="1604" w:type="dxa"/>
+            <w:vAlign w:val="center"/>
+          </w:tcPr>
+          <w:p>
+            <w:pPr>
+              <w:jc w:val="center"/>
+              <w:rPr>
+                <w:rFonts w:cs="Times New Roman"/>
+                <w:szCs w:val="24"/>
+                <w:lang w:val="en-US"/>
+              </w:rPr>
+            </w:pPr>
+            <w:r>
+              <w:rPr>
+                <w:rFonts w:cs="Times New Roman"/>
+                <w:color w:val="000000"/>
+              </w:rPr>
+              <w:t>138</w:t>
+            </w:r>
+            <w:r>
+              <w:rPr>
+                <w:rFonts w:cs="Times New Roman"/>
+                <w:color w:val="000000"/>
+              </w:rPr>
+              <w:t>.</w:t>
+            </w:r>
+            <w:r>
+              <w:rPr>
+                <w:rFonts w:cs="Times New Roman"/>
+                <w:color w:val="000000"/>
+              </w:rPr>
+              <w:t>07</w:t>
+            </w:r>
+          </w:p>
+        </w:tc>
+      </w:tr>
+    </w:tbl>
+    <w:p/>
+    <w:p>
+      <w:pPr>
+        <w:rPr>
+          <w:lang w:val="en-US"/>
+        </w:rPr>
+      </w:pPr>
+    </w:p>
+    <w:p>
+      <w:pPr>
+        <w:rPr>
+          <w:lang w:val="en-US"/>
+        </w:rPr>
+      </w:pPr>
+    </w:p>
+    <w:p/>
+    <w:p>
+      <w:pPr>
+        <w:rPr>
+          <w:highlight w:val="yellow"/>
+        </w:rPr>
+      </w:pPr>
+      <w:r>
+        <w:rPr>
+          <w:highlight w:val="yellow"/>
+        </w:rPr>
+        <w:t>Πώς θα το κάνω;</w:t>
+      </w:r>
+      <w:r>
+        <w:rPr>
+          <w:highlight w:val="yellow"/>
+        </w:rPr>
+        <w:t xml:space="preserve"> Προσομοίωση ανθρώπινης φυσιολογίας και συμπεριφοράς μέσω υπολογιστικών μοντέλων και αλγορίθμων εύρεσης βέλτιστης διαδρομής.</w:t>
+      </w:r>
+    </w:p>
+    <w:p>
+      <w:pPr>
         <w:rPr>
           <w:strike/>
         </w:rPr>
@@ -25298,7 +27242,14 @@
         <w:rPr>
           <w:strike/>
         </w:rPr>
-        <w:t xml:space="preserve"> ένα μοντέλο προσομοίωσης της ανθρώπινης </w:t>
+        <w:t xml:space="preserve"> </w:t>
+      </w:r>
+      <w:r>
+        <w:rPr>
+          <w:strike/>
+        </w:rPr>
+        <w:lastRenderedPageBreak/>
+        <w:t xml:space="preserve">ένα μοντέλο προσομοίωσης της ανθρώπινης </w:t>
       </w:r>
       <w:r>
         <w:rPr>
@@ -25520,7 +27471,7 @@
         </w:rPr>
         <w:t>(</w:t>
       </w:r>
-      <w:hyperlink w:anchor="_ENREF_4" w:tooltip="Bezanson, 2012 #49" w:history="1">
+      <w:hyperlink w:anchor="_ENREF_5" w:tooltip="Bezanson, 2012 #49" w:history="1">
         <w:r>
           <w:rPr>
             <w:rStyle w:val="-"/>
@@ -25541,6 +27492,8 @@
         <w:t>.</w:t>
       </w:r>
     </w:p>
+    <w:p/>
+    <w:p/>
     <w:p>
       <w:pPr>
         <w:rPr>
@@ -25697,31 +27650,7 @@
       </w:pPr>
       <w:bookmarkStart w:id="33" w:name="_ENREF_3"/>
       <w:r>
-        <w:rPr>
-          <w:lang w:val="de-DE"/>
-        </w:rPr>
-        <w:t xml:space="preserve">BARAŃSKI, M. &amp; HAZNAR-BARAŃSKA, A. 2021. </w:t>
-      </w:r>
-      <w:r>
-        <w:t xml:space="preserve">Evacuation and its Types – Revision of the Definition and Classification. </w:t>
-      </w:r>
-      <w:r>
-        <w:rPr>
-          <w:i/>
-        </w:rPr>
-        <w:t>Safety &amp; Fire Technology,</w:t>
-      </w:r>
-      <w:r>
-        <w:t xml:space="preserve"> 58</w:t>
-      </w:r>
-      <w:r>
-        <w:rPr>
-          <w:b/>
-        </w:rPr>
-        <w:t>,</w:t>
-      </w:r>
-      <w:r>
-        <w:t xml:space="preserve"> 204-222.</w:t>
+        <w:t>ANYSPHERE, I. 2026. Cursor AI Code Editor.</w:t>
       </w:r>
       <w:bookmarkEnd w:id="33"/>
     </w:p>
@@ -25732,16 +27661,31 @@
       </w:pPr>
       <w:bookmarkStart w:id="34" w:name="_ENREF_4"/>
       <w:r>
-        <w:t xml:space="preserve">BEZANSON, J., KARPINSKI, S., SHAH, V. &amp; EDELMAN, A. 2012. </w:t>
+        <w:rPr>
+          <w:lang w:val="de-DE"/>
+        </w:rPr>
+        <w:t xml:space="preserve">BARAŃSKI, M. &amp; HAZNAR-BARAŃSKA, A. 2021. </w:t>
+      </w:r>
+      <w:r>
+        <w:t xml:space="preserve">Evacuation and its Types – Revision of the Definition and Classification. </w:t>
       </w:r>
       <w:r>
         <w:rPr>
           <w:i/>
         </w:rPr>
-        <w:t>Julia: A Fast Dynamic Language for Technical Computing</w:t>
-      </w:r>
-      <w:r>
-        <w:t>.</w:t>
+        <w:t>Safety &amp; Fire Technology,</w:t>
+      </w:r>
+      <w:r>
+        <w:t xml:space="preserve"> 58</w:t>
+      </w:r>
+      <w:r>
+        <w:rPr>
+          <w:b/>
+        </w:rPr>
+        <w:t>,</w:t>
+      </w:r>
+      <w:r>
+        <w:t xml:space="preserve"> 204-222.</w:t>
       </w:r>
       <w:bookmarkEnd w:id="34"/>
     </w:p>
@@ -25752,7 +27696,16 @@
       </w:pPr>
       <w:bookmarkStart w:id="35" w:name="_ENREF_5"/>
       <w:r>
-        <w:t>BORIS, J. P. &amp; PATNAIK, G. 2014. Acute Exposure Guideline Levels (AEGLs) for Time Varying Toxic Plumes. Washington, DC: Naval Research Laboratory, Laboratories for Computational Physics and Fluid Dynamics.</w:t>
+        <w:t xml:space="preserve">BEZANSON, J., KARPINSKI, S., SHAH, V. &amp; EDELMAN, A. 2012. </w:t>
+      </w:r>
+      <w:r>
+        <w:rPr>
+          <w:i/>
+        </w:rPr>
+        <w:t>Julia: A Fast Dynamic Language for Technical Computing</w:t>
+      </w:r>
+      <w:r>
+        <w:t>.</w:t>
       </w:r>
       <w:bookmarkEnd w:id="35"/>
     </w:p>
@@ -25763,19 +27716,7 @@
       </w:pPr>
       <w:bookmarkStart w:id="36" w:name="_ENREF_6"/>
       <w:r>
-        <w:rPr>
-          <w:lang w:val="de-DE"/>
-        </w:rPr>
-        <w:t xml:space="preserve">DEBEBE KEBEDE, B. &amp; FRIEDRICH, J. 2025. </w:t>
-      </w:r>
-      <w:r>
-        <w:rPr>
-          <w:i/>
-        </w:rPr>
-        <w:t>Comparison of Pathfinding Algorithms in Dynamic and Congested Environments : A Comparative Analysis of D* Lite and LPA*.</w:t>
-      </w:r>
-      <w:r>
-        <w:t xml:space="preserve"> Independent thesis Basic level (degree of Bachelor) Student thesis.</w:t>
+        <w:t>BORIS, J. P. &amp; PATNAIK, G. 2014. Acute Exposure Guideline Levels (AEGLs) for Time Varying Toxic Plumes. Washington, DC: Naval Research Laboratory, Laboratories for Computational Physics and Fluid Dynamics.</w:t>
       </w:r>
       <w:bookmarkEnd w:id="36"/>
     </w:p>
@@ -25786,25 +27727,19 @@
       </w:pPr>
       <w:bookmarkStart w:id="37" w:name="_ENREF_7"/>
       <w:r>
-        <w:t xml:space="preserve">DUBOIS, G. D. A. A. R. V. A. T. C. 2022. Agents.jl: a performant and feature-full agent-based modeling software of minimal code complexity. </w:t>
+        <w:rPr>
+          <w:lang w:val="de-DE"/>
+        </w:rPr>
+        <w:t xml:space="preserve">DEBEBE KEBEDE, B. &amp; FRIEDRICH, J. 2025. </w:t>
       </w:r>
       <w:r>
         <w:rPr>
           <w:i/>
         </w:rPr>
-        <w:t>SIMULATION,</w:t>
-      </w:r>
-      <w:r>
-        <w:t xml:space="preserve"> 0</w:t>
-      </w:r>
-      <w:r>
-        <w:rPr>
-          <w:b/>
-        </w:rPr>
-        <w:t>,</w:t>
-      </w:r>
-      <w:r>
-        <w:t xml:space="preserve"> 003754972110688.</w:t>
+        <w:t>Comparison of Pathfinding Algorithms in Dynamic and Congested Environments : A Comparative Analysis of D* Lite and LPA*.</w:t>
+      </w:r>
+      <w:r>
+        <w:t xml:space="preserve"> Independent thesis Basic level (degree of Bachelor) Student thesis.</w:t>
       </w:r>
       <w:bookmarkEnd w:id="37"/>
     </w:p>
@@ -25815,6 +27750,35 @@
       </w:pPr>
       <w:bookmarkStart w:id="38" w:name="_ENREF_8"/>
       <w:r>
+        <w:t xml:space="preserve">DUBOIS, G. D. A. A. R. V. A. T. C. 2022. Agents.jl: a performant and feature-full agent-based modeling software of minimal code complexity. </w:t>
+      </w:r>
+      <w:r>
+        <w:rPr>
+          <w:i/>
+        </w:rPr>
+        <w:t>SIMULATION,</w:t>
+      </w:r>
+      <w:r>
+        <w:t xml:space="preserve"> 0</w:t>
+      </w:r>
+      <w:r>
+        <w:rPr>
+          <w:b/>
+        </w:rPr>
+        <w:t>,</w:t>
+      </w:r>
+      <w:r>
+        <w:t xml:space="preserve"> 003754972110688.</w:t>
+      </w:r>
+      <w:bookmarkEnd w:id="38"/>
+    </w:p>
+    <w:p>
+      <w:pPr>
+        <w:pStyle w:val="EndNoteBibliography"/>
+        <w:ind w:left="720" w:hanging="720"/>
+      </w:pPr>
+      <w:bookmarkStart w:id="39" w:name="_ENREF_9"/>
+      <w:r>
         <w:t xml:space="preserve">EPA, U. 2025. </w:t>
       </w:r>
       <w:r>
@@ -25837,26 +27801,6 @@
       <w:r>
         <w:t xml:space="preserve"> [Accessed 23/03/2026 2026].</w:t>
       </w:r>
-      <w:bookmarkEnd w:id="38"/>
-    </w:p>
-    <w:p>
-      <w:pPr>
-        <w:pStyle w:val="EndNoteBibliography"/>
-        <w:ind w:left="720" w:hanging="720"/>
-      </w:pPr>
-      <w:bookmarkStart w:id="39" w:name="_ENREF_9"/>
-      <w:r>
-        <w:t xml:space="preserve">EPSTEIN, J. M. &amp; AXTELL, R. 1996. </w:t>
-      </w:r>
-      <w:r>
-        <w:rPr>
-          <w:i/>
-        </w:rPr>
-        <w:t>Growing Artificial Societies: Social Science from the Bottom Up</w:t>
-      </w:r>
-      <w:r>
-        <w:t>, The MIT Press.</w:t>
-      </w:r>
       <w:bookmarkEnd w:id="39"/>
     </w:p>
     <w:p>
@@ -25866,7 +27810,16 @@
       </w:pPr>
       <w:bookmarkStart w:id="40" w:name="_ENREF_10"/>
       <w:r>
-        <w:t>FITRIANIE, S. &amp; ROTHKRANTZ, L. J. M. Dynamic Routing during Disaster Events.  International Conference on Information Systems for Crisis Response and Management, 2015.</w:t>
+        <w:t xml:space="preserve">EPSTEIN, J. M. &amp; AXTELL, R. 1996. </w:t>
+      </w:r>
+      <w:r>
+        <w:rPr>
+          <w:i/>
+        </w:rPr>
+        <w:t>Growing Artificial Societies: Social Science from the Bottom Up</w:t>
+      </w:r>
+      <w:r>
+        <w:t>, The MIT Press.</w:t>
       </w:r>
       <w:bookmarkEnd w:id="40"/>
     </w:p>
@@ -25877,25 +27830,7 @@
       </w:pPr>
       <w:bookmarkStart w:id="41" w:name="_ENREF_11"/>
       <w:r>
-        <w:t xml:space="preserve">FOEAD, D., GHIFARI, A., KUSUMA, M., HANAFIAH, N. &amp; GUNAWAN, E. 2021. A Systematic Literature Review of A* Pathfinding. </w:t>
-      </w:r>
-      <w:r>
-        <w:rPr>
-          <w:i/>
-        </w:rPr>
-        <w:t>Procedia Computer Science,</w:t>
-      </w:r>
-      <w:r>
-        <w:t xml:space="preserve"> 179</w:t>
-      </w:r>
-      <w:r>
-        <w:rPr>
-          <w:b/>
-        </w:rPr>
-        <w:t>,</w:t>
-      </w:r>
-      <w:r>
-        <w:t xml:space="preserve"> 507-514.</w:t>
+        <w:t>FITRIANIE, S. &amp; ROTHKRANTZ, L. J. M. Dynamic Routing during Disaster Events.  International Conference on Information Systems for Crisis Response and Management, 2015.</w:t>
       </w:r>
       <w:bookmarkEnd w:id="41"/>
     </w:p>
@@ -25906,16 +27841,16 @@
       </w:pPr>
       <w:bookmarkStart w:id="42" w:name="_ENREF_12"/>
       <w:r>
-        <w:t xml:space="preserve">GWYNNE, S. M. V., HULSE, L. M. &amp; KINSEY, M. J. 2016. Guidance for the Model Developer on Representing Human Behavior in Egress Models. </w:t>
+        <w:t xml:space="preserve">FOEAD, D., GHIFARI, A., KUSUMA, M., HANAFIAH, N. &amp; GUNAWAN, E. 2021. A Systematic Literature Review of A* Pathfinding. </w:t>
       </w:r>
       <w:r>
         <w:rPr>
           <w:i/>
         </w:rPr>
-        <w:t>Fire Technology,</w:t>
-      </w:r>
-      <w:r>
-        <w:t xml:space="preserve"> 52</w:t>
+        <w:t>Procedia Computer Science,</w:t>
+      </w:r>
+      <w:r>
+        <w:t xml:space="preserve"> 179</w:t>
       </w:r>
       <w:r>
         <w:rPr>
@@ -25924,7 +27859,7 @@
         <w:t>,</w:t>
       </w:r>
       <w:r>
-        <w:t xml:space="preserve"> 775-800.</w:t>
+        <w:t xml:space="preserve"> 507-514.</w:t>
       </w:r>
       <w:bookmarkEnd w:id="42"/>
     </w:p>
@@ -25935,25 +27870,16 @@
       </w:pPr>
       <w:bookmarkStart w:id="43" w:name="_ENREF_13"/>
       <w:r>
-        <w:t xml:space="preserve">HE, Z., SHEN, K., LAN, M. &amp; WENG, W. 2024. An evacuation path planning method for multi-hazard accidents in chemical industries based on risk perception. </w:t>
+        <w:t xml:space="preserve">GOLDSIM TECHNOLOGY, G. 2026. Lesson 3 - Representing Time in a Dynamic Simulation. </w:t>
       </w:r>
       <w:r>
         <w:rPr>
           <w:i/>
         </w:rPr>
-        <w:t>Reliability Engineering &amp; System Safety,</w:t>
-      </w:r>
-      <w:r>
-        <w:t xml:space="preserve"> 244</w:t>
-      </w:r>
-      <w:r>
-        <w:rPr>
-          <w:b/>
-        </w:rPr>
-        <w:t>,</w:t>
-      </w:r>
-      <w:r>
-        <w:t xml:space="preserve"> 109912.</w:t>
+        <w:t>Introduction to GoldSim, Unit 6 - Carrying Out a Dynamic Simulation.</w:t>
+      </w:r>
+      <w:r>
+        <w:t xml:space="preserve"> Issaquah, WA: GoldSim Technology Group.</w:t>
       </w:r>
       <w:bookmarkEnd w:id="43"/>
     </w:p>
@@ -25964,16 +27890,25 @@
       </w:pPr>
       <w:bookmarkStart w:id="44" w:name="_ENREF_14"/>
       <w:r>
-        <w:t xml:space="preserve">HERNÁNDEZ-IBÁÑEZ, L. A. &amp; BARNECHE-NAYA, V. Heightmap Examiner. A Descriptive Tool for Education in Digital Cartography. </w:t>
+        <w:t xml:space="preserve">GWYNNE, S. M. V., HULSE, L. M. &amp; KINSEY, M. J. 2016. Guidance for the Model Developer on Representing Human Behavior in Egress Models. </w:t>
       </w:r>
       <w:r>
         <w:rPr>
           <w:i/>
         </w:rPr>
-        <w:t xml:space="preserve">In: </w:t>
-      </w:r>
-      <w:r>
-        <w:t>STEPHANIDIS, C., HARRIS, D., LI, W.-C., SCHMORROW, D. D., FIDOPIASTIS, C. M., ANTONA, M., GAO, Q., ZHOU, J., ZAPHIRIS, P., IOANNOU, A., SOTTILARE, R. A., SCHWARZ, J. &amp; RAUTERBERG, M., eds. HCI International 2021 - Late Breaking Papers: Cognition, Inclusion, Learning, and Culture, 2021// 2021 Cham. Springer International Publishing, 406-416.</w:t>
+        <w:t>Fire Technology,</w:t>
+      </w:r>
+      <w:r>
+        <w:t xml:space="preserve"> 52</w:t>
+      </w:r>
+      <w:r>
+        <w:rPr>
+          <w:b/>
+        </w:rPr>
+        <w:t>,</w:t>
+      </w:r>
+      <w:r>
+        <w:t xml:space="preserve"> 775-800.</w:t>
       </w:r>
       <w:bookmarkEnd w:id="44"/>
     </w:p>
@@ -25984,16 +27919,16 @@
       </w:pPr>
       <w:bookmarkStart w:id="45" w:name="_ENREF_15"/>
       <w:r>
-        <w:t xml:space="preserve">HEUSNER, M., KELLER, T. &amp; HELMERT, M. 2021. Understanding the Search Behaviour of Greedy Best-First Search. </w:t>
+        <w:t xml:space="preserve">HE, Z., SHEN, K., LAN, M. &amp; WENG, W. 2024. An evacuation path planning method for multi-hazard accidents in chemical industries based on risk perception. </w:t>
       </w:r>
       <w:r>
         <w:rPr>
           <w:i/>
         </w:rPr>
-        <w:t>Proceedings of the International Symposium on Combinatorial Search,</w:t>
-      </w:r>
-      <w:r>
-        <w:t xml:space="preserve"> 8</w:t>
+        <w:t>Reliability Engineering &amp; System Safety,</w:t>
+      </w:r>
+      <w:r>
+        <w:t xml:space="preserve"> 244</w:t>
       </w:r>
       <w:r>
         <w:rPr>
@@ -26002,7 +27937,7 @@
         <w:t>,</w:t>
       </w:r>
       <w:r>
-        <w:t xml:space="preserve"> 47-55.</w:t>
+        <w:t xml:space="preserve"> 109912.</w:t>
       </w:r>
       <w:bookmarkEnd w:id="45"/>
     </w:p>
@@ -26013,25 +27948,16 @@
       </w:pPr>
       <w:bookmarkStart w:id="46" w:name="_ENREF_16"/>
       <w:r>
-        <w:t xml:space="preserve">HU, X., CHEN, L., TANG, B., CAO, D. &amp; HE, H. 2018. Dynamic path planning for autonomous driving on various roads with avoidance of static and moving obstacles. </w:t>
+        <w:t xml:space="preserve">HERNÁNDEZ-IBÁÑEZ, L. A. &amp; BARNECHE-NAYA, V. Heightmap Examiner. A Descriptive Tool for Education in Digital Cartography. </w:t>
       </w:r>
       <w:r>
         <w:rPr>
           <w:i/>
         </w:rPr>
-        <w:t>Mechanical Systems and Signal Processing,</w:t>
-      </w:r>
-      <w:r>
-        <w:t xml:space="preserve"> 100</w:t>
-      </w:r>
-      <w:r>
-        <w:rPr>
-          <w:b/>
-        </w:rPr>
-        <w:t>,</w:t>
-      </w:r>
-      <w:r>
-        <w:t xml:space="preserve"> 482-500.</w:t>
+        <w:t xml:space="preserve">In: </w:t>
+      </w:r>
+      <w:r>
+        <w:t>STEPHANIDIS, C., HARRIS, D., LI, W.-C., SCHMORROW, D. D., FIDOPIASTIS, C. M., ANTONA, M., GAO, Q., ZHOU, J., ZAPHIRIS, P., IOANNOU, A., SOTTILARE, R. A., SCHWARZ, J. &amp; RAUTERBERG, M., eds. HCI International 2021 - Late Breaking Papers: Cognition, Inclusion, Learning, and Culture, 2021// 2021 Cham. Springer International Publishing, 406-416.</w:t>
       </w:r>
       <w:bookmarkEnd w:id="46"/>
     </w:p>
@@ -26042,7 +27968,16 @@
       </w:pPr>
       <w:bookmarkStart w:id="47" w:name="_ENREF_17"/>
       <w:r>
-        <w:t>IBRAHIM, N. &amp; HASSAN, F. H. 2023. The Integration of Agent-based Model and Social Force Model: Realistic Pedestrian Simulation. 13</w:t>
+        <w:t xml:space="preserve">HEUSNER, M., KELLER, T. &amp; HELMERT, M. 2021. Understanding the Search Behaviour of Greedy Best-First Search. </w:t>
+      </w:r>
+      <w:r>
+        <w:rPr>
+          <w:i/>
+        </w:rPr>
+        <w:t>Proceedings of the International Symposium on Combinatorial Search,</w:t>
+      </w:r>
+      <w:r>
+        <w:t xml:space="preserve"> 8</w:t>
       </w:r>
       <w:r>
         <w:rPr>
@@ -26051,7 +27986,7 @@
         <w:t>,</w:t>
       </w:r>
       <w:r>
-        <w:t xml:space="preserve"> 317-331.</w:t>
+        <w:t xml:space="preserve"> 47-55.</w:t>
       </w:r>
       <w:bookmarkEnd w:id="47"/>
     </w:p>
@@ -26062,44 +27997,51 @@
       </w:pPr>
       <w:bookmarkStart w:id="48" w:name="_ENREF_18"/>
       <w:r>
-        <w:t xml:space="preserve">ISSA, N. T. S. 2024. </w:t>
+        <w:t xml:space="preserve">HU, X., CHEN, L., TANG, B., CAO, D. &amp; HE, H. 2018. Dynamic path planning for autonomous driving on various roads with avoidance of static and moving obstacles. </w:t>
       </w:r>
       <w:r>
         <w:rPr>
           <w:i/>
         </w:rPr>
-        <w:t>Modeling and Simulation of Outdoor Crowd Evacuation Upon Exposure to Toxic Hydrogen Sulfide Gas.</w:t>
-      </w:r>
-      <w:r>
-        <w:t xml:space="preserve"> Master's thesis, Texas A&amp;M University.</w:t>
+        <w:t>Mechanical Systems and Signal Processing,</w:t>
+      </w:r>
+      <w:r>
+        <w:t xml:space="preserve"> 100</w:t>
+      </w:r>
+      <w:r>
+        <w:rPr>
+          <w:b/>
+        </w:rPr>
+        <w:t>,</w:t>
+      </w:r>
+      <w:r>
+        <w:t xml:space="preserve"> 482-500.</w:t>
       </w:r>
       <w:bookmarkEnd w:id="48"/>
     </w:p>
     <w:p>
       <w:pPr>
         <w:pStyle w:val="EndNoteBibliography"/>
-        <w:tabs>
-          <w:tab w:val="right" w:pos="10080"/>
-        </w:tabs>
         <w:ind w:left="720" w:hanging="720"/>
       </w:pPr>
       <w:bookmarkStart w:id="49" w:name="_ENREF_19"/>
       <w:r>
-        <w:t xml:space="preserve">KAY, F. P. M. &amp; KÄHLER, K. N. 2023. Bhopal Disaster. </w:t>
-      </w:r>
-      <w:r>
-        <w:rPr>
-          <w:i/>
-        </w:rPr>
-        <w:t>Research Starters: Science.</w:t>
-      </w:r>
-      <w:r>
-        <w:t xml:space="preserve"> EBSCO.</w:t>
+        <w:t xml:space="preserve">IBRAHIM, N. &amp; HASSAN, F. H. 2023. The Integration of Agent-based Model and Social Force Model: </w:t>
+      </w:r>
+      <w:r>
+        <w:lastRenderedPageBreak/>
+        <w:t>Realistic Pedestrian Simulation. 13</w:t>
+      </w:r>
+      <w:r>
+        <w:rPr>
+          <w:b/>
+        </w:rPr>
+        <w:t>,</w:t>
+      </w:r>
+      <w:r>
+        <w:t xml:space="preserve"> 317-331.</w:t>
       </w:r>
       <w:bookmarkEnd w:id="49"/>
-      <w:r>
-        <w:tab/>
-      </w:r>
     </w:p>
     <w:p>
       <w:pPr>
@@ -26108,17 +28050,16 @@
       </w:pPr>
       <w:bookmarkStart w:id="50" w:name="_ENREF_20"/>
       <w:r>
-        <w:lastRenderedPageBreak/>
-        <w:t>KIM, H., HAAM, S., YOO, M. &amp; SONG, W. S. 2026. Algorithmic Evaluation of Fire Evacuation Efficiency Under Dynamic Crowd and Smoke Conditions. 9</w:t>
-      </w:r>
-      <w:r>
-        <w:rPr>
-          <w:b/>
-        </w:rPr>
-        <w:t>,</w:t>
-      </w:r>
-      <w:r>
-        <w:t xml:space="preserve"> 32.</w:t>
+        <w:t xml:space="preserve">ISSA, N. T. S. 2024. </w:t>
+      </w:r>
+      <w:r>
+        <w:rPr>
+          <w:i/>
+        </w:rPr>
+        <w:t>Modeling and Simulation of Outdoor Crowd Evacuation Upon Exposure to Toxic Hydrogen Sulfide Gas.</w:t>
+      </w:r>
+      <w:r>
+        <w:t xml:space="preserve"> Master's thesis, Texas A&amp;M University.</w:t>
       </w:r>
       <w:bookmarkEnd w:id="50"/>
     </w:p>
@@ -26126,39 +28067,19 @@
       <w:pPr>
         <w:pStyle w:val="EndNoteBibliography"/>
         <w:ind w:left="720" w:hanging="720"/>
-        <w:rPr>
-          <w:lang w:val="de-DE"/>
-        </w:rPr>
       </w:pPr>
       <w:bookmarkStart w:id="51" w:name="_ENREF_21"/>
       <w:r>
-        <w:t xml:space="preserve">KL¼GL, F. &amp; BAZZAN, A. 2012. Agent-Based Modeling and Simulation. </w:t>
+        <w:t xml:space="preserve">KAY, F. P. M. &amp; KÄHLER, K. N. 2023. Bhopal Disaster. </w:t>
       </w:r>
       <w:r>
         <w:rPr>
           <w:i/>
-          <w:lang w:val="de-DE"/>
-        </w:rPr>
-        <w:t>AI Magazine,</w:t>
-      </w:r>
-      <w:r>
-        <w:rPr>
-          <w:lang w:val="de-DE"/>
-        </w:rPr>
-        <w:t xml:space="preserve"> 33</w:t>
-      </w:r>
-      <w:r>
-        <w:rPr>
-          <w:b/>
-          <w:lang w:val="de-DE"/>
-        </w:rPr>
-        <w:t>,</w:t>
-      </w:r>
-      <w:r>
-        <w:rPr>
-          <w:lang w:val="de-DE"/>
-        </w:rPr>
-        <w:t xml:space="preserve"> 29-40.</w:t>
+        </w:rPr>
+        <w:t>Research Starters: Science.</w:t>
+      </w:r>
+      <w:r>
+        <w:t xml:space="preserve"> EBSCO.</w:t>
       </w:r>
       <w:bookmarkEnd w:id="51"/>
     </w:p>
@@ -26166,29 +28087,19 @@
       <w:pPr>
         <w:pStyle w:val="EndNoteBibliography"/>
         <w:ind w:left="720" w:hanging="720"/>
-        <w:rPr>
-          <w:lang w:val="de-DE"/>
-        </w:rPr>
       </w:pPr>
       <w:bookmarkStart w:id="52" w:name="_ENREF_22"/>
       <w:r>
-        <w:rPr>
-          <w:lang w:val="de-DE"/>
-        </w:rPr>
-        <w:t xml:space="preserve">KOENIG, S. &amp; LIKHACHEV, M. 2002. </w:t>
-      </w:r>
-      <w:r>
-        <w:rPr>
-          <w:i/>
-          <w:lang w:val="de-DE"/>
-        </w:rPr>
-        <w:t>D*Lite</w:t>
-      </w:r>
-      <w:r>
-        <w:rPr>
-          <w:lang w:val="de-DE"/>
-        </w:rPr>
-        <w:t>.</w:t>
+        <w:t>KIM, H., HAAM, S., YOO, M. &amp; SONG, W. S. 2026. Algorithmic Evaluation of Fire Evacuation Efficiency Under Dynamic Crowd and Smoke Conditions. 9</w:t>
+      </w:r>
+      <w:r>
+        <w:rPr>
+          <w:b/>
+        </w:rPr>
+        <w:t>,</w:t>
+      </w:r>
+      <w:r>
+        <w:t xml:space="preserve"> 32.</w:t>
       </w:r>
       <w:bookmarkEnd w:id="52"/>
     </w:p>
@@ -26196,22 +28107,39 @@
       <w:pPr>
         <w:pStyle w:val="EndNoteBibliography"/>
         <w:ind w:left="720" w:hanging="720"/>
+        <w:rPr>
+          <w:lang w:val="de-DE"/>
+        </w:rPr>
       </w:pPr>
       <w:bookmarkStart w:id="53" w:name="_ENREF_23"/>
       <w:r>
-        <w:rPr>
+        <w:t xml:space="preserve">KL¼GL, F. &amp; BAZZAN, A. 2012. Agent-Based Modeling and Simulation. </w:t>
+      </w:r>
+      <w:r>
+        <w:rPr>
+          <w:i/>
           <w:lang w:val="de-DE"/>
         </w:rPr>
-        <w:t xml:space="preserve">KULIGOWSKI, E. D. 2011. </w:t>
-      </w:r>
-      <w:r>
-        <w:rPr>
-          <w:i/>
-        </w:rPr>
-        <w:t>TERROR DEFEATED: Occupant Sensemaking, Decision-Making and Protective Action in the 2001 World Trade Center Disaster.</w:t>
-      </w:r>
-      <w:r>
-        <w:t xml:space="preserve"> PhD thesis, University of Colorado at Boulder.</w:t>
+        <w:t>AI Magazine,</w:t>
+      </w:r>
+      <w:r>
+        <w:rPr>
+          <w:lang w:val="de-DE"/>
+        </w:rPr>
+        <w:t xml:space="preserve"> 33</w:t>
+      </w:r>
+      <w:r>
+        <w:rPr>
+          <w:b/>
+          <w:lang w:val="de-DE"/>
+        </w:rPr>
+        <w:t>,</w:t>
+      </w:r>
+      <w:r>
+        <w:rPr>
+          <w:lang w:val="de-DE"/>
+        </w:rPr>
+        <w:t xml:space="preserve"> 29-40.</w:t>
       </w:r>
       <w:bookmarkEnd w:id="53"/>
     </w:p>
@@ -26219,19 +28147,29 @@
       <w:pPr>
         <w:pStyle w:val="EndNoteBibliography"/>
         <w:ind w:left="720" w:hanging="720"/>
+        <w:rPr>
+          <w:lang w:val="de-DE"/>
+        </w:rPr>
       </w:pPr>
       <w:bookmarkStart w:id="54" w:name="_ENREF_24"/>
       <w:r>
-        <w:t>LAWANDE, S. R., JASMINE, G., ANBARASI, J. &amp; IZHAR, L. I. 2022. A Systematic Review and Analysis of Intelligence-Based Pathfinding Algorithms in the Field of Video Games. 12</w:t>
-      </w:r>
-      <w:r>
-        <w:rPr>
-          <w:b/>
-        </w:rPr>
-        <w:t>,</w:t>
-      </w:r>
-      <w:r>
-        <w:t xml:space="preserve"> 5499.</w:t>
+        <w:rPr>
+          <w:lang w:val="de-DE"/>
+        </w:rPr>
+        <w:t xml:space="preserve">KOENIG, S. &amp; LIKHACHEV, M. 2002. </w:t>
+      </w:r>
+      <w:r>
+        <w:rPr>
+          <w:i/>
+          <w:lang w:val="de-DE"/>
+        </w:rPr>
+        <w:t>D*Lite</w:t>
+      </w:r>
+      <w:r>
+        <w:rPr>
+          <w:lang w:val="de-DE"/>
+        </w:rPr>
+        <w:t>.</w:t>
       </w:r>
       <w:bookmarkEnd w:id="54"/>
     </w:p>
@@ -26242,25 +28180,19 @@
       </w:pPr>
       <w:bookmarkStart w:id="55" w:name="_ENREF_25"/>
       <w:r>
-        <w:t xml:space="preserve">LEE, A. F. &amp; TSAI, P. H. 2023. Online Indoor Fire Evacuation System. </w:t>
+        <w:rPr>
+          <w:lang w:val="de-DE"/>
+        </w:rPr>
+        <w:t xml:space="preserve">KULIGOWSKI, E. D. 2011. </w:t>
       </w:r>
       <w:r>
         <w:rPr>
           <w:i/>
         </w:rPr>
-        <w:t>IEEE Systems Journal,</w:t>
-      </w:r>
-      <w:r>
-        <w:t xml:space="preserve"> 17</w:t>
-      </w:r>
-      <w:r>
-        <w:rPr>
-          <w:b/>
-        </w:rPr>
-        <w:t>,</w:t>
-      </w:r>
-      <w:r>
-        <w:t xml:space="preserve"> 3584-3592.</w:t>
+        <w:t>TERROR DEFEATED: Occupant Sensemaking, Decision-Making and Protective Action in the 2001 World Trade Center Disaster.</w:t>
+      </w:r>
+      <w:r>
+        <w:t xml:space="preserve"> PhD thesis, University of Colorado at Boulder.</w:t>
       </w:r>
       <w:bookmarkEnd w:id="55"/>
     </w:p>
@@ -26271,16 +28203,7 @@
       </w:pPr>
       <w:bookmarkStart w:id="56" w:name="_ENREF_26"/>
       <w:r>
-        <w:t xml:space="preserve">LIU, L., ZHANG, H., SHI, J. &amp; GENG, J. 2023. Real-time evacuation route optimization in the fire scenarios of cruise ships. </w:t>
-      </w:r>
-      <w:r>
-        <w:rPr>
-          <w:i/>
-        </w:rPr>
-        <w:t>Simulation Modelling Practice and Theory,</w:t>
-      </w:r>
-      <w:r>
-        <w:t xml:space="preserve"> 129</w:t>
+        <w:t>LAWANDE, S. R., JASMINE, G., ANBARASI, J. &amp; IZHAR, L. I. 2022. A Systematic Review and Analysis of Intelligence-Based Pathfinding Algorithms in the Field of Video Games. 12</w:t>
       </w:r>
       <w:r>
         <w:rPr>
@@ -26289,7 +28212,7 @@
         <w:t>,</w:t>
       </w:r>
       <w:r>
-        <w:t xml:space="preserve"> 102843.</w:t>
+        <w:t xml:space="preserve"> 5499.</w:t>
       </w:r>
       <w:bookmarkEnd w:id="56"/>
     </w:p>
@@ -26297,19 +28220,28 @@
       <w:pPr>
         <w:pStyle w:val="EndNoteBibliography"/>
         <w:ind w:left="720" w:hanging="720"/>
+      </w:pPr>
+      <w:bookmarkStart w:id="57" w:name="_ENREF_27"/>
+      <w:r>
+        <w:t xml:space="preserve">LEE, A. F. &amp; TSAI, P. H. 2023. Online Indoor Fire Evacuation System. </w:t>
+      </w:r>
+      <w:r>
         <w:rPr>
           <w:i/>
         </w:rPr>
-      </w:pPr>
-      <w:bookmarkStart w:id="57" w:name="_ENREF_27"/>
-      <w:r>
-        <w:t xml:space="preserve">LOVREGLIO, R. 2016. </w:t>
-      </w:r>
-      <w:r>
-        <w:rPr>
-          <w:i/>
-        </w:rPr>
-        <w:t>Modelling Decision-Making in Fire Evacuation based on Random Utility Theory.</w:t>
+        <w:t>IEEE Systems Journal,</w:t>
+      </w:r>
+      <w:r>
+        <w:t xml:space="preserve"> 17</w:t>
+      </w:r>
+      <w:r>
+        <w:rPr>
+          <w:b/>
+        </w:rPr>
+        <w:t>,</w:t>
+      </w:r>
+      <w:r>
+        <w:t xml:space="preserve"> 3584-3592.</w:t>
       </w:r>
       <w:bookmarkEnd w:id="57"/>
     </w:p>
@@ -26320,16 +28252,25 @@
       </w:pPr>
       <w:bookmarkStart w:id="58" w:name="_ENREF_28"/>
       <w:r>
-        <w:t xml:space="preserve">MACAL, C. 2018. </w:t>
+        <w:t xml:space="preserve">LIU, L., ZHANG, H., SHI, J. &amp; GENG, J. 2023. Real-time evacuation route optimization in the fire scenarios of cruise ships. </w:t>
       </w:r>
       <w:r>
         <w:rPr>
           <w:i/>
         </w:rPr>
-        <w:t>TUTORIAL ON AGENT-BASED MODELING AND SIMULATION: ABM DESIGN FOR THE ZOMBIE APOCALYPSE</w:t>
-      </w:r>
-      <w:r>
-        <w:t>.</w:t>
+        <w:t>Simulation Modelling Practice and Theory,</w:t>
+      </w:r>
+      <w:r>
+        <w:t xml:space="preserve"> 129</w:t>
+      </w:r>
+      <w:r>
+        <w:rPr>
+          <w:b/>
+        </w:rPr>
+        <w:t>,</w:t>
+      </w:r>
+      <w:r>
+        <w:t xml:space="preserve"> 102843.</w:t>
       </w:r>
       <w:bookmarkEnd w:id="58"/>
     </w:p>
@@ -26337,34 +28278,19 @@
       <w:pPr>
         <w:pStyle w:val="EndNoteBibliography"/>
         <w:ind w:left="720" w:hanging="720"/>
+        <w:rPr>
+          <w:i/>
+        </w:rPr>
       </w:pPr>
       <w:bookmarkStart w:id="59" w:name="_ENREF_29"/>
       <w:r>
-        <w:rPr>
-          <w:lang w:val="de-DE"/>
-        </w:rPr>
-        <w:t xml:space="preserve">NIU, C., LI, A., HUANG, X., LI, W. &amp; XU, C. 2021. </w:t>
-      </w:r>
-      <w:r>
-        <w:t>Research on Global Dynamic Path Planning Method Based on Improved A  </w:t>
-      </w:r>
-      <w:r>
-        <w:rPr>
-          <w:rFonts w:ascii="Cambria Math" w:hAnsi="Cambria Math" w:cs="Cambria Math"/>
-        </w:rPr>
-        <w:t>∗</w:t>
-      </w:r>
-      <w:r>
-        <w:t xml:space="preserve"> Algorithm. 2021</w:t>
-      </w:r>
-      <w:r>
-        <w:rPr>
-          <w:b/>
-        </w:rPr>
-        <w:t>,</w:t>
-      </w:r>
-      <w:r>
-        <w:t xml:space="preserve"> 4977041.</w:t>
+        <w:t xml:space="preserve">LOVREGLIO, R. 2016. </w:t>
+      </w:r>
+      <w:r>
+        <w:rPr>
+          <w:i/>
+        </w:rPr>
+        <w:t>Modelling Decision-Making in Fire Evacuation based on Random Utility Theory.</w:t>
       </w:r>
       <w:bookmarkEnd w:id="59"/>
     </w:p>
@@ -26375,25 +28301,16 @@
       </w:pPr>
       <w:bookmarkStart w:id="60" w:name="_ENREF_30"/>
       <w:r>
-        <w:t xml:space="preserve">RONCHI, E. 2021. Developing and validating evacuation models for fire safety engineering. </w:t>
+        <w:t xml:space="preserve">MACAL, C. 2018. </w:t>
       </w:r>
       <w:r>
         <w:rPr>
           <w:i/>
         </w:rPr>
-        <w:t>Fire Safety Journal,</w:t>
-      </w:r>
-      <w:r>
-        <w:t xml:space="preserve"> 120</w:t>
-      </w:r>
-      <w:r>
-        <w:rPr>
-          <w:b/>
-        </w:rPr>
-        <w:t>,</w:t>
-      </w:r>
-      <w:r>
-        <w:t xml:space="preserve"> 103020.</w:t>
+        <w:t>TUTORIAL ON AGENT-BASED MODELING AND SIMULATION: ABM DESIGN FOR THE ZOMBIE APOCALYPSE</w:t>
+      </w:r>
+      <w:r>
+        <w:t>.</w:t>
       </w:r>
       <w:bookmarkEnd w:id="60"/>
     </w:p>
@@ -26404,16 +28321,31 @@
       </w:pPr>
       <w:bookmarkStart w:id="61" w:name="_ENREF_31"/>
       <w:r>
-        <w:t xml:space="preserve">RUSSELL, S. &amp; NORVIG, P. 2020. </w:t>
-      </w:r>
-      <w:r>
-        <w:rPr>
-          <w:i/>
-        </w:rPr>
-        <w:t xml:space="preserve">Artificial Intelligence: A Modern Approach, </w:t>
-      </w:r>
-      <w:r>
-        <w:t>Hoboken, NJ, Pearson.</w:t>
+        <w:rPr>
+          <w:lang w:val="de-DE"/>
+        </w:rPr>
+        <w:t xml:space="preserve">NIU, C., LI, A., HUANG, X., LI, W. &amp; XU, C. 2021. </w:t>
+      </w:r>
+      <w:r>
+        <w:t>Research on Global Dynamic Path Planning Method Based on Improved A  </w:t>
+      </w:r>
+      <w:r>
+        <w:rPr>
+          <w:rFonts w:ascii="Cambria Math" w:hAnsi="Cambria Math" w:cs="Cambria Math"/>
+        </w:rPr>
+        <w:t>∗</w:t>
+      </w:r>
+      <w:r>
+        <w:t xml:space="preserve"> Algorithm. 2021</w:t>
+      </w:r>
+      <w:r>
+        <w:rPr>
+          <w:b/>
+        </w:rPr>
+        <w:t>,</w:t>
+      </w:r>
+      <w:r>
+        <w:t xml:space="preserve"> 4977041.</w:t>
       </w:r>
       <w:bookmarkEnd w:id="61"/>
     </w:p>
@@ -26424,16 +28356,16 @@
       </w:pPr>
       <w:bookmarkStart w:id="62" w:name="_ENREF_32"/>
       <w:r>
-        <w:t xml:space="preserve">SENANAYAKE, G. P. D. P., KIEU, M., ZOU, Y. &amp; DIRKS, K. 2024. Agent-based simulation for pedestrian evacuation: A systematic literature review. </w:t>
+        <w:t xml:space="preserve">RONCHI, E. 2021. Developing and validating evacuation models for fire safety engineering. </w:t>
       </w:r>
       <w:r>
         <w:rPr>
           <w:i/>
         </w:rPr>
-        <w:t>International Journal of Disaster Risk Reduction,</w:t>
-      </w:r>
-      <w:r>
-        <w:t xml:space="preserve"> 111</w:t>
+        <w:t>Fire Safety Journal,</w:t>
+      </w:r>
+      <w:r>
+        <w:t xml:space="preserve"> 120</w:t>
       </w:r>
       <w:r>
         <w:rPr>
@@ -26442,7 +28374,7 @@
         <w:t>,</w:t>
       </w:r>
       <w:r>
-        <w:t xml:space="preserve"> 104705.</w:t>
+        <w:t xml:space="preserve"> 103020.</w:t>
       </w:r>
       <w:bookmarkEnd w:id="62"/>
     </w:p>
@@ -26453,25 +28385,16 @@
       </w:pPr>
       <w:bookmarkStart w:id="63" w:name="_ENREF_33"/>
       <w:r>
-        <w:t xml:space="preserve">SHAIKH, N., KAKOSIMOS, K. E., ADIA, N. &amp; VECHOT, L. 2020. Concept and demonstration of a fully coupled and dynamic exposure-response methodology for crowd evacuation numerical modelling in airborne-toxic environments. </w:t>
+        <w:t xml:space="preserve">RUSSELL, S. &amp; NORVIG, P. 2020. </w:t>
       </w:r>
       <w:r>
         <w:rPr>
           <w:i/>
         </w:rPr>
-        <w:t>J Hazard Mater,</w:t>
-      </w:r>
-      <w:r>
-        <w:t xml:space="preserve"> 399</w:t>
-      </w:r>
-      <w:r>
-        <w:rPr>
-          <w:b/>
-        </w:rPr>
-        <w:t>,</w:t>
-      </w:r>
-      <w:r>
-        <w:t xml:space="preserve"> 123093.</w:t>
+        <w:t xml:space="preserve">Artificial Intelligence: A Modern Approach, </w:t>
+      </w:r>
+      <w:r>
+        <w:t>Hoboken, NJ, Pearson.</w:t>
       </w:r>
       <w:bookmarkEnd w:id="63"/>
     </w:p>
@@ -26482,16 +28405,16 @@
       </w:pPr>
       <w:bookmarkStart w:id="64" w:name="_ENREF_34"/>
       <w:r>
-        <w:t xml:space="preserve">SHARMA, H., ALEKSEYCHUK, A., LESKOVSKY, P., HELLWICH, O., ANAND, R. S., ZERBE, N. &amp; HUFNAGL, P. 2012. Determining similarity in histological images using graph-theoretic description and matching methods for content-based image retrieval in medical diagnostics. </w:t>
+        <w:t xml:space="preserve">SENANAYAKE, G. P. D. P., KIEU, M., ZOU, Y. &amp; DIRKS, K. 2024. Agent-based simulation for pedestrian evacuation: A systematic literature review. </w:t>
       </w:r>
       <w:r>
         <w:rPr>
           <w:i/>
         </w:rPr>
-        <w:t>Diagnostic Pathology,</w:t>
-      </w:r>
-      <w:r>
-        <w:t xml:space="preserve"> 7</w:t>
+        <w:t>International Journal of Disaster Risk Reduction,</w:t>
+      </w:r>
+      <w:r>
+        <w:t xml:space="preserve"> 111</w:t>
       </w:r>
       <w:r>
         <w:rPr>
@@ -26500,7 +28423,7 @@
         <w:t>,</w:t>
       </w:r>
       <w:r>
-        <w:t xml:space="preserve"> 134.</w:t>
+        <w:t xml:space="preserve"> 104705.</w:t>
       </w:r>
       <w:bookmarkEnd w:id="64"/>
     </w:p>
@@ -26511,16 +28434,16 @@
       </w:pPr>
       <w:bookmarkStart w:id="65" w:name="_ENREF_35"/>
       <w:r>
-        <w:t xml:space="preserve">SIPAYUNG, L., SINAGA, C. &amp; SAGALA, A. 2023. Application of Dijkstra's Algorithm to Determine the Shortest Route from City Center to Medan City Tourist Attractions. </w:t>
+        <w:t xml:space="preserve">SHAIKH, N., KAKOSIMOS, K. E., ADIA, N. &amp; VECHOT, L. 2020. Concept and demonstration of a fully coupled and dynamic exposure-response methodology for crowd evacuation numerical modelling in airborne-toxic environments. </w:t>
       </w:r>
       <w:r>
         <w:rPr>
           <w:i/>
         </w:rPr>
-        <w:t>Journal of Computer Networks, Architecture and High Performance Computing,</w:t>
-      </w:r>
-      <w:r>
-        <w:t xml:space="preserve"> 5</w:t>
+        <w:t>J Hazard Mater,</w:t>
+      </w:r>
+      <w:r>
+        <w:t xml:space="preserve"> 399</w:t>
       </w:r>
       <w:r>
         <w:rPr>
@@ -26529,7 +28452,7 @@
         <w:t>,</w:t>
       </w:r>
       <w:r>
-        <w:t xml:space="preserve"> 648-655.</w:t>
+        <w:t xml:space="preserve"> 123093.</w:t>
       </w:r>
       <w:bookmarkEnd w:id="65"/>
     </w:p>
@@ -26540,7 +28463,25 @@
       </w:pPr>
       <w:bookmarkStart w:id="66" w:name="_ENREF_36"/>
       <w:r>
-        <w:t>STENTZ, A. The D* Algorithm for Real-Time Planning of Optimal Traverses. 1994.</w:t>
+        <w:t xml:space="preserve">SHARMA, H., ALEKSEYCHUK, A., LESKOVSKY, P., HELLWICH, O., ANAND, R. S., ZERBE, N. &amp; HUFNAGL, P. 2012. Determining similarity in histological images using graph-theoretic description and matching methods for content-based image retrieval in medical diagnostics. </w:t>
+      </w:r>
+      <w:r>
+        <w:rPr>
+          <w:i/>
+        </w:rPr>
+        <w:t>Diagnostic Pathology,</w:t>
+      </w:r>
+      <w:r>
+        <w:t xml:space="preserve"> 7</w:t>
+      </w:r>
+      <w:r>
+        <w:rPr>
+          <w:b/>
+        </w:rPr>
+        <w:t>,</w:t>
+      </w:r>
+      <w:r>
+        <w:t xml:space="preserve"> 134.</w:t>
       </w:r>
       <w:bookmarkEnd w:id="66"/>
     </w:p>
@@ -26551,7 +28492,16 @@
       </w:pPr>
       <w:bookmarkStart w:id="67" w:name="_ENREF_37"/>
       <w:r>
-        <w:t>STEVENS, D., ELPERN, E., SHARMA, K., SZIDON, P., ANKIN, M. &amp; KESTEN, S. 1999. Comparison of Hallway and Treadmill Six-minute Walk Tests. 160</w:t>
+        <w:t xml:space="preserve">SIPAYUNG, L., SINAGA, C. &amp; SAGALA, A. 2023. Application of Dijkstra's Algorithm to Determine the Shortest Route from City Center to Medan City Tourist Attractions. </w:t>
+      </w:r>
+      <w:r>
+        <w:rPr>
+          <w:i/>
+        </w:rPr>
+        <w:t>Journal of Computer Networks, Architecture and High Performance Computing,</w:t>
+      </w:r>
+      <w:r>
+        <w:t xml:space="preserve"> 5</w:t>
       </w:r>
       <w:r>
         <w:rPr>
@@ -26560,7 +28510,7 @@
         <w:t>,</w:t>
       </w:r>
       <w:r>
-        <w:t xml:space="preserve"> 1540-1543.</w:t>
+        <w:t xml:space="preserve"> 648-655.</w:t>
       </w:r>
       <w:bookmarkEnd w:id="67"/>
     </w:p>
@@ -26571,25 +28521,7 @@
       </w:pPr>
       <w:bookmarkStart w:id="68" w:name="_ENREF_38"/>
       <w:r>
-        <w:t xml:space="preserve">SUN, H., HAN, G., ZHANG, X. &amp; RUAN, X. 2025. Grasping emergency dynamics: A review of group evacuation techniques and strategies in major emergencies. </w:t>
-      </w:r>
-      <w:r>
-        <w:rPr>
-          <w:i/>
-        </w:rPr>
-        <w:t>Journal of Safety Science and Resilience,</w:t>
-      </w:r>
-      <w:r>
-        <w:t xml:space="preserve"> 6</w:t>
-      </w:r>
-      <w:r>
-        <w:rPr>
-          <w:b/>
-        </w:rPr>
-        <w:t>,</w:t>
-      </w:r>
-      <w:r>
-        <w:t xml:space="preserve"> 1-20.</w:t>
+        <w:t>STENTZ, A. The D* Algorithm for Real-Time Planning of Optimal Traverses. 1994.</w:t>
       </w:r>
       <w:bookmarkEnd w:id="68"/>
     </w:p>
@@ -26600,16 +28532,16 @@
       </w:pPr>
       <w:bookmarkStart w:id="69" w:name="_ENREF_39"/>
       <w:r>
-        <w:t xml:space="preserve">TALBI, E.-G. 2009. </w:t>
-      </w:r>
-      <w:r>
-        <w:rPr>
-          <w:i/>
-        </w:rPr>
-        <w:t>Metaheuristics: From Design to Implementation</w:t>
-      </w:r>
-      <w:r>
-        <w:t>, Wiley Publishing.</w:t>
+        <w:t>STEVENS, D., ELPERN, E., SHARMA, K., SZIDON, P., ANKIN, M. &amp; KESTEN, S. 1999. Comparison of Hallway and Treadmill Six-minute Walk Tests. 160</w:t>
+      </w:r>
+      <w:r>
+        <w:rPr>
+          <w:b/>
+        </w:rPr>
+        <w:t>,</w:t>
+      </w:r>
+      <w:r>
+        <w:t xml:space="preserve"> 1540-1543.</w:t>
       </w:r>
       <w:bookmarkEnd w:id="69"/>
     </w:p>
@@ -26620,22 +28552,16 @@
       </w:pPr>
       <w:bookmarkStart w:id="70" w:name="_ENREF_40"/>
       <w:r>
-        <w:rPr>
-          <w:lang w:val="de-DE"/>
-        </w:rPr>
-        <w:t xml:space="preserve">TEN BERGE, W. F., ZWART, A. &amp; APPELMAN, L. M. 1986. </w:t>
-      </w:r>
-      <w:r>
-        <w:t xml:space="preserve">Concentration—time mortality response relationship of irritant and systemically acting vapours and gases. </w:t>
+        <w:t xml:space="preserve">SUN, H., HAN, G., ZHANG, X. &amp; RUAN, X. 2025. Grasping emergency dynamics: A review of group evacuation techniques and strategies in major emergencies. </w:t>
       </w:r>
       <w:r>
         <w:rPr>
           <w:i/>
         </w:rPr>
-        <w:t>Journal of Hazardous Materials,</w:t>
-      </w:r>
-      <w:r>
-        <w:t xml:space="preserve"> 13</w:t>
+        <w:t>Journal of Safety Science and Resilience,</w:t>
+      </w:r>
+      <w:r>
+        <w:t xml:space="preserve"> 6</w:t>
       </w:r>
       <w:r>
         <w:rPr>
@@ -26644,7 +28570,7 @@
         <w:t>,</w:t>
       </w:r>
       <w:r>
-        <w:t xml:space="preserve"> 301-309.</w:t>
+        <w:t xml:space="preserve"> 1-20.</w:t>
       </w:r>
       <w:bookmarkEnd w:id="70"/>
     </w:p>
@@ -26655,25 +28581,16 @@
       </w:pPr>
       <w:bookmarkStart w:id="71" w:name="_ENREF_41"/>
       <w:r>
-        <w:t xml:space="preserve">TIN, D., CHENG, L., HATA, R., HERTELENDY, A. J., HART, A. &amp; CIOTTONE, G. 2023. Descriptive Analysis of the Healthcare Aspects of Industrial Disasters Around the World. </w:t>
+        <w:t xml:space="preserve">TALBI, E.-G. 2009. </w:t>
       </w:r>
       <w:r>
         <w:rPr>
           <w:i/>
         </w:rPr>
-        <w:t>Disaster Medicine and Public Health Preparedness,</w:t>
-      </w:r>
-      <w:r>
-        <w:t xml:space="preserve"> 17</w:t>
-      </w:r>
-      <w:r>
-        <w:rPr>
-          <w:b/>
-        </w:rPr>
-        <w:t>,</w:t>
-      </w:r>
-      <w:r>
-        <w:t xml:space="preserve"> e400.</w:t>
+        <w:t>Metaheuristics: From Design to Implementation</w:t>
+      </w:r>
+      <w:r>
+        <w:t>, Wiley Publishing.</w:t>
       </w:r>
       <w:bookmarkEnd w:id="71"/>
     </w:p>
@@ -26684,7 +28601,7 @@
       </w:pPr>
       <w:bookmarkStart w:id="72" w:name="_ENREF_42"/>
       <w:r>
-        <w:t>TREVENA, C. Algorithms Used in Pathfinding and Navigation Meshes 3 Concepts and Terminology : Basic Visual Representations. 2015.</w:t>
+        <w:t>TEAM, T. G. D. 2026. GNU Image Manipulation Program (GIMP), Version 3.2.2. Community, Free Software (license GPLv3).</w:t>
       </w:r>
       <w:bookmarkEnd w:id="72"/>
     </w:p>
@@ -26695,20 +28612,22 @@
       </w:pPr>
       <w:bookmarkStart w:id="73" w:name="_ENREF_43"/>
       <w:r>
-        <w:t xml:space="preserve">VENTURA SPAGNOLO, E., ROMANO, G., ZUCCARELLO, P., LAUDANI, A., MONDELLO, C., </w:t>
-      </w:r>
-      <w:r>
-        <w:lastRenderedPageBreak/>
-        <w:t xml:space="preserve">ARGO, A., ZERBO, S. &amp; BARBERA, N. 2019. Toxicological investigations in a fatal and non-fatal accident due to hydrogen sulphide (H2S) poisoning. </w:t>
+        <w:rPr>
+          <w:lang w:val="de-DE"/>
+        </w:rPr>
+        <w:t xml:space="preserve">TEN BERGE, W. F., ZWART, A. &amp; APPELMAN, L. M. 1986. </w:t>
+      </w:r>
+      <w:r>
+        <w:t xml:space="preserve">Concentration—time mortality response relationship of irritant and systemically acting vapours and gases. </w:t>
       </w:r>
       <w:r>
         <w:rPr>
           <w:i/>
         </w:rPr>
-        <w:t>Forensic Science International,</w:t>
-      </w:r>
-      <w:r>
-        <w:t xml:space="preserve"> 300</w:t>
+        <w:t>Journal of Hazardous Materials,</w:t>
+      </w:r>
+      <w:r>
+        <w:t xml:space="preserve"> 13</w:t>
       </w:r>
       <w:r>
         <w:rPr>
@@ -26717,7 +28636,7 @@
         <w:t>,</w:t>
       </w:r>
       <w:r>
-        <w:t xml:space="preserve"> e4-e8.</w:t>
+        <w:t xml:space="preserve"> 301-309.</w:t>
       </w:r>
       <w:bookmarkEnd w:id="73"/>
     </w:p>
@@ -26728,16 +28647,17 @@
       </w:pPr>
       <w:bookmarkStart w:id="74" w:name="_ENREF_44"/>
       <w:r>
-        <w:t xml:space="preserve">VERMUYTEN, H., BELIËN, J., DE BOECK, L., RENIERS, G. &amp; WAUTERS, T. 2016. A review of optimisation models for pedestrian evacuation and design problems. </w:t>
+        <w:lastRenderedPageBreak/>
+        <w:t xml:space="preserve">TIN, D., CHENG, L., HATA, R., HERTELENDY, A. J., HART, A. &amp; CIOTTONE, G. 2023. Descriptive Analysis of the Healthcare Aspects of Industrial Disasters Around the World. </w:t>
       </w:r>
       <w:r>
         <w:rPr>
           <w:i/>
         </w:rPr>
-        <w:t>Safety Science,</w:t>
-      </w:r>
-      <w:r>
-        <w:t xml:space="preserve"> 87</w:t>
+        <w:t>Disaster Medicine and Public Health Preparedness,</w:t>
+      </w:r>
+      <w:r>
+        <w:t xml:space="preserve"> 17</w:t>
       </w:r>
       <w:r>
         <w:rPr>
@@ -26746,7 +28666,7 @@
         <w:t>,</w:t>
       </w:r>
       <w:r>
-        <w:t xml:space="preserve"> 167-178.</w:t>
+        <w:t xml:space="preserve"> e400.</w:t>
       </w:r>
       <w:bookmarkEnd w:id="74"/>
     </w:p>
@@ -26757,25 +28677,7 @@
       </w:pPr>
       <w:bookmarkStart w:id="75" w:name="_ENREF_45"/>
       <w:r>
-        <w:t xml:space="preserve">WAN, J., SUI, J. &amp; YU, H. 2014. Research on evacuation in the subway station in China based on the Combined Social Force Model. </w:t>
-      </w:r>
-      <w:r>
-        <w:rPr>
-          <w:i/>
-        </w:rPr>
-        <w:t>Physica A: Statistical Mechanics and its Applications,</w:t>
-      </w:r>
-      <w:r>
-        <w:t xml:space="preserve"> 394</w:t>
-      </w:r>
-      <w:r>
-        <w:rPr>
-          <w:b/>
-        </w:rPr>
-        <w:t>,</w:t>
-      </w:r>
-      <w:r>
-        <w:t xml:space="preserve"> 33-46.</w:t>
+        <w:t>TREVENA, C. Algorithms Used in Pathfinding and Navigation Meshes 3 Concepts and Terminology : Basic Visual Representations. 2015.</w:t>
       </w:r>
       <w:bookmarkEnd w:id="75"/>
     </w:p>
@@ -26786,16 +28688,16 @@
       </w:pPr>
       <w:bookmarkStart w:id="76" w:name="_ENREF_46"/>
       <w:r>
-        <w:t xml:space="preserve">WIJNANDS, A., KOPPEN, A., VRIES, I., LANGE, D. &amp; RIETJENS, S. 2025. Poison Center Surveillance of Occupational Incidents with Hazardous Materials (2016–2023): Insights for Risk Mitigation and Incident Preparedness. </w:t>
+        <w:t xml:space="preserve">VENTURA SPAGNOLO, E., ROMANO, G., ZUCCARELLO, P., LAUDANI, A., MONDELLO, C., ARGO, A., ZERBO, S. &amp; BARBERA, N. 2019. Toxicological investigations in a fatal and non-fatal accident due to hydrogen sulphide (H2S) poisoning. </w:t>
       </w:r>
       <w:r>
         <w:rPr>
           <w:i/>
         </w:rPr>
-        <w:t>International Journal of Environmental Research and Public Health,</w:t>
-      </w:r>
-      <w:r>
-        <w:t xml:space="preserve"> 22</w:t>
+        <w:t>Forensic Science International,</w:t>
+      </w:r>
+      <w:r>
+        <w:t xml:space="preserve"> 300</w:t>
       </w:r>
       <w:r>
         <w:rPr>
@@ -26804,7 +28706,7 @@
         <w:t>,</w:t>
       </w:r>
       <w:r>
-        <w:t xml:space="preserve"> 158.</w:t>
+        <w:t xml:space="preserve"> e4-e8.</w:t>
       </w:r>
       <w:bookmarkEnd w:id="76"/>
     </w:p>
@@ -26815,7 +28717,7 @@
       </w:pPr>
       <w:bookmarkStart w:id="77" w:name="_ENREF_47"/>
       <w:r>
-        <w:t xml:space="preserve">XU, J.-H. &amp; FAN, Y. 2014. An individual risk assessment framework for high-pressure natural gas wells with hydrogen sulphide, applied to a case study in China. </w:t>
+        <w:t xml:space="preserve">VERMUYTEN, H., BELIËN, J., DE BOECK, L., RENIERS, G. &amp; WAUTERS, T. 2016. A review of optimisation models for pedestrian evacuation and design problems. </w:t>
       </w:r>
       <w:r>
         <w:rPr>
@@ -26824,7 +28726,7 @@
         <w:t>Safety Science,</w:t>
       </w:r>
       <w:r>
-        <w:t xml:space="preserve"> 68</w:t>
+        <w:t xml:space="preserve"> 87</w:t>
       </w:r>
       <w:r>
         <w:rPr>
@@ -26833,7 +28735,7 @@
         <w:t>,</w:t>
       </w:r>
       <w:r>
-        <w:t xml:space="preserve"> 14–23.</w:t>
+        <w:t xml:space="preserve"> 167-178.</w:t>
       </w:r>
       <w:bookmarkEnd w:id="77"/>
     </w:p>
@@ -26844,7 +28746,16 @@
       </w:pPr>
       <w:bookmarkStart w:id="78" w:name="_ENREF_48"/>
       <w:r>
-        <w:t>YANG, D., ZHENG, Y., PENG, K., PAN, L., ZHENG, J., XIE, B. &amp; WANG, B. 2022. Characteristics and Statistical Analysis of Large and above Hazardous Chemical Accidents in China from 2000 to 2020. 19</w:t>
+        <w:t xml:space="preserve">WAN, J., SUI, J. &amp; YU, H. 2014. Research on evacuation in the subway station in China based on the Combined Social Force Model. </w:t>
+      </w:r>
+      <w:r>
+        <w:rPr>
+          <w:i/>
+        </w:rPr>
+        <w:t>Physica A: Statistical Mechanics and its Applications,</w:t>
+      </w:r>
+      <w:r>
+        <w:t xml:space="preserve"> 394</w:t>
       </w:r>
       <w:r>
         <w:rPr>
@@ -26853,7 +28764,7 @@
         <w:t>,</w:t>
       </w:r>
       <w:r>
-        <w:t xml:space="preserve"> 15603.</w:t>
+        <w:t xml:space="preserve"> 33-46.</w:t>
       </w:r>
       <w:bookmarkEnd w:id="78"/>
     </w:p>
@@ -26864,6 +28775,84 @@
       </w:pPr>
       <w:bookmarkStart w:id="79" w:name="_ENREF_49"/>
       <w:r>
+        <w:t xml:space="preserve">WIJNANDS, A., KOPPEN, A., VRIES, I., LANGE, D. &amp; RIETJENS, S. 2025. Poison Center Surveillance of Occupational Incidents with Hazardous Materials (2016–2023): Insights for Risk Mitigation and Incident Preparedness. </w:t>
+      </w:r>
+      <w:r>
+        <w:rPr>
+          <w:i/>
+        </w:rPr>
+        <w:t>International Journal of Environmental Research and Public Health,</w:t>
+      </w:r>
+      <w:r>
+        <w:t xml:space="preserve"> 22</w:t>
+      </w:r>
+      <w:r>
+        <w:rPr>
+          <w:b/>
+        </w:rPr>
+        <w:t>,</w:t>
+      </w:r>
+      <w:r>
+        <w:t xml:space="preserve"> 158.</w:t>
+      </w:r>
+      <w:bookmarkEnd w:id="79"/>
+    </w:p>
+    <w:p>
+      <w:pPr>
+        <w:pStyle w:val="EndNoteBibliography"/>
+        <w:ind w:left="720" w:hanging="720"/>
+      </w:pPr>
+      <w:bookmarkStart w:id="80" w:name="_ENREF_50"/>
+      <w:r>
+        <w:t xml:space="preserve">XU, J.-H. &amp; FAN, Y. 2014. An individual risk assessment framework for high-pressure natural gas wells with hydrogen sulphide, applied to a case study in China. </w:t>
+      </w:r>
+      <w:r>
+        <w:rPr>
+          <w:i/>
+        </w:rPr>
+        <w:t>Safety Science,</w:t>
+      </w:r>
+      <w:r>
+        <w:t xml:space="preserve"> 68</w:t>
+      </w:r>
+      <w:r>
+        <w:rPr>
+          <w:b/>
+        </w:rPr>
+        <w:t>,</w:t>
+      </w:r>
+      <w:r>
+        <w:t xml:space="preserve"> 14–23.</w:t>
+      </w:r>
+      <w:bookmarkEnd w:id="80"/>
+    </w:p>
+    <w:p>
+      <w:pPr>
+        <w:pStyle w:val="EndNoteBibliography"/>
+        <w:ind w:left="720" w:hanging="720"/>
+      </w:pPr>
+      <w:bookmarkStart w:id="81" w:name="_ENREF_51"/>
+      <w:r>
+        <w:t>YANG, D., ZHENG, Y., PENG, K., PAN, L., ZHENG, J., XIE, B. &amp; WANG, B. 2022. Characteristics and Statistical Analysis of Large and above Hazardous Chemical Accidents in China from 2000 to 2020. 19</w:t>
+      </w:r>
+      <w:r>
+        <w:rPr>
+          <w:b/>
+        </w:rPr>
+        <w:t>,</w:t>
+      </w:r>
+      <w:r>
+        <w:t xml:space="preserve"> 15603.</w:t>
+      </w:r>
+      <w:bookmarkEnd w:id="81"/>
+    </w:p>
+    <w:p>
+      <w:pPr>
+        <w:pStyle w:val="EndNoteBibliography"/>
+        <w:ind w:left="720" w:hanging="720"/>
+      </w:pPr>
+      <w:bookmarkStart w:id="82" w:name="_ENREF_52"/>
+      <w:r>
         <w:t xml:space="preserve">ZHENG, X., ZHONG, T. &amp; LIU, M. 2009. Modeling crowd evacuation of a building based on seven methodological approaches. </w:t>
       </w:r>
       <w:r>
@@ -26884,7 +28873,7 @@
       <w:r>
         <w:t xml:space="preserve"> 437-445.</w:t>
       </w:r>
-      <w:bookmarkEnd w:id="79"/>
+      <w:bookmarkEnd w:id="82"/>
     </w:p>
     <w:p>
       <w:r>
@@ -29997,7 +31986,7 @@
   <w:style w:type="paragraph" w:default="1" w:styleId="a">
     <w:name w:val="Normal"/>
     <w:qFormat/>
-    <w:rsid w:val="004935AA"/>
+    <w:rsid w:val="007C4828"/>
     <w:pPr>
       <w:jc w:val="both"/>
     </w:pPr>
@@ -30238,7 +32227,6 @@
   <w:style w:type="character" w:default="1" w:styleId="a0">
     <w:name w:val="Default Paragraph Font"/>
     <w:uiPriority w:val="1"/>
-    <w:semiHidden/>
     <w:unhideWhenUsed/>
   </w:style>
   <w:style w:type="table" w:default="1" w:styleId="a1">

</xml_diff>

<commit_message>
Safeguard BEFORE MASS BENCHMARKING
Have applied all the important chnages from DStarLite - Scenario 3.jl to all the other scripts (see previous commit), and I m about to start running the mass benchmarking.
</commit_message>
<xml_diff>
--- a/Thesis/GPitsos Thesis.docx
+++ b/Thesis/GPitsos Thesis.docx
@@ -31972,7 +31972,6 @@
         <w:r>
           <w:rPr>
             <w:rStyle w:val="-"/>
-            <w:lang w:val="en-US"/>
           </w:rPr>
           <w:instrText>/</w:instrText>
         </w:r>
@@ -32002,13 +32001,7 @@
         </w:r>
       </w:hyperlink>
       <w:r>
-        <w:t xml:space="preserve"> είναι δυναμική ως προς τον υπολογισμό της έκθεσης των </w:t>
-      </w:r>
-      <w:r>
-        <w:t>εμπλεκομένων</w:t>
-      </w:r>
-      <w:r>
-        <w:t xml:space="preserve"> σε τοξικά αέρια, το μοντέλο εφαρμόζεται χρησιμοποιώντας τ</w:t>
+        <w:t xml:space="preserve"> είναι δυναμική ως προς τον υπολογισμό της έκθεσης των εμπλεκομένων σε τοξικά αέρια, το μοντέλο εφαρμόζεται χρησιμοποιώντας τ</w:t>
       </w:r>
       <w:r>
         <w:t>ην «Προσομοίωση Πανικού»</w:t>
@@ -32129,13 +32122,7 @@
         <w:t xml:space="preserve"> </w:t>
       </w:r>
       <w:r>
-        <w:t xml:space="preserve">προσομοιώνει την εκκένωση πλήθους σε εξωτερικούς βιομηχανικούς χώρους, δίνοντας έμφαση στον τρόπο με τον οποίο το τοξικό φορτίο </w:t>
-      </w:r>
-      <w:r>
-        <w:t>υδρόθειου</w:t>
-      </w:r>
-      <w:r>
-        <w:t xml:space="preserve"> (</w:t>
+        <w:t>προσομοιώνει την εκκένωση πλήθους σε εξωτερικούς βιομηχανικούς χώρους, δίνοντας έμφαση στον τρόπο με τον οποίο το τοξικό φορτίο υδρόθειου (</w:t>
       </w:r>
       <m:oMath>
         <m:sSub>
@@ -32285,69 +32272,57 @@
         <w:rPr>
           <w:rFonts w:cs="Times New Roman"/>
         </w:rPr>
-        <w:t>διαρροών</w:t>
+        <w:t>διαρροών.</w:t>
       </w:r>
       <w:r>
         <w:rPr>
           <w:rFonts w:cs="Times New Roman"/>
         </w:rPr>
-        <w:t>.</w:t>
+        <w:t xml:space="preserve"> Οι</w:t>
       </w:r>
       <w:r>
         <w:rPr>
           <w:rFonts w:cs="Times New Roman"/>
         </w:rPr>
-        <w:t xml:space="preserve"> Οι</w:t>
-      </w:r>
+        <w:t xml:space="preserve"> </w:t>
+      </w:r>
+      <w:hyperlink w:anchor="_ENREF_49" w:tooltip="Seo, 2022 #83" w:history="1">
+        <w:r>
+          <w:rPr>
+            <w:rStyle w:val="-"/>
+          </w:rPr>
+          <w:fldChar w:fldCharType="begin"/>
+        </w:r>
+        <w:r>
+          <w:rPr>
+            <w:rStyle w:val="-"/>
+          </w:rPr>
+          <w:instrText xml:space="preserve"> ADDIN EN.CITE &lt;EndNote&gt;&lt;Cite AuthorYear="1"&gt;&lt;Author&gt;Seo&lt;/Author&gt;&lt;Year&gt;2022&lt;/Year&gt;&lt;RecNum&gt;83&lt;/RecNum&gt;&lt;DisplayText&gt;Seo et al. (2022)&lt;/DisplayText&gt;&lt;record&gt;&lt;rec-number&gt;83&lt;/rec-number&gt;&lt;foreign-keys&gt;&lt;key app="EN" db-id="dxs5p5de0w55t0erd255s0tbrzsd22z0ts0d" timestamp="1775399869"&gt;83&lt;/key&gt;&lt;/foreign-keys&gt;&lt;ref-type name="Journal Article"&gt;17&lt;/ref-type&gt;&lt;contributors&gt;&lt;authors&gt;&lt;author&gt;Seo, Seung-Kwon&lt;/author&gt;&lt;author&gt;Yoon, Young-Gak&lt;/author&gt;&lt;author&gt;Lee, Ju-sung&lt;/author&gt;&lt;author&gt;Na, Jonggeol&lt;/author&gt;&lt;author&gt;Lee, Chul-Jin&lt;/author&gt;&lt;/authors&gt;&lt;/contributors&gt;&lt;titles&gt;&lt;title&gt;Deep Neural Network-based Optimization Framework for Safety Evacuation Route during Toxic Gas Leak Incidents&lt;/title&gt;&lt;secondary-title&gt;Reliability Engineering &amp;amp; System Safety&lt;/secondary-title&gt;&lt;/titles&gt;&lt;periodical&gt;&lt;full-title&gt;Reliability Engineering &amp;amp; System Safety&lt;/full-title&gt;&lt;/periodical&gt;&lt;pages&gt;108102&lt;/pages&gt;&lt;volume&gt;218&lt;/volume&gt;&lt;keywords&gt;&lt;keyword&gt;Evacuation&lt;/keyword&gt;&lt;keyword&gt;Toxic gas leak&lt;/keyword&gt;&lt;keyword&gt;Computational fluid dynamics&lt;/keyword&gt;&lt;keyword&gt;Surrogate model&lt;/keyword&gt;&lt;keyword&gt;Variational autoencoder&lt;/keyword&gt;&lt;/keywords&gt;&lt;dates&gt;&lt;year&gt;2022&lt;/year&gt;&lt;pub-dates&gt;&lt;date&gt;2022/02/01/&lt;/date&gt;&lt;/pub-dates&gt;&lt;/dates&gt;&lt;isbn&gt;0951-8320&lt;/isbn&gt;&lt;urls&gt;&lt;related-urls&gt;&lt;url&gt;https://www.sciencedirect.com/science/article/pii/S0951832021005998&lt;/url&gt;&lt;/related-urls&gt;&lt;/urls&gt;&lt;electronic-resource-num&gt;https://doi.org/10.1016/j.ress.2021.108102&lt;/electronic-resource-num&gt;&lt;/record&gt;&lt;/Cite&gt;&lt;/EndNote&gt;</w:instrText>
+        </w:r>
+        <w:r>
+          <w:rPr>
+            <w:rStyle w:val="-"/>
+          </w:rPr>
+          <w:fldChar w:fldCharType="separate"/>
+        </w:r>
+        <w:r>
+          <w:rPr>
+            <w:rStyle w:val="-"/>
+          </w:rPr>
+          <w:t>Seo et al. (2022)</w:t>
+        </w:r>
+        <w:r>
+          <w:rPr>
+            <w:rStyle w:val="-"/>
+          </w:rPr>
+          <w:fldChar w:fldCharType="end"/>
+        </w:r>
+      </w:hyperlink>
       <w:r>
         <w:rPr>
           <w:rFonts w:cs="Times New Roman"/>
         </w:rPr>
-        <w:t xml:space="preserve"> </w:t>
-      </w:r>
-      <w:hyperlink w:anchor="_ENREF_49" w:tooltip="Seo, 2022 #83" w:history="1">
-        <w:r>
-          <w:rPr>
-            <w:rStyle w:val="-"/>
-          </w:rPr>
-          <w:fldChar w:fldCharType="begin"/>
-        </w:r>
-        <w:r>
-          <w:rPr>
-            <w:rStyle w:val="-"/>
-          </w:rPr>
-          <w:instrText xml:space="preserve"> ADDIN EN.CITE &lt;EndNote&gt;&lt;Cite AuthorYear="1"&gt;&lt;Author&gt;Seo&lt;/Author&gt;&lt;Year&gt;2022&lt;/Year&gt;&lt;RecNum&gt;83&lt;/RecNum&gt;&lt;DisplayText&gt;Seo et al. (2022)&lt;/DisplayText&gt;&lt;record&gt;&lt;rec-number&gt;83&lt;/rec-number&gt;&lt;foreign-keys&gt;&lt;key app="EN" db-id="dxs5p5de0w55t0erd255s0tbrzsd22z0ts0d" timestamp="1775399869"&gt;83&lt;/key&gt;&lt;/foreign-keys&gt;&lt;ref-type name="Journal Article"&gt;17&lt;/ref-type&gt;&lt;contributors&gt;&lt;authors&gt;&lt;author&gt;Seo, Seung-Kwon&lt;/author&gt;&lt;author&gt;Yoon, Young-Gak&lt;/author&gt;&lt;author&gt;Lee, Ju-sung&lt;/author&gt;&lt;author&gt;Na, Jonggeol&lt;/author&gt;&lt;author&gt;Lee, Chul-Jin&lt;/author&gt;&lt;/authors&gt;&lt;/contributors&gt;&lt;titles&gt;&lt;title&gt;Deep Neural Network-based Optimization Framework for Safety Evacuation Route during Toxic Gas Leak Incidents&lt;/title&gt;&lt;secondary-title&gt;Reliability Engineering &amp;amp; System Safety&lt;/secondary-title&gt;&lt;/titles&gt;&lt;periodical&gt;&lt;full-title&gt;Reliability Engineering &amp;amp; System Safety&lt;/full-title&gt;&lt;/periodical&gt;&lt;pages&gt;108102&lt;/pages&gt;&lt;volume&gt;218&lt;/volume&gt;&lt;keywords&gt;&lt;keyword&gt;Evacuation&lt;/keyword&gt;&lt;keyword&gt;Toxic gas leak&lt;/keyword&gt;&lt;keyword&gt;Computational fluid dynamics&lt;/keyword&gt;&lt;keyword&gt;Surrogate model&lt;/keyword&gt;&lt;keyword&gt;Variational autoencoder&lt;/keyword&gt;&lt;/keywords&gt;&lt;dates&gt;&lt;year&gt;2022&lt;/year&gt;&lt;pub-dates&gt;&lt;date&gt;2022/02/01/&lt;/date&gt;&lt;/pub-dates&gt;&lt;/dates&gt;&lt;isbn&gt;0951-8320&lt;/isbn&gt;&lt;urls&gt;&lt;related-urls&gt;&lt;url&gt;https://www.sciencedirect.com/science/article/pii/S0951832021005998&lt;/url&gt;&lt;/related-urls&gt;&lt;/urls&gt;&lt;electronic-resource-num&gt;https://doi.org/10.1016/j.ress.2021.108102&lt;/electronic-resource-num&gt;&lt;/record&gt;&lt;/Cite&gt;&lt;/EndNote&gt;</w:instrText>
-        </w:r>
-        <w:r>
-          <w:rPr>
-            <w:rStyle w:val="-"/>
-          </w:rPr>
-          <w:fldChar w:fldCharType="separate"/>
-        </w:r>
-        <w:r>
-          <w:rPr>
-            <w:rStyle w:val="-"/>
-          </w:rPr>
-          <w:t>Seo et al. (2022)</w:t>
-        </w:r>
-        <w:r>
-          <w:rPr>
-            <w:rStyle w:val="-"/>
-          </w:rPr>
-          <w:fldChar w:fldCharType="end"/>
-        </w:r>
-      </w:hyperlink>
-      <w:r>
-        <w:rPr>
-          <w:rFonts w:cs="Times New Roman"/>
-        </w:rPr>
-        <w:t xml:space="preserve"> </w:t>
-      </w:r>
-      <w:r>
-        <w:rPr>
-          <w:rFonts w:cs="Times New Roman"/>
-        </w:rPr>
-        <w:t>χρησιμοποι</w:t>
+        <w:t xml:space="preserve"> χρησιμοποι</w:t>
       </w:r>
       <w:r>
         <w:rPr>
@@ -33827,73 +33802,7 @@
           <w:rPr>
             <w:rFonts w:ascii="Cambria Math" w:hAnsi="Cambria Math"/>
           </w:rPr>
-          <m:t>7</m:t>
-        </m:r>
-        <m:r>
-          <w:rPr>
-            <w:rFonts w:ascii="Cambria Math" w:hAnsi="Cambria Math"/>
-          </w:rPr>
-          <m:t>2</m:t>
-        </m:r>
-        <m:r>
-          <w:rPr>
-            <w:rFonts w:ascii="Cambria Math" w:hAnsi="Cambria Math"/>
-          </w:rPr>
-          <m:t>3</m:t>
-        </m:r>
-        <m:r>
-          <w:rPr>
-            <w:rFonts w:ascii="Cambria Math" w:hAnsi="Cambria Math"/>
-          </w:rPr>
-          <m:t>.</m:t>
-        </m:r>
-        <m:r>
-          <w:rPr>
-            <w:rFonts w:ascii="Cambria Math" w:hAnsi="Cambria Math"/>
-          </w:rPr>
-          <m:t>3</m:t>
-        </m:r>
-        <m:r>
-          <w:rPr>
-            <w:rFonts w:ascii="Cambria Math" w:hAnsi="Cambria Math"/>
-          </w:rPr>
-          <m:t>7</m:t>
-        </m:r>
-        <m:r>
-          <w:rPr>
-            <w:rFonts w:ascii="Cambria Math" w:hAnsi="Cambria Math"/>
-          </w:rPr>
-          <m:t>:</m:t>
-        </m:r>
-        <m:r>
-          <w:rPr>
-            <w:rFonts w:ascii="Cambria Math" w:hAnsi="Cambria Math"/>
-          </w:rPr>
-          <m:t>2</m:t>
-        </m:r>
-        <m:r>
-          <w:rPr>
-            <w:rFonts w:ascii="Cambria Math" w:hAnsi="Cambria Math"/>
-          </w:rPr>
-          <m:t>,</m:t>
-        </m:r>
-        <m:r>
-          <w:rPr>
-            <w:rFonts w:ascii="Cambria Math" w:hAnsi="Cambria Math"/>
-          </w:rPr>
-          <m:t>5</m:t>
-        </m:r>
-        <m:r>
-          <w:rPr>
-            <w:rFonts w:ascii="Cambria Math" w:hAnsi="Cambria Math"/>
-          </w:rPr>
-          <m:t>0</m:t>
-        </m:r>
-        <m:r>
-          <w:rPr>
-            <w:rFonts w:ascii="Cambria Math" w:hAnsi="Cambria Math"/>
-          </w:rPr>
-          <m:t>0</m:t>
+          <m:t>723.37:2,500</m:t>
         </m:r>
         <m:box>
           <m:boxPr>
@@ -37561,7 +37470,26 @@
       </w:r>
       <w:bookmarkEnd w:id="118"/>
     </w:p>
-    <w:p/>
+    <w:p>
+      <w:pPr>
+        <w:rPr>
+          <w:lang w:val="en-US"/>
+        </w:rPr>
+      </w:pPr>
+      <w:r>
+        <w:rPr>
+          <w:lang w:val="en-US"/>
+        </w:rPr>
+        <w:t>D*lite continuous</w:t>
+      </w:r>
+    </w:p>
+    <w:p>
+      <w:pPr>
+        <w:rPr>
+          <w:lang w:val="en-US"/>
+        </w:rPr>
+      </w:pPr>
+    </w:p>
     <w:sectPr>
       <w:pgSz w:w="12240" w:h="15840"/>
       <w:pgMar w:top="1340" w:right="1080" w:bottom="280" w:left="1080" w:header="723" w:footer="0" w:gutter="0"/>
@@ -41424,6 +41352,7 @@
   <w:style w:type="character" w:default="1" w:styleId="a0">
     <w:name w:val="Default Paragraph Font"/>
     <w:uiPriority w:val="1"/>
+    <w:semiHidden/>
     <w:unhideWhenUsed/>
   </w:style>
   <w:style w:type="table" w:default="1" w:styleId="a1">

</xml_diff>